<commit_message>
updated to latest rtRBA files
</commit_message>
<xml_diff>
--- a/suppMat/suppText1_rtRBA.docx
+++ b/suppMat/suppText1_rtRBA.docx
@@ -73,7 +73,89 @@
           <w:color w:val="000000" w:themeColor="text1"/>
           <w:vertAlign w:val="superscript"/>
         </w:rPr>
-        <w:t>(1),(2)</w:t>
+        <w:fldChar w:fldCharType="begin"/>
+      </w:r>
+      <w:r>
+        <w:rPr>
+          <w:color w:val="000000" w:themeColor="text1"/>
+          <w:vertAlign w:val="superscript"/>
+        </w:rPr>
+        <w:instrText xml:space="preserve"> REF _Ref164264179 \r \h  \* MERGEFORMAT </w:instrText>
+      </w:r>
+      <w:r>
+        <w:rPr>
+          <w:color w:val="000000" w:themeColor="text1"/>
+          <w:vertAlign w:val="superscript"/>
+        </w:rPr>
+      </w:r>
+      <w:r>
+        <w:rPr>
+          <w:color w:val="000000" w:themeColor="text1"/>
+          <w:vertAlign w:val="superscript"/>
+        </w:rPr>
+        <w:fldChar w:fldCharType="separate"/>
+      </w:r>
+      <w:r>
+        <w:rPr>
+          <w:color w:val="000000" w:themeColor="text1"/>
+          <w:vertAlign w:val="superscript"/>
+        </w:rPr>
+        <w:t>a</w:t>
+      </w:r>
+      <w:r>
+        <w:rPr>
+          <w:color w:val="000000" w:themeColor="text1"/>
+          <w:vertAlign w:val="superscript"/>
+        </w:rPr>
+        <w:fldChar w:fldCharType="end"/>
+      </w:r>
+      <w:r>
+        <w:rPr>
+          <w:color w:val="000000" w:themeColor="text1"/>
+          <w:vertAlign w:val="superscript"/>
+        </w:rPr>
+        <w:t>,</w:t>
+      </w:r>
+      <w:r>
+        <w:rPr>
+          <w:color w:val="000000" w:themeColor="text1"/>
+          <w:vertAlign w:val="superscript"/>
+        </w:rPr>
+        <w:fldChar w:fldCharType="begin"/>
+      </w:r>
+      <w:r>
+        <w:rPr>
+          <w:color w:val="000000" w:themeColor="text1"/>
+          <w:vertAlign w:val="superscript"/>
+        </w:rPr>
+        <w:instrText xml:space="preserve"> REF _Ref164264127 \r \h </w:instrText>
+      </w:r>
+      <w:r>
+        <w:rPr>
+          <w:color w:val="000000" w:themeColor="text1"/>
+          <w:vertAlign w:val="superscript"/>
+        </w:rPr>
+      </w:r>
+      <w:r>
+        <w:rPr>
+          <w:color w:val="000000" w:themeColor="text1"/>
+          <w:vertAlign w:val="superscript"/>
+        </w:rPr>
+        <w:fldChar w:fldCharType="separate"/>
+      </w:r>
+      <w:r>
+        <w:rPr>
+          <w:color w:val="000000" w:themeColor="text1"/>
+          <w:vertAlign w:val="superscript"/>
+        </w:rPr>
+        <w:t>b</w:t>
+      </w:r>
+      <w:r>
+        <w:rPr>
+          <w:color w:val="000000" w:themeColor="text1"/>
+          <w:vertAlign w:val="superscript"/>
+        </w:rPr>
+        <w:fldChar w:fldCharType="end"/>
       </w:r>
       <w:r>
         <w:rPr>
@@ -86,7 +168,85 @@
           <w:color w:val="000000" w:themeColor="text1"/>
           <w:vertAlign w:val="superscript"/>
         </w:rPr>
-        <w:t>(2),(3)</w:t>
+        <w:fldChar w:fldCharType="begin"/>
+      </w:r>
+      <w:r>
+        <w:rPr>
+          <w:color w:val="000000" w:themeColor="text1"/>
+          <w:vertAlign w:val="superscript"/>
+        </w:rPr>
+        <w:instrText xml:space="preserve"> REF _Ref164264127 \r \h </w:instrText>
+      </w:r>
+      <w:r>
+        <w:rPr>
+          <w:color w:val="000000" w:themeColor="text1"/>
+          <w:vertAlign w:val="superscript"/>
+        </w:rPr>
+      </w:r>
+      <w:r>
+        <w:rPr>
+          <w:color w:val="000000" w:themeColor="text1"/>
+          <w:vertAlign w:val="superscript"/>
+        </w:rPr>
+        <w:fldChar w:fldCharType="separate"/>
+      </w:r>
+      <w:r>
+        <w:rPr>
+          <w:color w:val="000000" w:themeColor="text1"/>
+          <w:vertAlign w:val="superscript"/>
+        </w:rPr>
+        <w:t>b</w:t>
+      </w:r>
+      <w:r>
+        <w:rPr>
+          <w:color w:val="000000" w:themeColor="text1"/>
+          <w:vertAlign w:val="superscript"/>
+        </w:rPr>
+        <w:fldChar w:fldCharType="end"/>
+      </w:r>
+      <w:r>
+        <w:rPr>
+          <w:color w:val="000000" w:themeColor="text1"/>
+          <w:vertAlign w:val="superscript"/>
+        </w:rPr>
+        <w:t>,</w:t>
+      </w:r>
+      <w:r>
+        <w:rPr>
+          <w:color w:val="000000" w:themeColor="text1"/>
+        </w:rPr>
+        <w:fldChar w:fldCharType="begin"/>
+      </w:r>
+      <w:r>
+        <w:rPr>
+          <w:color w:val="000000" w:themeColor="text1"/>
+          <w:vertAlign w:val="superscript"/>
+        </w:rPr>
+        <w:instrText xml:space="preserve"> REF _Ref164264518 \r \h </w:instrText>
+      </w:r>
+      <w:r>
+        <w:rPr>
+          <w:color w:val="000000" w:themeColor="text1"/>
+        </w:rPr>
+      </w:r>
+      <w:r>
+        <w:rPr>
+          <w:color w:val="000000" w:themeColor="text1"/>
+        </w:rPr>
+        <w:fldChar w:fldCharType="separate"/>
+      </w:r>
+      <w:r>
+        <w:rPr>
+          <w:color w:val="000000" w:themeColor="text1"/>
+          <w:vertAlign w:val="superscript"/>
+        </w:rPr>
+        <w:t>c</w:t>
+      </w:r>
+      <w:r>
+        <w:rPr>
+          <w:color w:val="000000" w:themeColor="text1"/>
+        </w:rPr>
+        <w:fldChar w:fldCharType="end"/>
       </w:r>
       <w:r>
         <w:rPr>
@@ -97,9 +257,87 @@
       <w:r>
         <w:rPr>
           <w:color w:val="000000" w:themeColor="text1"/>
-          <w:vertAlign w:val="superscript"/>
-        </w:rPr>
-        <w:t>(3),(4)</w:t>
+        </w:rPr>
+        <w:fldChar w:fldCharType="begin"/>
+      </w:r>
+      <w:r>
+        <w:rPr>
+          <w:color w:val="000000" w:themeColor="text1"/>
+          <w:vertAlign w:val="superscript"/>
+        </w:rPr>
+        <w:instrText xml:space="preserve"> REF _Ref164264518 \r \h </w:instrText>
+      </w:r>
+      <w:r>
+        <w:rPr>
+          <w:color w:val="000000" w:themeColor="text1"/>
+        </w:rPr>
+      </w:r>
+      <w:r>
+        <w:rPr>
+          <w:color w:val="000000" w:themeColor="text1"/>
+        </w:rPr>
+        <w:fldChar w:fldCharType="separate"/>
+      </w:r>
+      <w:r>
+        <w:rPr>
+          <w:color w:val="000000" w:themeColor="text1"/>
+          <w:vertAlign w:val="superscript"/>
+        </w:rPr>
+        <w:t>c</w:t>
+      </w:r>
+      <w:r>
+        <w:rPr>
+          <w:color w:val="000000" w:themeColor="text1"/>
+        </w:rPr>
+        <w:fldChar w:fldCharType="end"/>
+      </w:r>
+      <w:r>
+        <w:rPr>
+          <w:color w:val="000000" w:themeColor="text1"/>
+          <w:vertAlign w:val="superscript"/>
+        </w:rPr>
+        <w:t>,</w:t>
+      </w:r>
+      <w:r>
+        <w:rPr>
+          <w:color w:val="000000" w:themeColor="text1"/>
+          <w:vertAlign w:val="superscript"/>
+        </w:rPr>
+        <w:fldChar w:fldCharType="begin"/>
+      </w:r>
+      <w:r>
+        <w:rPr>
+          <w:color w:val="000000" w:themeColor="text1"/>
+          <w:vertAlign w:val="superscript"/>
+        </w:rPr>
+        <w:instrText xml:space="preserve"> REF _Ref193295841 \r \h </w:instrText>
+      </w:r>
+      <w:r>
+        <w:rPr>
+          <w:color w:val="000000" w:themeColor="text1"/>
+          <w:vertAlign w:val="superscript"/>
+        </w:rPr>
+      </w:r>
+      <w:r>
+        <w:rPr>
+          <w:color w:val="000000" w:themeColor="text1"/>
+          <w:vertAlign w:val="superscript"/>
+        </w:rPr>
+        <w:fldChar w:fldCharType="separate"/>
+      </w:r>
+      <w:r>
+        <w:rPr>
+          <w:color w:val="000000" w:themeColor="text1"/>
+          <w:vertAlign w:val="superscript"/>
+        </w:rPr>
+        <w:t>d</w:t>
+      </w:r>
+      <w:r>
+        <w:rPr>
+          <w:color w:val="000000" w:themeColor="text1"/>
+          <w:vertAlign w:val="superscript"/>
+        </w:rPr>
+        <w:fldChar w:fldCharType="end"/>
       </w:r>
       <w:r>
         <w:rPr>
@@ -112,7 +350,85 @@
           <w:color w:val="000000" w:themeColor="text1"/>
           <w:vertAlign w:val="superscript"/>
         </w:rPr>
-        <w:t>(2),(3)</w:t>
+        <w:fldChar w:fldCharType="begin"/>
+      </w:r>
+      <w:r>
+        <w:rPr>
+          <w:color w:val="000000" w:themeColor="text1"/>
+          <w:vertAlign w:val="superscript"/>
+        </w:rPr>
+        <w:instrText xml:space="preserve"> REF _Ref164264127 \r \h </w:instrText>
+      </w:r>
+      <w:r>
+        <w:rPr>
+          <w:color w:val="000000" w:themeColor="text1"/>
+          <w:vertAlign w:val="superscript"/>
+        </w:rPr>
+      </w:r>
+      <w:r>
+        <w:rPr>
+          <w:color w:val="000000" w:themeColor="text1"/>
+          <w:vertAlign w:val="superscript"/>
+        </w:rPr>
+        <w:fldChar w:fldCharType="separate"/>
+      </w:r>
+      <w:r>
+        <w:rPr>
+          <w:color w:val="000000" w:themeColor="text1"/>
+          <w:vertAlign w:val="superscript"/>
+        </w:rPr>
+        <w:t>b</w:t>
+      </w:r>
+      <w:r>
+        <w:rPr>
+          <w:color w:val="000000" w:themeColor="text1"/>
+          <w:vertAlign w:val="superscript"/>
+        </w:rPr>
+        <w:fldChar w:fldCharType="end"/>
+      </w:r>
+      <w:r>
+        <w:rPr>
+          <w:color w:val="000000" w:themeColor="text1"/>
+          <w:vertAlign w:val="superscript"/>
+        </w:rPr>
+        <w:t>,</w:t>
+      </w:r>
+      <w:r>
+        <w:rPr>
+          <w:color w:val="000000" w:themeColor="text1"/>
+        </w:rPr>
+        <w:fldChar w:fldCharType="begin"/>
+      </w:r>
+      <w:r>
+        <w:rPr>
+          <w:color w:val="000000" w:themeColor="text1"/>
+          <w:vertAlign w:val="superscript"/>
+        </w:rPr>
+        <w:instrText xml:space="preserve"> REF _Ref164264518 \r \h </w:instrText>
+      </w:r>
+      <w:r>
+        <w:rPr>
+          <w:color w:val="000000" w:themeColor="text1"/>
+        </w:rPr>
+      </w:r>
+      <w:r>
+        <w:rPr>
+          <w:color w:val="000000" w:themeColor="text1"/>
+        </w:rPr>
+        <w:fldChar w:fldCharType="separate"/>
+      </w:r>
+      <w:r>
+        <w:rPr>
+          <w:color w:val="000000" w:themeColor="text1"/>
+          <w:vertAlign w:val="superscript"/>
+        </w:rPr>
+        <w:t>c</w:t>
+      </w:r>
+      <w:r>
+        <w:rPr>
+          <w:color w:val="000000" w:themeColor="text1"/>
+        </w:rPr>
+        <w:fldChar w:fldCharType="end"/>
       </w:r>
       <w:r>
         <w:rPr>
@@ -125,7 +441,137 @@
           <w:color w:val="000000" w:themeColor="text1"/>
           <w:vertAlign w:val="superscript"/>
         </w:rPr>
-        <w:t>(5),(6),(7)</w:t>
+        <w:fldChar w:fldCharType="begin"/>
+      </w:r>
+      <w:r>
+        <w:rPr>
+          <w:color w:val="000000" w:themeColor="text1"/>
+          <w:vertAlign w:val="superscript"/>
+        </w:rPr>
+        <w:instrText xml:space="preserve"> REF _Ref196910598 \r \h </w:instrText>
+      </w:r>
+      <w:r>
+        <w:rPr>
+          <w:color w:val="000000" w:themeColor="text1"/>
+          <w:vertAlign w:val="superscript"/>
+        </w:rPr>
+      </w:r>
+      <w:r>
+        <w:rPr>
+          <w:color w:val="000000" w:themeColor="text1"/>
+          <w:vertAlign w:val="superscript"/>
+        </w:rPr>
+        <w:fldChar w:fldCharType="separate"/>
+      </w:r>
+      <w:r>
+        <w:rPr>
+          <w:color w:val="000000" w:themeColor="text1"/>
+          <w:vertAlign w:val="superscript"/>
+        </w:rPr>
+        <w:t>e</w:t>
+      </w:r>
+      <w:r>
+        <w:rPr>
+          <w:color w:val="000000" w:themeColor="text1"/>
+          <w:vertAlign w:val="superscript"/>
+        </w:rPr>
+        <w:fldChar w:fldCharType="end"/>
+      </w:r>
+      <w:r>
+        <w:rPr>
+          <w:color w:val="000000" w:themeColor="text1"/>
+          <w:vertAlign w:val="superscript"/>
+        </w:rPr>
+        <w:t>,</w:t>
+      </w:r>
+      <w:r>
+        <w:rPr>
+          <w:color w:val="000000" w:themeColor="text1"/>
+          <w:vertAlign w:val="superscript"/>
+        </w:rPr>
+        <w:fldChar w:fldCharType="begin"/>
+      </w:r>
+      <w:r>
+        <w:rPr>
+          <w:color w:val="000000" w:themeColor="text1"/>
+          <w:vertAlign w:val="superscript"/>
+        </w:rPr>
+        <w:instrText xml:space="preserve"> REF _Ref164264497 \r \h  \* MERGEFORMAT </w:instrText>
+      </w:r>
+      <w:r>
+        <w:rPr>
+          <w:color w:val="000000" w:themeColor="text1"/>
+          <w:vertAlign w:val="superscript"/>
+        </w:rPr>
+      </w:r>
+      <w:r>
+        <w:rPr>
+          <w:color w:val="000000" w:themeColor="text1"/>
+          <w:vertAlign w:val="superscript"/>
+        </w:rPr>
+        <w:fldChar w:fldCharType="separate"/>
+      </w:r>
+      <w:r>
+        <w:rPr>
+          <w:color w:val="000000" w:themeColor="text1"/>
+          <w:vertAlign w:val="superscript"/>
+        </w:rPr>
+        <w:t>f</w:t>
+      </w:r>
+      <w:r>
+        <w:rPr>
+          <w:color w:val="000000" w:themeColor="text1"/>
+          <w:vertAlign w:val="superscript"/>
+        </w:rPr>
+        <w:fldChar w:fldCharType="end"/>
+      </w:r>
+      <w:r>
+        <w:rPr>
+          <w:color w:val="000000" w:themeColor="text1"/>
+          <w:vertAlign w:val="superscript"/>
+        </w:rPr>
+        <w:t>,</w:t>
+      </w:r>
+      <w:r>
+        <w:rPr>
+          <w:color w:val="000000" w:themeColor="text1"/>
+          <w:vertAlign w:val="superscript"/>
+        </w:rPr>
+        <w:fldChar w:fldCharType="begin"/>
+      </w:r>
+      <w:r>
+        <w:rPr>
+          <w:color w:val="000000" w:themeColor="text1"/>
+          <w:vertAlign w:val="superscript"/>
+        </w:rPr>
+        <w:instrText xml:space="preserve"> REF _Ref164264527 \r \h </w:instrText>
+      </w:r>
+      <w:r>
+        <w:rPr>
+          <w:color w:val="000000" w:themeColor="text1"/>
+          <w:vertAlign w:val="superscript"/>
+        </w:rPr>
+      </w:r>
+      <w:r>
+        <w:rPr>
+          <w:color w:val="000000" w:themeColor="text1"/>
+          <w:vertAlign w:val="superscript"/>
+        </w:rPr>
+        <w:fldChar w:fldCharType="separate"/>
+      </w:r>
+      <w:r>
+        <w:rPr>
+          <w:color w:val="000000" w:themeColor="text1"/>
+          <w:vertAlign w:val="superscript"/>
+        </w:rPr>
+        <w:t>g</w:t>
+      </w:r>
+      <w:r>
+        <w:rPr>
+          <w:color w:val="000000" w:themeColor="text1"/>
+          <w:vertAlign w:val="superscript"/>
+        </w:rPr>
+        <w:fldChar w:fldCharType="end"/>
       </w:r>
       <w:r>
         <w:rPr>
@@ -138,7 +584,137 @@
           <w:color w:val="000000" w:themeColor="text1"/>
           <w:vertAlign w:val="superscript"/>
         </w:rPr>
-        <w:t>(6),(7),(9)</w:t>
+        <w:fldChar w:fldCharType="begin"/>
+      </w:r>
+      <w:r>
+        <w:rPr>
+          <w:color w:val="000000" w:themeColor="text1"/>
+          <w:vertAlign w:val="superscript"/>
+        </w:rPr>
+        <w:instrText xml:space="preserve"> REF _Ref164264497 \r \h  \* MERGEFORMAT </w:instrText>
+      </w:r>
+      <w:r>
+        <w:rPr>
+          <w:color w:val="000000" w:themeColor="text1"/>
+          <w:vertAlign w:val="superscript"/>
+        </w:rPr>
+      </w:r>
+      <w:r>
+        <w:rPr>
+          <w:color w:val="000000" w:themeColor="text1"/>
+          <w:vertAlign w:val="superscript"/>
+        </w:rPr>
+        <w:fldChar w:fldCharType="separate"/>
+      </w:r>
+      <w:r>
+        <w:rPr>
+          <w:color w:val="000000" w:themeColor="text1"/>
+          <w:vertAlign w:val="superscript"/>
+        </w:rPr>
+        <w:t>f</w:t>
+      </w:r>
+      <w:r>
+        <w:rPr>
+          <w:color w:val="000000" w:themeColor="text1"/>
+          <w:vertAlign w:val="superscript"/>
+        </w:rPr>
+        <w:fldChar w:fldCharType="end"/>
+      </w:r>
+      <w:r>
+        <w:rPr>
+          <w:color w:val="000000" w:themeColor="text1"/>
+          <w:vertAlign w:val="superscript"/>
+        </w:rPr>
+        <w:t>,</w:t>
+      </w:r>
+      <w:r>
+        <w:rPr>
+          <w:color w:val="000000" w:themeColor="text1"/>
+          <w:vertAlign w:val="superscript"/>
+        </w:rPr>
+        <w:fldChar w:fldCharType="begin"/>
+      </w:r>
+      <w:r>
+        <w:rPr>
+          <w:color w:val="000000" w:themeColor="text1"/>
+          <w:vertAlign w:val="superscript"/>
+        </w:rPr>
+        <w:instrText xml:space="preserve"> REF _Ref164264527 \r \h </w:instrText>
+      </w:r>
+      <w:r>
+        <w:rPr>
+          <w:color w:val="000000" w:themeColor="text1"/>
+          <w:vertAlign w:val="superscript"/>
+        </w:rPr>
+      </w:r>
+      <w:r>
+        <w:rPr>
+          <w:color w:val="000000" w:themeColor="text1"/>
+          <w:vertAlign w:val="superscript"/>
+        </w:rPr>
+        <w:fldChar w:fldCharType="separate"/>
+      </w:r>
+      <w:r>
+        <w:rPr>
+          <w:color w:val="000000" w:themeColor="text1"/>
+          <w:vertAlign w:val="superscript"/>
+        </w:rPr>
+        <w:t>g</w:t>
+      </w:r>
+      <w:r>
+        <w:rPr>
+          <w:color w:val="000000" w:themeColor="text1"/>
+          <w:vertAlign w:val="superscript"/>
+        </w:rPr>
+        <w:fldChar w:fldCharType="end"/>
+      </w:r>
+      <w:r>
+        <w:rPr>
+          <w:color w:val="000000" w:themeColor="text1"/>
+          <w:vertAlign w:val="superscript"/>
+        </w:rPr>
+        <w:t>,</w:t>
+      </w:r>
+      <w:r>
+        <w:rPr>
+          <w:color w:val="000000" w:themeColor="text1"/>
+          <w:vertAlign w:val="superscript"/>
+        </w:rPr>
+        <w:fldChar w:fldCharType="begin"/>
+      </w:r>
+      <w:r>
+        <w:rPr>
+          <w:color w:val="000000" w:themeColor="text1"/>
+          <w:vertAlign w:val="superscript"/>
+        </w:rPr>
+        <w:instrText xml:space="preserve"> REF _Ref164264742 \r \h </w:instrText>
+      </w:r>
+      <w:r>
+        <w:rPr>
+          <w:color w:val="000000" w:themeColor="text1"/>
+          <w:vertAlign w:val="superscript"/>
+        </w:rPr>
+      </w:r>
+      <w:r>
+        <w:rPr>
+          <w:color w:val="000000" w:themeColor="text1"/>
+          <w:vertAlign w:val="superscript"/>
+        </w:rPr>
+        <w:fldChar w:fldCharType="separate"/>
+      </w:r>
+      <w:r>
+        <w:rPr>
+          <w:color w:val="000000" w:themeColor="text1"/>
+          <w:vertAlign w:val="superscript"/>
+        </w:rPr>
+        <w:t>i</w:t>
+      </w:r>
+      <w:r>
+        <w:rPr>
+          <w:color w:val="000000" w:themeColor="text1"/>
+          <w:vertAlign w:val="superscript"/>
+        </w:rPr>
+        <w:fldChar w:fldCharType="end"/>
       </w:r>
       <w:r>
         <w:rPr>
@@ -151,127 +727,1217 @@
           <w:color w:val="000000" w:themeColor="text1"/>
           <w:vertAlign w:val="superscript"/>
         </w:rPr>
-        <w:t>(6),(7),(8)</w:t>
-      </w:r>
-      <w:r>
-        <w:rPr>
-          <w:color w:val="000000" w:themeColor="text1"/>
-        </w:rPr>
-        <w:t>, Catherine M. Call</w:t>
-      </w:r>
-      <w:r>
-        <w:rPr>
-          <w:color w:val="000000" w:themeColor="text1"/>
-          <w:vertAlign w:val="superscript"/>
-        </w:rPr>
-        <w:t>(6),(7),(10)</w:t>
-      </w:r>
-      <w:r>
-        <w:rPr>
-          <w:color w:val="000000" w:themeColor="text1"/>
-        </w:rPr>
-        <w:t>, Heide Baron</w:t>
-      </w:r>
-      <w:r>
-        <w:rPr>
-          <w:color w:val="000000" w:themeColor="text1"/>
-          <w:vertAlign w:val="superscript"/>
-        </w:rPr>
-        <w:t>(6),(7)</w:t>
-      </w:r>
-      <w:r>
-        <w:rPr>
-          <w:color w:val="000000" w:themeColor="text1"/>
-        </w:rPr>
-        <w:t>, Arjuna M. Subramanian</w:t>
-      </w:r>
-      <w:r>
-        <w:rPr>
-          <w:color w:val="000000" w:themeColor="text1"/>
-          <w:vertAlign w:val="superscript"/>
-        </w:rPr>
-        <w:t>(6),(7)</w:t>
-      </w:r>
-      <w:r>
-        <w:rPr>
-          <w:color w:val="000000" w:themeColor="text1"/>
-        </w:rPr>
-        <w:t xml:space="preserve">, Daniel R. </w:t>
-      </w:r>
-      <w:proofErr w:type="spellStart"/>
-      <w:r>
-        <w:rPr>
-          <w:color w:val="000000" w:themeColor="text1"/>
-        </w:rPr>
-        <w:t>Weilandt</w:t>
-      </w:r>
-      <w:proofErr w:type="spellEnd"/>
-      <w:r>
-        <w:rPr>
-          <w:color w:val="000000" w:themeColor="text1"/>
-          <w:vertAlign w:val="superscript"/>
-        </w:rPr>
-        <w:t>(5),(6),(7),(12)</w:t>
-      </w:r>
-      <w:r>
-        <w:rPr>
-          <w:color w:val="000000" w:themeColor="text1"/>
-        </w:rPr>
-        <w:t>, Felix C. Keber</w:t>
-      </w:r>
-      <w:r>
-        <w:rPr>
-          <w:color w:val="000000" w:themeColor="text1"/>
-          <w:vertAlign w:val="superscript"/>
-        </w:rPr>
-        <w:t>(6),(7)</w:t>
-      </w:r>
-      <w:r>
-        <w:rPr>
-          <w:color w:val="000000" w:themeColor="text1"/>
-        </w:rPr>
-        <w:t>, Martin Wühr</w:t>
-      </w:r>
-      <w:r>
-        <w:rPr>
-          <w:color w:val="000000" w:themeColor="text1"/>
-          <w:vertAlign w:val="superscript"/>
-        </w:rPr>
-        <w:t>(7),(11)</w:t>
-      </w:r>
-      <w:r>
-        <w:rPr>
-          <w:color w:val="000000" w:themeColor="text1"/>
-        </w:rPr>
-        <w:t>, Joshua D. Rabinowitz</w:t>
-      </w:r>
-      <w:r>
-        <w:rPr>
-          <w:color w:val="000000" w:themeColor="text1"/>
-          <w:vertAlign w:val="superscript"/>
-        </w:rPr>
-        <w:t>(5),(6),(7),(12)</w:t>
-      </w:r>
-      <w:r>
-        <w:rPr>
-          <w:color w:val="000000" w:themeColor="text1"/>
-        </w:rPr>
-        <w:t xml:space="preserve">, Costas D. </w:t>
-      </w:r>
-      <w:proofErr w:type="spellStart"/>
-      <w:r>
-        <w:rPr>
-          <w:color w:val="000000" w:themeColor="text1"/>
-        </w:rPr>
-        <w:t>Maranas</w:t>
-      </w:r>
-      <w:proofErr w:type="spellEnd"/>
-      <w:r>
-        <w:rPr>
-          <w:color w:val="000000" w:themeColor="text1"/>
-          <w:vertAlign w:val="superscript"/>
-        </w:rPr>
-        <w:t>(2),(3)</w:t>
+        <w:fldChar w:fldCharType="begin"/>
+      </w:r>
+      <w:r>
+        <w:rPr>
+          <w:color w:val="000000" w:themeColor="text1"/>
+          <w:vertAlign w:val="superscript"/>
+        </w:rPr>
+        <w:instrText xml:space="preserve"> REF _Ref164264497 \r \h  \* MERGEFORMAT </w:instrText>
+      </w:r>
+      <w:r>
+        <w:rPr>
+          <w:color w:val="000000" w:themeColor="text1"/>
+          <w:vertAlign w:val="superscript"/>
+        </w:rPr>
+      </w:r>
+      <w:r>
+        <w:rPr>
+          <w:color w:val="000000" w:themeColor="text1"/>
+          <w:vertAlign w:val="superscript"/>
+        </w:rPr>
+        <w:fldChar w:fldCharType="separate"/>
+      </w:r>
+      <w:r>
+        <w:rPr>
+          <w:color w:val="000000" w:themeColor="text1"/>
+          <w:vertAlign w:val="superscript"/>
+        </w:rPr>
+        <w:t>f</w:t>
+      </w:r>
+      <w:r>
+        <w:rPr>
+          <w:color w:val="000000" w:themeColor="text1"/>
+          <w:vertAlign w:val="superscript"/>
+        </w:rPr>
+        <w:fldChar w:fldCharType="end"/>
+      </w:r>
+      <w:r>
+        <w:rPr>
+          <w:color w:val="000000" w:themeColor="text1"/>
+          <w:vertAlign w:val="superscript"/>
+        </w:rPr>
+        <w:t>,</w:t>
+      </w:r>
+      <w:r>
+        <w:rPr>
+          <w:color w:val="000000" w:themeColor="text1"/>
+          <w:vertAlign w:val="superscript"/>
+        </w:rPr>
+        <w:fldChar w:fldCharType="begin"/>
+      </w:r>
+      <w:r>
+        <w:rPr>
+          <w:color w:val="000000" w:themeColor="text1"/>
+          <w:vertAlign w:val="superscript"/>
+        </w:rPr>
+        <w:instrText xml:space="preserve"> REF _Ref164264527 \r \h </w:instrText>
+      </w:r>
+      <w:r>
+        <w:rPr>
+          <w:color w:val="000000" w:themeColor="text1"/>
+          <w:vertAlign w:val="superscript"/>
+        </w:rPr>
+      </w:r>
+      <w:r>
+        <w:rPr>
+          <w:color w:val="000000" w:themeColor="text1"/>
+          <w:vertAlign w:val="superscript"/>
+        </w:rPr>
+        <w:fldChar w:fldCharType="separate"/>
+      </w:r>
+      <w:r>
+        <w:rPr>
+          <w:color w:val="000000" w:themeColor="text1"/>
+          <w:vertAlign w:val="superscript"/>
+        </w:rPr>
+        <w:t>g</w:t>
+      </w:r>
+      <w:r>
+        <w:rPr>
+          <w:color w:val="000000" w:themeColor="text1"/>
+          <w:vertAlign w:val="superscript"/>
+        </w:rPr>
+        <w:fldChar w:fldCharType="end"/>
+      </w:r>
+      <w:r>
+        <w:rPr>
+          <w:color w:val="000000" w:themeColor="text1"/>
+          <w:vertAlign w:val="superscript"/>
+        </w:rPr>
+        <w:t>,</w:t>
+      </w:r>
+      <w:r>
+        <w:rPr>
+          <w:color w:val="000000" w:themeColor="text1"/>
+          <w:vertAlign w:val="superscript"/>
+        </w:rPr>
+        <w:fldChar w:fldCharType="begin"/>
+      </w:r>
+      <w:r>
+        <w:rPr>
+          <w:color w:val="000000" w:themeColor="text1"/>
+          <w:vertAlign w:val="superscript"/>
+        </w:rPr>
+        <w:instrText xml:space="preserve"> REF _Ref196743245 \r \h </w:instrText>
+      </w:r>
+      <w:r>
+        <w:rPr>
+          <w:color w:val="000000" w:themeColor="text1"/>
+          <w:vertAlign w:val="superscript"/>
+        </w:rPr>
+      </w:r>
+      <w:r>
+        <w:rPr>
+          <w:color w:val="000000" w:themeColor="text1"/>
+          <w:vertAlign w:val="superscript"/>
+        </w:rPr>
+        <w:fldChar w:fldCharType="separate"/>
+      </w:r>
+      <w:r>
+        <w:rPr>
+          <w:color w:val="000000" w:themeColor="text1"/>
+          <w:vertAlign w:val="superscript"/>
+        </w:rPr>
+        <w:t>h</w:t>
+      </w:r>
+      <w:r>
+        <w:rPr>
+          <w:color w:val="000000" w:themeColor="text1"/>
+          <w:vertAlign w:val="superscript"/>
+        </w:rPr>
+        <w:fldChar w:fldCharType="end"/>
+      </w:r>
+      <w:r>
+        <w:rPr>
+          <w:color w:val="000000" w:themeColor="text1"/>
+        </w:rPr>
+        <w:t xml:space="preserve">, </w:t>
+      </w:r>
+      <w:r>
+        <w:rPr>
+          <w:color w:val="000000" w:themeColor="text1"/>
+        </w:rPr>
+        <w:t>Catherine M. Call</w:t>
+      </w:r>
+      <w:r>
+        <w:rPr>
+          <w:color w:val="000000" w:themeColor="text1"/>
+          <w:vertAlign w:val="superscript"/>
+        </w:rPr>
+        <w:fldChar w:fldCharType="begin"/>
+      </w:r>
+      <w:r>
+        <w:rPr>
+          <w:color w:val="000000" w:themeColor="text1"/>
+          <w:vertAlign w:val="superscript"/>
+        </w:rPr>
+        <w:instrText xml:space="preserve"> REF _Ref164264497 \r \h </w:instrText>
+      </w:r>
+      <w:r>
+        <w:rPr>
+          <w:color w:val="000000" w:themeColor="text1"/>
+          <w:vertAlign w:val="superscript"/>
+        </w:rPr>
+        <w:instrText xml:space="preserve"> \* MERGEFORMAT </w:instrText>
+      </w:r>
+      <w:r>
+        <w:rPr>
+          <w:color w:val="000000" w:themeColor="text1"/>
+          <w:vertAlign w:val="superscript"/>
+        </w:rPr>
+      </w:r>
+      <w:r>
+        <w:rPr>
+          <w:color w:val="000000" w:themeColor="text1"/>
+          <w:vertAlign w:val="superscript"/>
+        </w:rPr>
+        <w:fldChar w:fldCharType="separate"/>
+      </w:r>
+      <w:r>
+        <w:rPr>
+          <w:color w:val="000000" w:themeColor="text1"/>
+          <w:vertAlign w:val="superscript"/>
+        </w:rPr>
+        <w:t>f</w:t>
+      </w:r>
+      <w:r>
+        <w:rPr>
+          <w:color w:val="000000" w:themeColor="text1"/>
+          <w:vertAlign w:val="superscript"/>
+        </w:rPr>
+        <w:fldChar w:fldCharType="end"/>
+      </w:r>
+      <w:r>
+        <w:rPr>
+          <w:color w:val="000000" w:themeColor="text1"/>
+          <w:vertAlign w:val="superscript"/>
+        </w:rPr>
+        <w:t>,</w:t>
+      </w:r>
+      <w:r>
+        <w:rPr>
+          <w:color w:val="000000" w:themeColor="text1"/>
+          <w:vertAlign w:val="superscript"/>
+        </w:rPr>
+        <w:fldChar w:fldCharType="begin"/>
+      </w:r>
+      <w:r>
+        <w:rPr>
+          <w:color w:val="000000" w:themeColor="text1"/>
+          <w:vertAlign w:val="superscript"/>
+        </w:rPr>
+        <w:instrText xml:space="preserve"> REF _Ref164264527 \r \h </w:instrText>
+      </w:r>
+      <w:r>
+        <w:rPr>
+          <w:color w:val="000000" w:themeColor="text1"/>
+          <w:vertAlign w:val="superscript"/>
+        </w:rPr>
+        <w:instrText xml:space="preserve"> \* MERGEFORMAT </w:instrText>
+      </w:r>
+      <w:r>
+        <w:rPr>
+          <w:color w:val="000000" w:themeColor="text1"/>
+          <w:vertAlign w:val="superscript"/>
+        </w:rPr>
+      </w:r>
+      <w:r>
+        <w:rPr>
+          <w:color w:val="000000" w:themeColor="text1"/>
+          <w:vertAlign w:val="superscript"/>
+        </w:rPr>
+        <w:fldChar w:fldCharType="separate"/>
+      </w:r>
+      <w:r>
+        <w:rPr>
+          <w:color w:val="000000" w:themeColor="text1"/>
+          <w:vertAlign w:val="superscript"/>
+        </w:rPr>
+        <w:t>g</w:t>
+      </w:r>
+      <w:r>
+        <w:rPr>
+          <w:color w:val="000000" w:themeColor="text1"/>
+          <w:vertAlign w:val="superscript"/>
+        </w:rPr>
+        <w:fldChar w:fldCharType="end"/>
+      </w:r>
+      <w:r>
+        <w:rPr>
+          <w:color w:val="000000" w:themeColor="text1"/>
+          <w:vertAlign w:val="superscript"/>
+        </w:rPr>
+        <w:t>,</w:t>
+      </w:r>
+      <w:r>
+        <w:rPr>
+          <w:color w:val="000000" w:themeColor="text1"/>
+          <w:vertAlign w:val="superscript"/>
+        </w:rPr>
+        <w:fldChar w:fldCharType="begin"/>
+      </w:r>
+      <w:r>
+        <w:rPr>
+          <w:color w:val="000000" w:themeColor="text1"/>
+          <w:vertAlign w:val="superscript"/>
+        </w:rPr>
+        <w:instrText xml:space="preserve"> REF _Ref203394791 \r \h </w:instrText>
+      </w:r>
+      <w:r>
+        <w:rPr>
+          <w:color w:val="000000" w:themeColor="text1"/>
+          <w:vertAlign w:val="superscript"/>
+        </w:rPr>
+      </w:r>
+      <w:r>
+        <w:rPr>
+          <w:color w:val="000000" w:themeColor="text1"/>
+          <w:vertAlign w:val="superscript"/>
+        </w:rPr>
+        <w:fldChar w:fldCharType="separate"/>
+      </w:r>
+      <w:r>
+        <w:rPr>
+          <w:color w:val="000000" w:themeColor="text1"/>
+          <w:vertAlign w:val="superscript"/>
+        </w:rPr>
+        <w:t>j</w:t>
+      </w:r>
+      <w:r>
+        <w:rPr>
+          <w:color w:val="000000" w:themeColor="text1"/>
+          <w:vertAlign w:val="superscript"/>
+        </w:rPr>
+        <w:fldChar w:fldCharType="end"/>
+      </w:r>
+      <w:r>
+        <w:rPr>
+          <w:color w:val="000000" w:themeColor="text1"/>
+        </w:rPr>
+        <w:t xml:space="preserve">, </w:t>
+      </w:r>
+      <w:r>
+        <w:rPr>
+          <w:color w:val="000000" w:themeColor="text1"/>
+        </w:rPr>
+        <w:t>Heide Baron</w:t>
+      </w:r>
+      <w:r>
+        <w:rPr>
+          <w:color w:val="000000" w:themeColor="text1"/>
+          <w:vertAlign w:val="superscript"/>
+        </w:rPr>
+        <w:fldChar w:fldCharType="begin"/>
+      </w:r>
+      <w:r>
+        <w:rPr>
+          <w:color w:val="000000" w:themeColor="text1"/>
+          <w:vertAlign w:val="superscript"/>
+        </w:rPr>
+        <w:instrText xml:space="preserve"> REF _Ref164264497 \r \h  \* MERGEFORMAT </w:instrText>
+      </w:r>
+      <w:r>
+        <w:rPr>
+          <w:color w:val="000000" w:themeColor="text1"/>
+          <w:vertAlign w:val="superscript"/>
+        </w:rPr>
+      </w:r>
+      <w:r>
+        <w:rPr>
+          <w:color w:val="000000" w:themeColor="text1"/>
+          <w:vertAlign w:val="superscript"/>
+        </w:rPr>
+        <w:fldChar w:fldCharType="separate"/>
+      </w:r>
+      <w:r>
+        <w:rPr>
+          <w:color w:val="000000" w:themeColor="text1"/>
+          <w:vertAlign w:val="superscript"/>
+        </w:rPr>
+        <w:t>f</w:t>
+      </w:r>
+      <w:r>
+        <w:rPr>
+          <w:color w:val="000000" w:themeColor="text1"/>
+          <w:vertAlign w:val="superscript"/>
+        </w:rPr>
+        <w:fldChar w:fldCharType="end"/>
+      </w:r>
+      <w:r>
+        <w:rPr>
+          <w:color w:val="000000" w:themeColor="text1"/>
+          <w:vertAlign w:val="superscript"/>
+        </w:rPr>
+        <w:t>,</w:t>
+      </w:r>
+      <w:r>
+        <w:rPr>
+          <w:color w:val="000000" w:themeColor="text1"/>
+          <w:vertAlign w:val="superscript"/>
+        </w:rPr>
+        <w:fldChar w:fldCharType="begin"/>
+      </w:r>
+      <w:r>
+        <w:rPr>
+          <w:color w:val="000000" w:themeColor="text1"/>
+          <w:vertAlign w:val="superscript"/>
+        </w:rPr>
+        <w:instrText xml:space="preserve"> REF _Ref164264527 \r \h </w:instrText>
+      </w:r>
+      <w:r>
+        <w:rPr>
+          <w:color w:val="000000" w:themeColor="text1"/>
+          <w:vertAlign w:val="superscript"/>
+        </w:rPr>
+        <w:instrText xml:space="preserve"> \* MERGEFORMAT </w:instrText>
+      </w:r>
+      <w:r>
+        <w:rPr>
+          <w:color w:val="000000" w:themeColor="text1"/>
+          <w:vertAlign w:val="superscript"/>
+        </w:rPr>
+      </w:r>
+      <w:r>
+        <w:rPr>
+          <w:color w:val="000000" w:themeColor="text1"/>
+          <w:vertAlign w:val="superscript"/>
+        </w:rPr>
+        <w:fldChar w:fldCharType="separate"/>
+      </w:r>
+      <w:r>
+        <w:rPr>
+          <w:color w:val="000000" w:themeColor="text1"/>
+          <w:vertAlign w:val="superscript"/>
+        </w:rPr>
+        <w:t>g</w:t>
+      </w:r>
+      <w:r>
+        <w:rPr>
+          <w:color w:val="000000" w:themeColor="text1"/>
+          <w:vertAlign w:val="superscript"/>
+        </w:rPr>
+        <w:fldChar w:fldCharType="end"/>
+      </w:r>
+      <w:r>
+        <w:rPr>
+          <w:color w:val="000000" w:themeColor="text1"/>
+        </w:rPr>
+        <w:t xml:space="preserve">, </w:t>
+      </w:r>
+      <w:r>
+        <w:rPr>
+          <w:color w:val="000000" w:themeColor="text1"/>
+        </w:rPr>
+        <w:t>Arjuna M. Subramanian</w:t>
+      </w:r>
+      <w:r>
+        <w:rPr>
+          <w:color w:val="000000" w:themeColor="text1"/>
+          <w:vertAlign w:val="superscript"/>
+        </w:rPr>
+        <w:fldChar w:fldCharType="begin"/>
+      </w:r>
+      <w:r>
+        <w:rPr>
+          <w:color w:val="000000" w:themeColor="text1"/>
+          <w:vertAlign w:val="superscript"/>
+        </w:rPr>
+        <w:instrText xml:space="preserve"> REF _Ref164264497 \r \h  \* MERGEFORMAT </w:instrText>
+      </w:r>
+      <w:r>
+        <w:rPr>
+          <w:color w:val="000000" w:themeColor="text1"/>
+          <w:vertAlign w:val="superscript"/>
+        </w:rPr>
+      </w:r>
+      <w:r>
+        <w:rPr>
+          <w:color w:val="000000" w:themeColor="text1"/>
+          <w:vertAlign w:val="superscript"/>
+        </w:rPr>
+        <w:fldChar w:fldCharType="separate"/>
+      </w:r>
+      <w:r>
+        <w:rPr>
+          <w:color w:val="000000" w:themeColor="text1"/>
+          <w:vertAlign w:val="superscript"/>
+        </w:rPr>
+        <w:t>f</w:t>
+      </w:r>
+      <w:r>
+        <w:rPr>
+          <w:color w:val="000000" w:themeColor="text1"/>
+          <w:vertAlign w:val="superscript"/>
+        </w:rPr>
+        <w:fldChar w:fldCharType="end"/>
+      </w:r>
+      <w:r>
+        <w:rPr>
+          <w:color w:val="000000" w:themeColor="text1"/>
+          <w:vertAlign w:val="superscript"/>
+        </w:rPr>
+        <w:t>,</w:t>
+      </w:r>
+      <w:r>
+        <w:rPr>
+          <w:color w:val="000000" w:themeColor="text1"/>
+          <w:vertAlign w:val="superscript"/>
+        </w:rPr>
+        <w:fldChar w:fldCharType="begin"/>
+      </w:r>
+      <w:r>
+        <w:rPr>
+          <w:color w:val="000000" w:themeColor="text1"/>
+          <w:vertAlign w:val="superscript"/>
+        </w:rPr>
+        <w:instrText xml:space="preserve"> REF _Ref164264527 \r \h </w:instrText>
+      </w:r>
+      <w:r>
+        <w:rPr>
+          <w:color w:val="000000" w:themeColor="text1"/>
+          <w:vertAlign w:val="superscript"/>
+        </w:rPr>
+        <w:instrText xml:space="preserve"> \* MERGEFORMAT </w:instrText>
+      </w:r>
+      <w:r>
+        <w:rPr>
+          <w:color w:val="000000" w:themeColor="text1"/>
+          <w:vertAlign w:val="superscript"/>
+        </w:rPr>
+      </w:r>
+      <w:r>
+        <w:rPr>
+          <w:color w:val="000000" w:themeColor="text1"/>
+          <w:vertAlign w:val="superscript"/>
+        </w:rPr>
+        <w:fldChar w:fldCharType="separate"/>
+      </w:r>
+      <w:r>
+        <w:rPr>
+          <w:color w:val="000000" w:themeColor="text1"/>
+          <w:vertAlign w:val="superscript"/>
+        </w:rPr>
+        <w:t>g</w:t>
+      </w:r>
+      <w:r>
+        <w:rPr>
+          <w:color w:val="000000" w:themeColor="text1"/>
+          <w:vertAlign w:val="superscript"/>
+        </w:rPr>
+        <w:fldChar w:fldCharType="end"/>
+      </w:r>
+      <w:r>
+        <w:rPr>
+          <w:color w:val="000000" w:themeColor="text1"/>
+        </w:rPr>
+        <w:t xml:space="preserve">, </w:t>
+      </w:r>
+      <w:r>
+        <w:rPr>
+          <w:color w:val="000000" w:themeColor="text1"/>
+        </w:rPr>
+        <w:t>Daniel R. Weilandt</w:t>
+      </w:r>
+      <w:r>
+        <w:rPr>
+          <w:color w:val="000000" w:themeColor="text1"/>
+          <w:vertAlign w:val="superscript"/>
+        </w:rPr>
+        <w:fldChar w:fldCharType="begin"/>
+      </w:r>
+      <w:r>
+        <w:rPr>
+          <w:color w:val="000000" w:themeColor="text1"/>
+          <w:vertAlign w:val="superscript"/>
+        </w:rPr>
+        <w:instrText xml:space="preserve"> REF _Ref196910598 \r \h </w:instrText>
+      </w:r>
+      <w:r>
+        <w:rPr>
+          <w:color w:val="000000" w:themeColor="text1"/>
+          <w:vertAlign w:val="superscript"/>
+        </w:rPr>
+      </w:r>
+      <w:r>
+        <w:rPr>
+          <w:color w:val="000000" w:themeColor="text1"/>
+          <w:vertAlign w:val="superscript"/>
+        </w:rPr>
+        <w:fldChar w:fldCharType="separate"/>
+      </w:r>
+      <w:r>
+        <w:rPr>
+          <w:color w:val="000000" w:themeColor="text1"/>
+          <w:vertAlign w:val="superscript"/>
+        </w:rPr>
+        <w:t>e</w:t>
+      </w:r>
+      <w:r>
+        <w:rPr>
+          <w:color w:val="000000" w:themeColor="text1"/>
+          <w:vertAlign w:val="superscript"/>
+        </w:rPr>
+        <w:fldChar w:fldCharType="end"/>
+      </w:r>
+      <w:r>
+        <w:rPr>
+          <w:color w:val="000000" w:themeColor="text1"/>
+          <w:vertAlign w:val="superscript"/>
+        </w:rPr>
+        <w:t>,</w:t>
+      </w:r>
+      <w:r>
+        <w:rPr>
+          <w:color w:val="000000" w:themeColor="text1"/>
+          <w:vertAlign w:val="superscript"/>
+        </w:rPr>
+        <w:fldChar w:fldCharType="begin"/>
+      </w:r>
+      <w:r>
+        <w:rPr>
+          <w:color w:val="000000" w:themeColor="text1"/>
+          <w:vertAlign w:val="superscript"/>
+        </w:rPr>
+        <w:instrText xml:space="preserve"> REF _Ref164264497 \r \h  \* MERGEFORMAT </w:instrText>
+      </w:r>
+      <w:r>
+        <w:rPr>
+          <w:color w:val="000000" w:themeColor="text1"/>
+          <w:vertAlign w:val="superscript"/>
+        </w:rPr>
+      </w:r>
+      <w:r>
+        <w:rPr>
+          <w:color w:val="000000" w:themeColor="text1"/>
+          <w:vertAlign w:val="superscript"/>
+        </w:rPr>
+        <w:fldChar w:fldCharType="separate"/>
+      </w:r>
+      <w:r>
+        <w:rPr>
+          <w:color w:val="000000" w:themeColor="text1"/>
+          <w:vertAlign w:val="superscript"/>
+        </w:rPr>
+        <w:t>f</w:t>
+      </w:r>
+      <w:r>
+        <w:rPr>
+          <w:color w:val="000000" w:themeColor="text1"/>
+          <w:vertAlign w:val="superscript"/>
+        </w:rPr>
+        <w:fldChar w:fldCharType="end"/>
+      </w:r>
+      <w:r>
+        <w:rPr>
+          <w:color w:val="000000" w:themeColor="text1"/>
+          <w:vertAlign w:val="superscript"/>
+        </w:rPr>
+        <w:t>,</w:t>
+      </w:r>
+      <w:r>
+        <w:rPr>
+          <w:color w:val="000000" w:themeColor="text1"/>
+          <w:vertAlign w:val="superscript"/>
+        </w:rPr>
+        <w:fldChar w:fldCharType="begin"/>
+      </w:r>
+      <w:r>
+        <w:rPr>
+          <w:color w:val="000000" w:themeColor="text1"/>
+          <w:vertAlign w:val="superscript"/>
+        </w:rPr>
+        <w:instrText xml:space="preserve"> REF _Ref164264527 \r \h </w:instrText>
+      </w:r>
+      <w:r>
+        <w:rPr>
+          <w:color w:val="000000" w:themeColor="text1"/>
+          <w:vertAlign w:val="superscript"/>
+        </w:rPr>
+      </w:r>
+      <w:r>
+        <w:rPr>
+          <w:color w:val="000000" w:themeColor="text1"/>
+          <w:vertAlign w:val="superscript"/>
+        </w:rPr>
+        <w:fldChar w:fldCharType="separate"/>
+      </w:r>
+      <w:r>
+        <w:rPr>
+          <w:color w:val="000000" w:themeColor="text1"/>
+          <w:vertAlign w:val="superscript"/>
+        </w:rPr>
+        <w:t>g</w:t>
+      </w:r>
+      <w:r>
+        <w:rPr>
+          <w:color w:val="000000" w:themeColor="text1"/>
+          <w:vertAlign w:val="superscript"/>
+        </w:rPr>
+        <w:fldChar w:fldCharType="end"/>
+      </w:r>
+      <w:r>
+        <w:rPr>
+          <w:color w:val="000000" w:themeColor="text1"/>
+          <w:vertAlign w:val="superscript"/>
+        </w:rPr>
+        <w:t>,</w:t>
+      </w:r>
+      <w:r>
+        <w:rPr>
+          <w:color w:val="000000" w:themeColor="text1"/>
+          <w:vertAlign w:val="superscript"/>
+        </w:rPr>
+        <w:fldChar w:fldCharType="begin"/>
+      </w:r>
+      <w:r>
+        <w:rPr>
+          <w:color w:val="000000" w:themeColor="text1"/>
+          <w:vertAlign w:val="superscript"/>
+        </w:rPr>
+        <w:instrText xml:space="preserve"> REF _Ref164264552 \r \h </w:instrText>
+      </w:r>
+      <w:r>
+        <w:rPr>
+          <w:color w:val="000000" w:themeColor="text1"/>
+          <w:vertAlign w:val="superscript"/>
+        </w:rPr>
+      </w:r>
+      <w:r>
+        <w:rPr>
+          <w:color w:val="000000" w:themeColor="text1"/>
+          <w:vertAlign w:val="superscript"/>
+        </w:rPr>
+        <w:fldChar w:fldCharType="separate"/>
+      </w:r>
+      <w:r>
+        <w:rPr>
+          <w:color w:val="000000" w:themeColor="text1"/>
+          <w:vertAlign w:val="superscript"/>
+        </w:rPr>
+        <w:t>l</w:t>
+      </w:r>
+      <w:r>
+        <w:rPr>
+          <w:color w:val="000000" w:themeColor="text1"/>
+          <w:vertAlign w:val="superscript"/>
+        </w:rPr>
+        <w:fldChar w:fldCharType="end"/>
+      </w:r>
+      <w:r>
+        <w:rPr>
+          <w:color w:val="000000" w:themeColor="text1"/>
+        </w:rPr>
+        <w:t xml:space="preserve">, </w:t>
+      </w:r>
+      <w:r>
+        <w:rPr>
+          <w:color w:val="000000" w:themeColor="text1"/>
+        </w:rPr>
+        <w:t>Felix C. Keber</w:t>
+      </w:r>
+      <w:r>
+        <w:rPr>
+          <w:color w:val="000000" w:themeColor="text1"/>
+          <w:vertAlign w:val="superscript"/>
+        </w:rPr>
+        <w:fldChar w:fldCharType="begin"/>
+      </w:r>
+      <w:r>
+        <w:rPr>
+          <w:color w:val="000000" w:themeColor="text1"/>
+          <w:vertAlign w:val="superscript"/>
+        </w:rPr>
+        <w:instrText xml:space="preserve"> REF _Ref164264497 \r \h  \* MERGEFORMAT </w:instrText>
+      </w:r>
+      <w:r>
+        <w:rPr>
+          <w:color w:val="000000" w:themeColor="text1"/>
+          <w:vertAlign w:val="superscript"/>
+        </w:rPr>
+      </w:r>
+      <w:r>
+        <w:rPr>
+          <w:color w:val="000000" w:themeColor="text1"/>
+          <w:vertAlign w:val="superscript"/>
+        </w:rPr>
+        <w:fldChar w:fldCharType="separate"/>
+      </w:r>
+      <w:r>
+        <w:rPr>
+          <w:color w:val="000000" w:themeColor="text1"/>
+          <w:vertAlign w:val="superscript"/>
+        </w:rPr>
+        <w:t>f</w:t>
+      </w:r>
+      <w:r>
+        <w:rPr>
+          <w:color w:val="000000" w:themeColor="text1"/>
+          <w:vertAlign w:val="superscript"/>
+        </w:rPr>
+        <w:fldChar w:fldCharType="end"/>
+      </w:r>
+      <w:r>
+        <w:rPr>
+          <w:color w:val="000000" w:themeColor="text1"/>
+          <w:vertAlign w:val="superscript"/>
+        </w:rPr>
+        <w:t>,</w:t>
+      </w:r>
+      <w:r>
+        <w:rPr>
+          <w:color w:val="000000" w:themeColor="text1"/>
+          <w:vertAlign w:val="superscript"/>
+        </w:rPr>
+        <w:fldChar w:fldCharType="begin"/>
+      </w:r>
+      <w:r>
+        <w:rPr>
+          <w:color w:val="000000" w:themeColor="text1"/>
+          <w:vertAlign w:val="superscript"/>
+        </w:rPr>
+        <w:instrText xml:space="preserve"> REF _Ref164264527 \r \h </w:instrText>
+      </w:r>
+      <w:r>
+        <w:rPr>
+          <w:color w:val="000000" w:themeColor="text1"/>
+          <w:vertAlign w:val="superscript"/>
+        </w:rPr>
+        <w:instrText xml:space="preserve"> \* MERGEFORMAT </w:instrText>
+      </w:r>
+      <w:r>
+        <w:rPr>
+          <w:color w:val="000000" w:themeColor="text1"/>
+          <w:vertAlign w:val="superscript"/>
+        </w:rPr>
+      </w:r>
+      <w:r>
+        <w:rPr>
+          <w:color w:val="000000" w:themeColor="text1"/>
+          <w:vertAlign w:val="superscript"/>
+        </w:rPr>
+        <w:fldChar w:fldCharType="separate"/>
+      </w:r>
+      <w:r>
+        <w:rPr>
+          <w:color w:val="000000" w:themeColor="text1"/>
+          <w:vertAlign w:val="superscript"/>
+        </w:rPr>
+        <w:t>g</w:t>
+      </w:r>
+      <w:r>
+        <w:rPr>
+          <w:color w:val="000000" w:themeColor="text1"/>
+          <w:vertAlign w:val="superscript"/>
+        </w:rPr>
+        <w:fldChar w:fldCharType="end"/>
+      </w:r>
+      <w:r>
+        <w:rPr>
+          <w:color w:val="000000" w:themeColor="text1"/>
+        </w:rPr>
+        <w:t xml:space="preserve">, </w:t>
+      </w:r>
+      <w:r>
+        <w:rPr>
+          <w:color w:val="000000" w:themeColor="text1"/>
+        </w:rPr>
+        <w:t>Martin Wühr</w:t>
+      </w:r>
+      <w:r>
+        <w:rPr>
+          <w:color w:val="000000" w:themeColor="text1"/>
+          <w:vertAlign w:val="superscript"/>
+        </w:rPr>
+        <w:fldChar w:fldCharType="begin"/>
+      </w:r>
+      <w:r>
+        <w:rPr>
+          <w:color w:val="000000" w:themeColor="text1"/>
+          <w:vertAlign w:val="superscript"/>
+        </w:rPr>
+        <w:instrText xml:space="preserve"> REF _Ref164264527 \r \h </w:instrText>
+      </w:r>
+      <w:r>
+        <w:rPr>
+          <w:color w:val="000000" w:themeColor="text1"/>
+          <w:vertAlign w:val="superscript"/>
+        </w:rPr>
+        <w:instrText xml:space="preserve"> \* MERGEFORMAT </w:instrText>
+      </w:r>
+      <w:r>
+        <w:rPr>
+          <w:color w:val="000000" w:themeColor="text1"/>
+          <w:vertAlign w:val="superscript"/>
+        </w:rPr>
+      </w:r>
+      <w:r>
+        <w:rPr>
+          <w:color w:val="000000" w:themeColor="text1"/>
+          <w:vertAlign w:val="superscript"/>
+        </w:rPr>
+        <w:fldChar w:fldCharType="separate"/>
+      </w:r>
+      <w:r>
+        <w:rPr>
+          <w:color w:val="000000" w:themeColor="text1"/>
+          <w:vertAlign w:val="superscript"/>
+        </w:rPr>
+        <w:t>g</w:t>
+      </w:r>
+      <w:r>
+        <w:rPr>
+          <w:color w:val="000000" w:themeColor="text1"/>
+          <w:vertAlign w:val="superscript"/>
+        </w:rPr>
+        <w:fldChar w:fldCharType="end"/>
+      </w:r>
+      <w:r>
+        <w:rPr>
+          <w:color w:val="000000" w:themeColor="text1"/>
+          <w:vertAlign w:val="superscript"/>
+        </w:rPr>
+        <w:t>,</w:t>
+      </w:r>
+      <w:r>
+        <w:rPr>
+          <w:color w:val="000000" w:themeColor="text1"/>
+          <w:vertAlign w:val="superscript"/>
+        </w:rPr>
+        <w:fldChar w:fldCharType="begin"/>
+      </w:r>
+      <w:r>
+        <w:rPr>
+          <w:color w:val="000000" w:themeColor="text1"/>
+          <w:vertAlign w:val="superscript"/>
+        </w:rPr>
+        <w:instrText xml:space="preserve"> REF _Ref202626547 \r \h </w:instrText>
+      </w:r>
+      <w:r>
+        <w:rPr>
+          <w:color w:val="000000" w:themeColor="text1"/>
+          <w:vertAlign w:val="superscript"/>
+        </w:rPr>
+      </w:r>
+      <w:r>
+        <w:rPr>
+          <w:color w:val="000000" w:themeColor="text1"/>
+          <w:vertAlign w:val="superscript"/>
+        </w:rPr>
+        <w:fldChar w:fldCharType="separate"/>
+      </w:r>
+      <w:r>
+        <w:rPr>
+          <w:color w:val="000000" w:themeColor="text1"/>
+          <w:vertAlign w:val="superscript"/>
+        </w:rPr>
+        <w:t>k</w:t>
+      </w:r>
+      <w:r>
+        <w:rPr>
+          <w:color w:val="000000" w:themeColor="text1"/>
+          <w:vertAlign w:val="superscript"/>
+        </w:rPr>
+        <w:fldChar w:fldCharType="end"/>
+      </w:r>
+      <w:r>
+        <w:rPr>
+          <w:color w:val="000000" w:themeColor="text1"/>
+        </w:rPr>
+        <w:t xml:space="preserve">, </w:t>
+      </w:r>
+      <w:r>
+        <w:rPr>
+          <w:color w:val="000000" w:themeColor="text1"/>
+        </w:rPr>
+        <w:t>Joshua D. Rabinowitz</w:t>
+      </w:r>
+      <w:r>
+        <w:rPr>
+          <w:color w:val="000000" w:themeColor="text1"/>
+          <w:vertAlign w:val="superscript"/>
+        </w:rPr>
+        <w:fldChar w:fldCharType="begin"/>
+      </w:r>
+      <w:r>
+        <w:rPr>
+          <w:color w:val="000000" w:themeColor="text1"/>
+          <w:vertAlign w:val="superscript"/>
+        </w:rPr>
+        <w:instrText xml:space="preserve"> REF _Ref196910598 \r \h </w:instrText>
+      </w:r>
+      <w:r>
+        <w:rPr>
+          <w:color w:val="000000" w:themeColor="text1"/>
+          <w:vertAlign w:val="superscript"/>
+        </w:rPr>
+      </w:r>
+      <w:r>
+        <w:rPr>
+          <w:color w:val="000000" w:themeColor="text1"/>
+          <w:vertAlign w:val="superscript"/>
+        </w:rPr>
+        <w:fldChar w:fldCharType="separate"/>
+      </w:r>
+      <w:r>
+        <w:rPr>
+          <w:color w:val="000000" w:themeColor="text1"/>
+          <w:vertAlign w:val="superscript"/>
+        </w:rPr>
+        <w:t>e</w:t>
+      </w:r>
+      <w:r>
+        <w:rPr>
+          <w:color w:val="000000" w:themeColor="text1"/>
+          <w:vertAlign w:val="superscript"/>
+        </w:rPr>
+        <w:fldChar w:fldCharType="end"/>
+      </w:r>
+      <w:r>
+        <w:rPr>
+          <w:color w:val="000000" w:themeColor="text1"/>
+          <w:vertAlign w:val="superscript"/>
+        </w:rPr>
+        <w:t>,</w:t>
+      </w:r>
+      <w:r>
+        <w:rPr>
+          <w:color w:val="000000" w:themeColor="text1"/>
+          <w:vertAlign w:val="superscript"/>
+        </w:rPr>
+        <w:fldChar w:fldCharType="begin"/>
+      </w:r>
+      <w:r>
+        <w:rPr>
+          <w:color w:val="000000" w:themeColor="text1"/>
+          <w:vertAlign w:val="superscript"/>
+        </w:rPr>
+        <w:instrText xml:space="preserve"> REF _Ref164264497 \r \h  \* MERGEFORMAT </w:instrText>
+      </w:r>
+      <w:r>
+        <w:rPr>
+          <w:color w:val="000000" w:themeColor="text1"/>
+          <w:vertAlign w:val="superscript"/>
+        </w:rPr>
+      </w:r>
+      <w:r>
+        <w:rPr>
+          <w:color w:val="000000" w:themeColor="text1"/>
+          <w:vertAlign w:val="superscript"/>
+        </w:rPr>
+        <w:fldChar w:fldCharType="separate"/>
+      </w:r>
+      <w:r>
+        <w:rPr>
+          <w:color w:val="000000" w:themeColor="text1"/>
+          <w:vertAlign w:val="superscript"/>
+        </w:rPr>
+        <w:t>f</w:t>
+      </w:r>
+      <w:r>
+        <w:rPr>
+          <w:color w:val="000000" w:themeColor="text1"/>
+          <w:vertAlign w:val="superscript"/>
+        </w:rPr>
+        <w:fldChar w:fldCharType="end"/>
+      </w:r>
+      <w:r>
+        <w:rPr>
+          <w:color w:val="000000" w:themeColor="text1"/>
+          <w:vertAlign w:val="superscript"/>
+        </w:rPr>
+        <w:t>,</w:t>
+      </w:r>
+      <w:r>
+        <w:rPr>
+          <w:color w:val="000000" w:themeColor="text1"/>
+          <w:vertAlign w:val="superscript"/>
+        </w:rPr>
+        <w:fldChar w:fldCharType="begin"/>
+      </w:r>
+      <w:r>
+        <w:rPr>
+          <w:color w:val="000000" w:themeColor="text1"/>
+          <w:vertAlign w:val="superscript"/>
+        </w:rPr>
+        <w:instrText xml:space="preserve"> REF _Ref164264527 \r \h </w:instrText>
+      </w:r>
+      <w:r>
+        <w:rPr>
+          <w:color w:val="000000" w:themeColor="text1"/>
+          <w:vertAlign w:val="superscript"/>
+        </w:rPr>
+      </w:r>
+      <w:r>
+        <w:rPr>
+          <w:color w:val="000000" w:themeColor="text1"/>
+          <w:vertAlign w:val="superscript"/>
+        </w:rPr>
+        <w:fldChar w:fldCharType="separate"/>
+      </w:r>
+      <w:r>
+        <w:rPr>
+          <w:color w:val="000000" w:themeColor="text1"/>
+          <w:vertAlign w:val="superscript"/>
+        </w:rPr>
+        <w:t>g</w:t>
+      </w:r>
+      <w:r>
+        <w:rPr>
+          <w:color w:val="000000" w:themeColor="text1"/>
+          <w:vertAlign w:val="superscript"/>
+        </w:rPr>
+        <w:fldChar w:fldCharType="end"/>
+      </w:r>
+      <w:r>
+        <w:rPr>
+          <w:color w:val="000000" w:themeColor="text1"/>
+          <w:vertAlign w:val="superscript"/>
+        </w:rPr>
+        <w:t>,</w:t>
+      </w:r>
+      <w:r>
+        <w:rPr>
+          <w:color w:val="000000" w:themeColor="text1"/>
+          <w:vertAlign w:val="superscript"/>
+        </w:rPr>
+        <w:fldChar w:fldCharType="begin"/>
+      </w:r>
+      <w:r>
+        <w:rPr>
+          <w:color w:val="000000" w:themeColor="text1"/>
+          <w:vertAlign w:val="superscript"/>
+        </w:rPr>
+        <w:instrText xml:space="preserve"> REF _Ref164264552 \r \h </w:instrText>
+      </w:r>
+      <w:r>
+        <w:rPr>
+          <w:color w:val="000000" w:themeColor="text1"/>
+          <w:vertAlign w:val="superscript"/>
+        </w:rPr>
+      </w:r>
+      <w:r>
+        <w:rPr>
+          <w:color w:val="000000" w:themeColor="text1"/>
+          <w:vertAlign w:val="superscript"/>
+        </w:rPr>
+        <w:fldChar w:fldCharType="separate"/>
+      </w:r>
+      <w:r>
+        <w:rPr>
+          <w:color w:val="000000" w:themeColor="text1"/>
+          <w:vertAlign w:val="superscript"/>
+        </w:rPr>
+        <w:t>l</w:t>
+      </w:r>
+      <w:r>
+        <w:rPr>
+          <w:color w:val="000000" w:themeColor="text1"/>
+          <w:vertAlign w:val="superscript"/>
+        </w:rPr>
+        <w:fldChar w:fldCharType="end"/>
+      </w:r>
+      <w:r>
+        <w:rPr>
+          <w:color w:val="000000" w:themeColor="text1"/>
+        </w:rPr>
+        <w:t>, Costas D. Maranas</w:t>
+      </w:r>
+      <w:r>
+        <w:rPr>
+          <w:color w:val="000000" w:themeColor="text1"/>
+          <w:vertAlign w:val="superscript"/>
+        </w:rPr>
+        <w:fldChar w:fldCharType="begin"/>
+      </w:r>
+      <w:r>
+        <w:rPr>
+          <w:color w:val="000000" w:themeColor="text1"/>
+          <w:vertAlign w:val="superscript"/>
+        </w:rPr>
+        <w:instrText xml:space="preserve"> REF _Ref164264127 \r \h  \* MERGEFORMAT </w:instrText>
+      </w:r>
+      <w:r>
+        <w:rPr>
+          <w:color w:val="000000" w:themeColor="text1"/>
+          <w:vertAlign w:val="superscript"/>
+        </w:rPr>
+      </w:r>
+      <w:r>
+        <w:rPr>
+          <w:color w:val="000000" w:themeColor="text1"/>
+          <w:vertAlign w:val="superscript"/>
+        </w:rPr>
+        <w:fldChar w:fldCharType="separate"/>
+      </w:r>
+      <w:r>
+        <w:rPr>
+          <w:color w:val="000000" w:themeColor="text1"/>
+          <w:vertAlign w:val="superscript"/>
+        </w:rPr>
+        <w:t>b</w:t>
+      </w:r>
+      <w:r>
+        <w:rPr>
+          <w:color w:val="000000" w:themeColor="text1"/>
+          <w:vertAlign w:val="superscript"/>
+        </w:rPr>
+        <w:fldChar w:fldCharType="end"/>
+      </w:r>
+      <w:r>
+        <w:rPr>
+          <w:color w:val="000000" w:themeColor="text1"/>
+          <w:vertAlign w:val="superscript"/>
+        </w:rPr>
+        <w:t>,</w:t>
+      </w:r>
+      <w:r>
+        <w:rPr>
+          <w:color w:val="000000" w:themeColor="text1"/>
+        </w:rPr>
+        <w:fldChar w:fldCharType="begin"/>
+      </w:r>
+      <w:r>
+        <w:rPr>
+          <w:color w:val="000000" w:themeColor="text1"/>
+          <w:vertAlign w:val="superscript"/>
+        </w:rPr>
+        <w:instrText xml:space="preserve"> REF _Ref164264518 \r \h </w:instrText>
+      </w:r>
+      <w:r>
+        <w:rPr>
+          <w:color w:val="000000" w:themeColor="text1"/>
+        </w:rPr>
+      </w:r>
+      <w:r>
+        <w:rPr>
+          <w:color w:val="000000" w:themeColor="text1"/>
+        </w:rPr>
+        <w:fldChar w:fldCharType="separate"/>
+      </w:r>
+      <w:r>
+        <w:rPr>
+          <w:color w:val="000000" w:themeColor="text1"/>
+          <w:vertAlign w:val="superscript"/>
+        </w:rPr>
+        <w:t>c</w:t>
+      </w:r>
+      <w:r>
+        <w:rPr>
+          <w:color w:val="000000" w:themeColor="text1"/>
+        </w:rPr>
+        <w:fldChar w:fldCharType="end"/>
       </w:r>
       <w:r>
         <w:rPr>
@@ -488,21 +2154,7 @@
         <w:rPr>
           <w:color w:val="000000" w:themeColor="text1"/>
         </w:rPr>
-        <w:t xml:space="preserve">Brown University Department of </w:t>
-      </w:r>
-      <w:proofErr w:type="spellStart"/>
-      <w:r>
-        <w:rPr>
-          <w:color w:val="000000" w:themeColor="text1"/>
-        </w:rPr>
-        <w:t>Orthopaedic</w:t>
-      </w:r>
-      <w:proofErr w:type="spellEnd"/>
-      <w:r>
-        <w:rPr>
-          <w:color w:val="000000" w:themeColor="text1"/>
-        </w:rPr>
-        <w:t xml:space="preserve"> Surgery, Providence, RI</w:t>
+        <w:t>Brown University Department of Orthopaedic Surgery, Providence, RI</w:t>
       </w:r>
       <w:r>
         <w:rPr>
@@ -590,13 +2242,8 @@
         <w:t>Proteins translated by the mitoribosome</w:t>
       </w:r>
       <w:r>
-        <w:t xml:space="preserve"> in </w:t>
-      </w:r>
-      <w:proofErr w:type="spellStart"/>
-      <w:r>
-        <w:t>scRBA</w:t>
-      </w:r>
-      <w:proofErr w:type="spellEnd"/>
+        <w:t xml:space="preserve"> in scRBA</w:t>
+      </w:r>
     </w:p>
     <w:tbl>
       <w:tblPr>
@@ -1975,17 +3622,12 @@
           <w:numId w:val="2"/>
         </w:numPr>
       </w:pPr>
-      <w:proofErr w:type="spellStart"/>
       <w:r>
         <w:lastRenderedPageBreak/>
         <w:t>p</w:t>
       </w:r>
       <w:r>
-        <w:t>FBA</w:t>
-      </w:r>
-      <w:proofErr w:type="spellEnd"/>
-      <w:r>
-        <w:t xml:space="preserve"> formulation</w:t>
+        <w:t>FBA formulation</w:t>
       </w:r>
     </w:p>
     <w:p>
@@ -2829,25 +4471,7 @@
           <w:bCs/>
           <w:u w:val="none"/>
         </w:rPr>
-        <w:t xml:space="preserve">Identical to </w:t>
-      </w:r>
-      <w:proofErr w:type="spellStart"/>
-      <w:r>
-        <w:rPr>
-          <w:b w:val="0"/>
-          <w:bCs/>
-          <w:u w:val="none"/>
-        </w:rPr>
-        <w:t>scRBA’s</w:t>
-      </w:r>
-      <w:proofErr w:type="spellEnd"/>
-      <w:r>
-        <w:rPr>
-          <w:b w:val="0"/>
-          <w:bCs/>
-          <w:u w:val="none"/>
-        </w:rPr>
-        <w:t xml:space="preserve"> original version, aside from the last </w:t>
+        <w:t xml:space="preserve">Identical to scRBA’s original version, aside from the last </w:t>
       </w:r>
       <w:r>
         <w:rPr>
@@ -4459,7 +6083,6 @@
                   </w:rPr>
                   <m:t xml:space="preserve"> </m:t>
                 </m:r>
-                <w:proofErr w:type="spellStart"/>
                 <m:r>
                   <m:rPr>
                     <m:nor/>
@@ -4471,7 +6094,6 @@
                   </w:rPr>
                   <m:t>enz</m:t>
                 </m:r>
-                <w:proofErr w:type="spellEnd"/>
                 <m:r>
                   <w:rPr>
                     <w:rFonts w:ascii="Cambria Math" w:eastAsia="Cambria Math" w:hAnsi="Cambria Math" w:cs="Cambria Math"/>
@@ -5262,23 +6884,60 @@
       <w:r>
         <w:t xml:space="preserve">. Aside from extensive additions to annotations and other meta-data, key changes to the model are illustrated in </w:t>
       </w:r>
-      <w:r>
-        <w:fldChar w:fldCharType="begin"/>
-      </w:r>
-      <w:r>
-        <w:instrText xml:space="preserve"> REF _Ref163735251 \h  \* MERGEFORMAT </w:instrText>
-      </w:r>
-      <w:r>
-        <w:fldChar w:fldCharType="separate"/>
-      </w:r>
-      <w:r>
-        <w:t>Fig. 2</w:t>
-      </w:r>
-      <w:r>
-        <w:fldChar w:fldCharType="end"/>
-      </w:r>
-      <w:r>
-        <w:t xml:space="preserve"> and fall into 3 categories: reaction removals, additions, and modifications. Fatty acid degradation,</w:t>
+      <w:ins w:id="6" w:author="Mooney, Eric James" w:date="2025-09-24T14:42:00Z" w16du:dateUtc="2025-09-24T18:42:00Z">
+        <w:r>
+          <w:fldChar w:fldCharType="begin"/>
+        </w:r>
+        <w:r>
+          <w:instrText xml:space="preserve"> REF _Ref209617291 \h </w:instrText>
+        </w:r>
+      </w:ins>
+      <w:ins w:id="7" w:author="Mooney, Eric James" w:date="2025-09-24T14:42:00Z" w16du:dateUtc="2025-09-24T18:42:00Z">
+        <w:r>
+          <w:fldChar w:fldCharType="separate"/>
+        </w:r>
+        <w:r>
+          <w:t>Fig. S</w:t>
+        </w:r>
+        <w:r>
+          <w:rPr>
+            <w:noProof/>
+          </w:rPr>
+          <w:t>1</w:t>
+        </w:r>
+        <w:r>
+          <w:fldChar w:fldCharType="end"/>
+        </w:r>
+      </w:ins>
+      <w:del w:id="8" w:author="Mooney, Eric James" w:date="2025-09-24T14:41:00Z" w16du:dateUtc="2025-09-24T18:41:00Z">
+        <w:r>
+          <w:fldChar w:fldCharType="begin"/>
+        </w:r>
+        <w:r>
+          <w:delInstrText xml:space="preserve"> REF _Ref163735251 \h  \* MERGEFORMAT </w:delInstrText>
+        </w:r>
+        <w:r>
+          <w:fldChar w:fldCharType="separate"/>
+        </w:r>
+      </w:del>
+      <w:del w:id="9" w:author="Mooney, Eric James" w:date="2025-09-24T14:33:00Z" w16du:dateUtc="2025-09-24T18:33:00Z">
+        <w:r>
+          <w:delText>Fig. 2</w:delText>
+        </w:r>
+      </w:del>
+      <w:del w:id="10" w:author="Mooney, Eric James" w:date="2025-09-24T14:41:00Z" w16du:dateUtc="2025-09-24T18:41:00Z">
+        <w:r>
+          <w:fldChar w:fldCharType="end"/>
+        </w:r>
+        <w:r>
+          <w:delText xml:space="preserve"> </w:delText>
+        </w:r>
+      </w:del>
+      <w:r>
+        <w:t xml:space="preserve"> </w:t>
+      </w:r>
+      <w:r>
+        <w:t>and fall into 3 categories: reaction removals, additions, and modifications. Fatty acid degradation,</w:t>
       </w:r>
       <w:r>
         <w:t xml:space="preserve"> </w:t>
@@ -5377,23 +7036,7 @@
         <w:pStyle w:val="Normalfirstindented"/>
       </w:pPr>
       <w:r>
-        <w:t>The updated model better accounts for carbon flux apportioning. Five reactions (</w:t>
-      </w:r>
-      <w:proofErr w:type="spellStart"/>
-      <w:r>
-        <w:t>phosphoketolase</w:t>
-      </w:r>
-      <w:proofErr w:type="spellEnd"/>
-      <w:r>
-        <w:t xml:space="preserve">, 3-deoxy-D-arabino-heptulosonate 7-phosphate synthetase, </w:t>
-      </w:r>
-      <w:proofErr w:type="spellStart"/>
-      <w:r>
-        <w:t>xylulokinase</w:t>
-      </w:r>
-      <w:proofErr w:type="spellEnd"/>
-      <w:r>
-        <w:t>, xylose isomerase, NH</w:t>
+        <w:t>The updated model better accounts for carbon flux apportioning. Five reactions (phosphoketolase, 3-deoxy-D-arabino-heptulosonate 7-phosphate synthetase, xylulokinase, xylose isomerase, NH</w:t>
       </w:r>
       <w:r>
         <w:rPr>
@@ -5592,23 +7235,7 @@
         <w:pStyle w:val="Normalfirstindented"/>
       </w:pPr>
       <w:r>
-        <w:t xml:space="preserve">Furthermore, an updated version of </w:t>
-      </w:r>
-      <w:proofErr w:type="spellStart"/>
-      <w:r>
-        <w:t>yeastGEM_hvd</w:t>
-      </w:r>
-      <w:proofErr w:type="spellEnd"/>
-      <w:r>
-        <w:t xml:space="preserve"> was developed, to align it more with the reaction directionalities identified while developing </w:t>
-      </w:r>
-      <w:proofErr w:type="spellStart"/>
-      <w:r>
-        <w:t>scRBA</w:t>
-      </w:r>
-      <w:proofErr w:type="spellEnd"/>
-      <w:r>
-        <w:t xml:space="preserve">. </w:t>
+        <w:t xml:space="preserve">Furthermore, an updated version of yeastGEM_hvd was developed, to align it more with the reaction directionalities identified while developing scRBA. </w:t>
       </w:r>
       <w:r>
         <w:t>The updated GSM model is available at</w:t>
@@ -5625,15 +7252,7 @@
         </w:r>
       </w:hyperlink>
       <w:r>
-        <w:t xml:space="preserve">. </w:t>
-      </w:r>
-      <w:proofErr w:type="gramStart"/>
-      <w:r>
-        <w:t>The majority of</w:t>
-      </w:r>
-      <w:proofErr w:type="gramEnd"/>
-      <w:r>
-        <w:t xml:space="preserve"> these changes involve changing reaction reversibility. </w:t>
+        <w:t xml:space="preserve">. The majority of these changes involve changing reaction reversibility. </w:t>
       </w:r>
     </w:p>
     <w:p>
@@ -5702,24 +7321,76 @@
       <w:pPr>
         <w:pStyle w:val="Caption"/>
       </w:pPr>
-      <w:bookmarkStart w:id="6" w:name="_Ref163735251"/>
-      <w:bookmarkStart w:id="7" w:name="OLE_LINK1"/>
-      <w:r>
-        <w:t xml:space="preserve">Fig. </w:t>
-      </w:r>
-      <w:fldSimple w:instr=" SEQ Fig. \* ARABIC ">
+      <w:bookmarkStart w:id="11" w:name="_Ref209617291"/>
+      <w:bookmarkStart w:id="12" w:name="_Ref163735251"/>
+      <w:bookmarkStart w:id="13" w:name="OLE_LINK1"/>
+      <w:ins w:id="14" w:author="Mooney, Eric James" w:date="2025-09-24T14:40:00Z" w16du:dateUtc="2025-09-24T18:40:00Z">
+        <w:r>
+          <w:t>Fig. S</w:t>
+        </w:r>
+        <w:r>
+          <w:fldChar w:fldCharType="begin"/>
+        </w:r>
+        <w:r>
+          <w:instrText xml:space="preserve"> SEQ Fig._S \* ARABIC </w:instrText>
+        </w:r>
+      </w:ins>
+      <w:r>
+        <w:fldChar w:fldCharType="separate"/>
+      </w:r>
+      <w:ins w:id="15" w:author="Mooney, Eric James" w:date="2025-09-24T14:42:00Z" w16du:dateUtc="2025-09-24T18:42:00Z">
         <w:r>
           <w:rPr>
             <w:noProof/>
           </w:rPr>
           <w:t>1</w:t>
         </w:r>
-      </w:fldSimple>
-      <w:bookmarkEnd w:id="6"/>
-      <w:r>
-        <w:t xml:space="preserve">. Visual summary of </w:t>
-      </w:r>
-      <w:bookmarkEnd w:id="7"/>
+      </w:ins>
+      <w:ins w:id="16" w:author="Mooney, Eric James" w:date="2025-09-24T14:40:00Z" w16du:dateUtc="2025-09-24T18:40:00Z">
+        <w:r>
+          <w:fldChar w:fldCharType="end"/>
+        </w:r>
+      </w:ins>
+      <w:bookmarkEnd w:id="11"/>
+      <w:ins w:id="17" w:author="Mooney, Eric James" w:date="2025-09-24T14:42:00Z" w16du:dateUtc="2025-09-24T18:42:00Z">
+        <w:r>
+          <w:t>.</w:t>
+        </w:r>
+      </w:ins>
+      <w:del w:id="18" w:author="Mooney, Eric James" w:date="2025-09-24T14:40:00Z" w16du:dateUtc="2025-09-24T18:40:00Z">
+        <w:r>
+          <w:delText xml:space="preserve">Fig. </w:delText>
+        </w:r>
+        <w:r>
+          <w:fldChar w:fldCharType="begin"/>
+        </w:r>
+        <w:r>
+          <w:delInstrText xml:space="preserve"> SEQ Fig. \* ARABIC </w:delInstrText>
+        </w:r>
+        <w:r>
+          <w:fldChar w:fldCharType="separate"/>
+        </w:r>
+        <w:r>
+          <w:rPr>
+            <w:noProof/>
+          </w:rPr>
+          <w:delText>1</w:delText>
+        </w:r>
+        <w:r>
+          <w:rPr>
+            <w:noProof/>
+          </w:rPr>
+          <w:fldChar w:fldCharType="end"/>
+        </w:r>
+        <w:bookmarkEnd w:id="12"/>
+        <w:r>
+          <w:delText>.</w:delText>
+        </w:r>
+      </w:del>
+      <w:r>
+        <w:t xml:space="preserve"> Visual summary of </w:t>
+      </w:r>
+      <w:bookmarkEnd w:id="13"/>
       <w:r>
         <w:t xml:space="preserve">GSM model updates in an Escher map highlighting the major changes to metabolic pathways between </w:t>
       </w:r>
@@ -5744,30 +7415,9 @@
       <w:r>
         <w:t xml:space="preserve">1120. Dots represent metabolites and lines represent reactions. Reactions added are shown in green and removed in orange. Reactions with GPR, bounds, and/or stoichiometry updates are shown in purple. Specifically, G3PD1r_c and </w:t>
       </w:r>
-      <w:proofErr w:type="spellStart"/>
       <w:r>
         <w:lastRenderedPageBreak/>
-        <w:t>CITMALta_m</w:t>
-      </w:r>
-      <w:proofErr w:type="spellEnd"/>
-      <w:r>
-        <w:t xml:space="preserve"> were made reversible, G3PD1i_m is blocked to prevent a thermodynamically infeasible cycle with G3PD1r_c, and </w:t>
-      </w:r>
-      <w:proofErr w:type="spellStart"/>
-      <w:r>
-        <w:t>MTHFD_m</w:t>
-      </w:r>
-      <w:proofErr w:type="spellEnd"/>
-      <w:r>
-        <w:t xml:space="preserve"> has a new GPR description. </w:t>
-      </w:r>
-      <w:proofErr w:type="spellStart"/>
-      <w:r>
-        <w:t>ATPS_m</w:t>
-      </w:r>
-      <w:proofErr w:type="spellEnd"/>
-      <w:r>
-        <w:t xml:space="preserve"> is made irreversible with new protein names in its GPR as well as updated stoichiometry that matches its SC counterpart. Thicker lines denote reactions that were altered between the original </w:t>
+        <w:t xml:space="preserve">CITMALta_m were made reversible, G3PD1i_m is blocked to prevent a thermodynamically infeasible cycle with G3PD1r_c, and MTHFD_m has a new GPR description. ATPS_m is made irreversible with new protein names in its GPR as well as updated stoichiometry that matches its SC counterpart. Thicker lines denote reactions that were altered between the original </w:t>
       </w:r>
       <w:r>
         <w:rPr>
@@ -5796,7 +7446,20 @@
         <w:pStyle w:val="Normalfirstindented"/>
       </w:pPr>
       <w:r>
-        <w:t>Because the model content was updated, both GAM and NGAM were recalculated and increased to 187.141 mmol ATP gDW</w:t>
+        <w:t xml:space="preserve">Because the model content was updated, both GAM and NGAM were recalculated and increased to </w:t>
+      </w:r>
+      <w:del w:id="19" w:author="Mooney, Eric James" w:date="2025-10-01T13:38:00Z" w16du:dateUtc="2025-10-01T17:38:00Z">
+        <w:r>
+          <w:delText>187.141</w:delText>
+        </w:r>
+      </w:del>
+      <w:ins w:id="20" w:author="Mooney, Eric James" w:date="2025-10-01T13:38:00Z" w16du:dateUtc="2025-10-01T17:38:00Z">
+        <w:r>
+          <w:t>251.233</w:t>
+        </w:r>
+      </w:ins>
+      <w:r>
+        <w:t xml:space="preserve"> mmol ATP gDW</w:t>
       </w:r>
       <w:r>
         <w:rPr>
@@ -5805,7 +7468,23 @@
         <w:t xml:space="preserve">-1 </w:t>
       </w:r>
       <w:r>
-        <w:t>and 1.313 mmol ATP gDW</w:t>
+        <w:t>and 1.</w:t>
+      </w:r>
+      <w:del w:id="21" w:author="Mooney, Eric James" w:date="2025-10-01T13:38:00Z" w16du:dateUtc="2025-10-01T17:38:00Z">
+        <w:r>
+          <w:delText xml:space="preserve">313 </w:delText>
+        </w:r>
+      </w:del>
+      <w:ins w:id="22" w:author="Mooney, Eric James" w:date="2025-10-01T13:38:00Z" w16du:dateUtc="2025-10-01T17:38:00Z">
+        <w:r>
+          <w:t>259</w:t>
+        </w:r>
+        <w:r>
+          <w:t xml:space="preserve"> </w:t>
+        </w:r>
+      </w:ins>
+      <w:r>
+        <w:t>mmol ATP gDW</w:t>
       </w:r>
       <w:r>
         <w:rPr>
@@ -5853,7 +7532,40 @@
         <w:t>)</w:t>
       </w:r>
       <w:r>
-        <w:t xml:space="preserve"> (Fig. 2)</w:t>
+        <w:t xml:space="preserve"> (</w:t>
+      </w:r>
+      <w:ins w:id="23" w:author="Mooney, Eric James" w:date="2025-09-24T14:43:00Z" w16du:dateUtc="2025-09-24T18:43:00Z">
+        <w:r>
+          <w:fldChar w:fldCharType="begin"/>
+        </w:r>
+        <w:r>
+          <w:instrText xml:space="preserve"> REF _Ref209617404 \h </w:instrText>
+        </w:r>
+      </w:ins>
+      <w:ins w:id="24" w:author="Mooney, Eric James" w:date="2025-09-24T14:43:00Z" w16du:dateUtc="2025-09-24T18:43:00Z">
+        <w:r>
+          <w:fldChar w:fldCharType="separate"/>
+        </w:r>
+        <w:r>
+          <w:t>Fig. S</w:t>
+        </w:r>
+        <w:r>
+          <w:rPr>
+            <w:noProof/>
+          </w:rPr>
+          <w:t>2</w:t>
+        </w:r>
+        <w:r>
+          <w:fldChar w:fldCharType="end"/>
+        </w:r>
+      </w:ins>
+      <w:del w:id="25" w:author="Mooney, Eric James" w:date="2025-09-24T14:43:00Z" w16du:dateUtc="2025-09-24T18:43:00Z">
+        <w:r>
+          <w:delText>Fig. 2</w:delText>
+        </w:r>
+      </w:del>
+      <w:r>
+        <w:t>)</w:t>
       </w:r>
       <w:r>
         <w:t>. The predicted maximum growth rate (</w:t>
@@ -5980,26 +7692,59 @@
       <w:pPr>
         <w:pStyle w:val="Caption"/>
       </w:pPr>
-      <w:r>
-        <w:t xml:space="preserve">Fig. </w:t>
-      </w:r>
-      <w:r>
-        <w:fldChar w:fldCharType="begin"/>
-      </w:r>
-      <w:r>
-        <w:instrText xml:space="preserve"> SEQ Fig. \* ARABIC </w:instrText>
-      </w:r>
-      <w:r>
-        <w:fldChar w:fldCharType="separate"/>
-      </w:r>
-      <w:r>
-        <w:t>2</w:t>
-      </w:r>
-      <w:r>
-        <w:fldChar w:fldCharType="end"/>
-      </w:r>
-      <w:r>
-        <w:t xml:space="preserve">. Visual summary of ATP maintenance datasets from </w:t>
+      <w:bookmarkStart w:id="26" w:name="_Ref209617404"/>
+      <w:ins w:id="27" w:author="Mooney, Eric James" w:date="2025-09-24T14:42:00Z" w16du:dateUtc="2025-09-24T18:42:00Z">
+        <w:r>
+          <w:t>Fig. S</w:t>
+        </w:r>
+        <w:r>
+          <w:fldChar w:fldCharType="begin"/>
+        </w:r>
+        <w:r>
+          <w:instrText xml:space="preserve"> SEQ Fig._S \* ARABIC </w:instrText>
+        </w:r>
+        <w:r>
+          <w:fldChar w:fldCharType="separate"/>
+        </w:r>
+        <w:r>
+          <w:rPr>
+            <w:noProof/>
+          </w:rPr>
+          <w:t>2</w:t>
+        </w:r>
+        <w:r>
+          <w:fldChar w:fldCharType="end"/>
+        </w:r>
+        <w:bookmarkEnd w:id="26"/>
+        <w:r>
+          <w:t>.</w:t>
+        </w:r>
+      </w:ins>
+      <w:del w:id="28" w:author="Mooney, Eric James" w:date="2025-09-24T14:42:00Z" w16du:dateUtc="2025-09-24T18:42:00Z">
+        <w:r>
+          <w:delText xml:space="preserve">Fig. </w:delText>
+        </w:r>
+        <w:r>
+          <w:fldChar w:fldCharType="begin"/>
+        </w:r>
+        <w:r>
+          <w:delInstrText xml:space="preserve"> SEQ Fig. \* ARABIC </w:delInstrText>
+        </w:r>
+        <w:r>
+          <w:fldChar w:fldCharType="separate"/>
+        </w:r>
+        <w:r>
+          <w:delText>2</w:delText>
+        </w:r>
+        <w:r>
+          <w:fldChar w:fldCharType="end"/>
+        </w:r>
+        <w:r>
+          <w:delText>.</w:delText>
+        </w:r>
+      </w:del>
+      <w:r>
+        <w:t xml:space="preserve"> Visual summary of ATP maintenance datasets from </w:t>
       </w:r>
       <w:hyperlink w:anchor="_ENREF_39" w:tooltip="Shen, 2013 #197" w:history="1">
         <w:r>
@@ -6043,17 +7788,7 @@
           <w:szCs w:val="32"/>
           <w:u w:val="single"/>
         </w:rPr>
-        <w:t xml:space="preserve">Estimation of in vivo </w:t>
-      </w:r>
-      <w:proofErr w:type="spellStart"/>
-      <w:r>
-        <w:rPr>
-          <w:rFonts w:eastAsiaTheme="majorEastAsia" w:cstheme="majorBidi"/>
-          <w:b/>
-          <w:szCs w:val="32"/>
-          <w:u w:val="single"/>
-        </w:rPr>
-        <w:t>k</w:t>
+        <w:t>Estimation of in vivo k</w:t>
       </w:r>
       <w:r>
         <w:rPr>
@@ -6065,7 +7800,6 @@
         </w:rPr>
         <w:t>app</w:t>
       </w:r>
-      <w:proofErr w:type="spellEnd"/>
       <w:r>
         <w:rPr>
           <w:rFonts w:eastAsiaTheme="majorEastAsia" w:cstheme="majorBidi"/>
@@ -6081,11 +7815,8 @@
         <w:pStyle w:val="Normalfirstindented"/>
       </w:pPr>
       <w:r>
-        <w:t xml:space="preserve">When adapting the </w:t>
-      </w:r>
-      <w:proofErr w:type="spellStart"/>
-      <w:r>
-        <w:t>k</w:t>
+        <w:lastRenderedPageBreak/>
+        <w:t>When adapting the k</w:t>
       </w:r>
       <w:r>
         <w:rPr>
@@ -6093,17 +7824,8 @@
         </w:rPr>
         <w:t>app</w:t>
       </w:r>
-      <w:proofErr w:type="spellEnd"/>
-      <w:r>
-        <w:t xml:space="preserve"> procedure from </w:t>
-      </w:r>
-      <w:proofErr w:type="spellStart"/>
-      <w:r>
-        <w:t>scRBA</w:t>
-      </w:r>
-      <w:proofErr w:type="spellEnd"/>
-      <w:r>
-        <w:t xml:space="preserve"> to the proteomics data for RT, growth at the measured rate of 0.38 h</w:t>
+      <w:r>
+        <w:t xml:space="preserve"> procedure from scRBA to the proteomics data for RT, growth at the measured rate of 0.38 h</w:t>
       </w:r>
       <w:r>
         <w:rPr>
@@ -6112,11 +7834,7 @@
         <w:t>-1</w:t>
       </w:r>
       <w:r>
-        <w:t xml:space="preserve"> was initially infeasible when using the resulting </w:t>
-      </w:r>
-      <w:proofErr w:type="spellStart"/>
-      <w:r>
-        <w:t>k</w:t>
+        <w:t xml:space="preserve"> was initially infeasible when using the resulting k</w:t>
       </w:r>
       <w:r>
         <w:rPr>
@@ -6124,13 +7842,8 @@
         </w:rPr>
         <w:t>app</w:t>
       </w:r>
-      <w:proofErr w:type="spellEnd"/>
-      <w:r>
-        <w:t xml:space="preserve"> values. One potential </w:t>
-      </w:r>
-      <w:r>
-        <w:lastRenderedPageBreak/>
-        <w:t xml:space="preserve">reason is that B3 does not force </w:t>
+      <w:r>
+        <w:t xml:space="preserve"> values. One potential reason is that B3 does not force </w:t>
       </w:r>
       <m:oMath>
         <m:nary>
@@ -6661,7 +8374,7 @@
             <w:pPr>
               <w:pStyle w:val="Caption"/>
             </w:pPr>
-            <w:bookmarkStart w:id="8" w:name="_Ref167282872"/>
+            <w:bookmarkStart w:id="29" w:name="_Ref167282872"/>
             <w:r>
               <w:rPr>
                 <w:b/>
@@ -6674,7 +8387,7 @@
               </w:rPr>
               <w:t>Step B</w:t>
             </w:r>
-            <w:bookmarkEnd w:id="8"/>
+            <w:bookmarkEnd w:id="29"/>
             <w:r>
               <w:rPr>
                 <w:b/>
@@ -7274,11 +8987,11 @@
               <w:spacing w:line="240" w:lineRule="auto"/>
               <w:jc w:val="left"/>
             </w:pPr>
-            <w:bookmarkStart w:id="9" w:name="_Ref167363142"/>
+            <w:bookmarkStart w:id="30" w:name="_Ref167363142"/>
             <w:r>
               <w:t>Enforcing measured growth rate</w:t>
             </w:r>
-            <w:bookmarkEnd w:id="9"/>
+            <w:bookmarkEnd w:id="30"/>
           </w:p>
         </w:tc>
       </w:tr>
@@ -7526,11 +9239,11 @@
               <w:spacing w:line="240" w:lineRule="auto"/>
               <w:jc w:val="left"/>
             </w:pPr>
-            <w:bookmarkStart w:id="10" w:name="_Ref167363058"/>
+            <w:bookmarkStart w:id="31" w:name="_Ref167363058"/>
             <w:r>
               <w:t>Enforcing measured protein translation rates</w:t>
             </w:r>
-            <w:bookmarkEnd w:id="10"/>
+            <w:bookmarkEnd w:id="31"/>
             <w:r>
               <w:t xml:space="preserve"> across all cellular compartments (i.e., </w:t>
             </w:r>
@@ -8357,7 +10070,7 @@
               <w:spacing w:line="240" w:lineRule="auto"/>
               <w:jc w:val="left"/>
             </w:pPr>
-            <w:bookmarkStart w:id="11" w:name="_Ref167363179"/>
+            <w:bookmarkStart w:id="32" w:name="_Ref167363179"/>
             <w:r>
               <w:t xml:space="preserve">Nonmetabolic protein (i.e., set </w:t>
             </w:r>
@@ -8398,7 +10111,7 @@
             <w:r>
               <w:t>) costs</w:t>
             </w:r>
-            <w:bookmarkEnd w:id="11"/>
+            <w:bookmarkEnd w:id="32"/>
           </w:p>
         </w:tc>
       </w:tr>
@@ -8417,6 +10130,7 @@
                   <w:rPr>
                     <w:rFonts w:ascii="Cambria Math" w:hAnsi="Cambria Math"/>
                   </w:rPr>
+                  <w:lastRenderedPageBreak/>
                   <m:t>∑</m:t>
                 </m:r>
                 <m:sSub>
@@ -8817,7 +10531,7 @@
               <w:pStyle w:val="Caption"/>
               <w:jc w:val="left"/>
             </w:pPr>
-            <w:bookmarkStart w:id="12" w:name="_Ref167283030"/>
+            <w:bookmarkStart w:id="33" w:name="_Ref167283030"/>
             <w:r>
               <w:rPr>
                 <w:b/>
@@ -8830,7 +10544,7 @@
               </w:rPr>
               <w:t>Step B</w:t>
             </w:r>
-            <w:bookmarkEnd w:id="12"/>
+            <w:bookmarkEnd w:id="33"/>
             <w:r>
               <w:rPr>
                 <w:b/>
@@ -9050,7 +10764,7 @@
               </w:numPr>
               <w:jc w:val="left"/>
             </w:pPr>
-            <w:bookmarkStart w:id="13" w:name="_Ref167363019"/>
+            <w:bookmarkStart w:id="34" w:name="_Ref167363019"/>
             <w:r>
               <w:t xml:space="preserve">Minimizing </w:t>
             </w:r>
@@ -9093,7 +10807,7 @@
             <w:r>
               <w:t xml:space="preserve"> use</w:t>
             </w:r>
-            <w:bookmarkEnd w:id="13"/>
+            <w:bookmarkEnd w:id="34"/>
           </w:p>
         </w:tc>
       </w:tr>
@@ -9317,7 +11031,7 @@
               </w:numPr>
               <w:jc w:val="left"/>
             </w:pPr>
-            <w:bookmarkStart w:id="14" w:name="_Ref193464736"/>
+            <w:bookmarkStart w:id="35" w:name="_Ref193464736"/>
             <w:r>
               <w:t xml:space="preserve">Blocking all non-essential reactions outside </w:t>
             </w:r>
@@ -9349,7 +11063,7 @@
                 </m:sup>
               </m:sSup>
             </m:oMath>
-            <w:bookmarkEnd w:id="14"/>
+            <w:bookmarkEnd w:id="35"/>
           </w:p>
         </w:tc>
       </w:tr>
@@ -9432,15 +11146,7 @@
         <w:pStyle w:val="Normalfirstindented"/>
       </w:pPr>
       <w:r>
-        <w:t xml:space="preserve">As in </w:t>
-      </w:r>
-      <w:proofErr w:type="spellStart"/>
-      <w:r>
-        <w:t>scRBA</w:t>
-      </w:r>
-      <w:proofErr w:type="spellEnd"/>
-      <w:r>
-        <w:t xml:space="preserve">, steady-state mass balance </w:t>
+        <w:t xml:space="preserve">As in scRBA, steady-state mass balance </w:t>
       </w:r>
       <w:r>
         <w:fldChar w:fldCharType="begin"/>
@@ -10256,15 +11962,7 @@
         <w:pStyle w:val="Normalfirstindented"/>
       </w:pPr>
       <w:r>
-        <w:t xml:space="preserve">Steps B2 and B3 are identical to their </w:t>
-      </w:r>
-      <w:proofErr w:type="spellStart"/>
-      <w:r>
-        <w:t>scRBA</w:t>
-      </w:r>
-      <w:proofErr w:type="spellEnd"/>
-      <w:r>
-        <w:t xml:space="preserve"> versions aside from </w:t>
+        <w:t xml:space="preserve">Steps B2 and B3 are identical to their scRBA versions aside from </w:t>
       </w:r>
       <w:r>
         <w:fldChar w:fldCharType="begin"/>
@@ -10300,23 +11998,11 @@
         <w:fldChar w:fldCharType="end"/>
       </w:r>
       <w:r>
-        <w:t xml:space="preserve">, which previously used to only assign proteins to one compartment chosen manually, despite some being able to form enzymes in multiple compartments (i.e., multi-compartment proteins). Also, </w:t>
-      </w:r>
-      <w:proofErr w:type="spellStart"/>
-      <w:r>
-        <w:t>scRBA</w:t>
-      </w:r>
-      <w:proofErr w:type="spellEnd"/>
-      <w:r>
-        <w:t xml:space="preserve"> did not originally force translation fluxes for ribosome subunits to match their experimental values. Adding this requirement made step B2 infeasible during testing because of insufficient ribosome </w:t>
+        <w:t xml:space="preserve">, which previously used to only assign proteins to one compartment chosen manually, despite some being able to form enzymes in multiple compartments (i.e., multi-compartment proteins). Also, scRBA </w:t>
       </w:r>
       <w:r>
         <w:lastRenderedPageBreak/>
-        <w:t xml:space="preserve">production, possibly due to other ribosome subunit paralogs being present but not measured and/or not listed in the model as subunits. To address this issue without using unrealistic </w:t>
-      </w:r>
-      <w:proofErr w:type="spellStart"/>
-      <w:r>
-        <w:t>k</w:t>
+        <w:t>did not originally force translation fluxes for ribosome subunits to match their experimental values. Adding this requirement made step B2 infeasible during testing because of insufficient ribosome production, possibly due to other ribosome subunit paralogs being present but not measured and/or not listed in the model as subunits. To address this issue without using unrealistic k</w:t>
       </w:r>
       <w:r>
         <w:rPr>
@@ -10324,7 +12010,6 @@
         </w:rPr>
         <w:t>ribo</w:t>
       </w:r>
-      <w:proofErr w:type="spellEnd"/>
       <w:r>
         <w:t xml:space="preserve"> values while minimizing deviations from measured translation fluxes, the non-negative slack variables </w:t>
       </w:r>
@@ -11357,7 +13042,6 @@
         <w:pStyle w:val="Normalfirstindented"/>
       </w:pPr>
       <w:r>
-        <w:lastRenderedPageBreak/>
         <w:t xml:space="preserve">When </w:t>
       </w:r>
       <w:r>
@@ -11762,7 +13446,7 @@
               </w:numPr>
               <w:jc w:val="left"/>
             </w:pPr>
-            <w:bookmarkStart w:id="15" w:name="_Ref193477226"/>
+            <w:bookmarkStart w:id="36" w:name="_Ref193477226"/>
             <w:r>
               <w:t xml:space="preserve">Enforcing recommended flux upper bounds for all reactions that have them (i.e., reactions in set </w:t>
             </w:r>
@@ -11832,7 +13516,7 @@
             <w:r>
               <w:t>)</w:t>
             </w:r>
-            <w:bookmarkEnd w:id="15"/>
+            <w:bookmarkEnd w:id="36"/>
           </w:p>
         </w:tc>
       </w:tr>
@@ -12155,7 +13839,7 @@
               </w:numPr>
               <w:jc w:val="left"/>
             </w:pPr>
-            <w:bookmarkStart w:id="16" w:name="_Ref193464790"/>
+            <w:bookmarkStart w:id="37" w:name="_Ref193464790"/>
             <w:r>
               <w:t xml:space="preserve">Enforcing recommended flux lower bounds for all reactions that have them (i.e., reactions in set </w:t>
             </w:r>
@@ -12217,7 +13901,7 @@
             <w:r>
               <w:t>)</w:t>
             </w:r>
-            <w:bookmarkEnd w:id="16"/>
+            <w:bookmarkEnd w:id="37"/>
           </w:p>
         </w:tc>
       </w:tr>
@@ -12399,19 +14083,7 @@
         <w:pStyle w:val="Normalfirstindented"/>
       </w:pPr>
       <w:r>
-        <w:t xml:space="preserve">Another limitation of </w:t>
-      </w:r>
-      <w:proofErr w:type="spellStart"/>
-      <w:r>
-        <w:t>scRBA’s</w:t>
-      </w:r>
-      <w:proofErr w:type="spellEnd"/>
-      <w:r>
-        <w:t xml:space="preserve"> </w:t>
-      </w:r>
-      <w:proofErr w:type="spellStart"/>
-      <w:r>
-        <w:t>k</w:t>
+        <w:t>Another limitation of scRBA’s k</w:t>
       </w:r>
       <w:r>
         <w:rPr>
@@ -12419,7 +14091,6 @@
         </w:rPr>
         <w:t>app</w:t>
       </w:r>
-      <w:proofErr w:type="spellEnd"/>
       <w:r>
         <w:t xml:space="preserve"> calculations is that they estimate each enzyme’s synthesis flux (</w:t>
       </w:r>
@@ -12695,11 +14366,11 @@
               </w:numPr>
               <w:jc w:val="left"/>
             </w:pPr>
-            <w:bookmarkStart w:id="17" w:name="_Ref168927334"/>
+            <w:bookmarkStart w:id="38" w:name="_Ref168927334"/>
             <w:r>
               <w:t>Estimating enzyme synthesis fluxes</w:t>
             </w:r>
-            <w:bookmarkEnd w:id="17"/>
+            <w:bookmarkEnd w:id="38"/>
           </w:p>
         </w:tc>
       </w:tr>
@@ -12868,15 +14539,11 @@
         <w:pStyle w:val="Normalfirstindented"/>
       </w:pPr>
       <w:r>
-        <w:t xml:space="preserve">To determine how proteins are apportioned amongst enzymes, we assume that cells aim to minimize production of unused proteins, since doing so would waste less resources crucial to the organism’s fitness. A similar assumption is also invoked when determining flux distributions in </w:t>
-      </w:r>
-      <w:proofErr w:type="spellStart"/>
-      <w:r>
-        <w:t>scRBA</w:t>
-      </w:r>
-      <w:proofErr w:type="spellEnd"/>
-      <w:r>
-        <w:t xml:space="preserve">, which minimizes the total protein capacity usage at each growth rate tested </w:t>
+        <w:t xml:space="preserve">To determine how proteins are apportioned amongst enzymes, we assume that cells aim to minimize production of unused proteins, since doing so would waste less resources crucial to the </w:t>
+      </w:r>
+      <w:r>
+        <w:lastRenderedPageBreak/>
+        <w:t xml:space="preserve">organism’s fitness. A similar assumption is also invoked when determining flux distributions in scRBA, which minimizes the total protein capacity usage at each growth rate tested </w:t>
       </w:r>
       <w:r>
         <w:fldChar w:fldCharType="begin">
@@ -12982,39 +14649,16 @@
         <w:rPr>
           <w:noProof/>
         </w:rPr>
-        <w:t xml:space="preserve">(Dinh and </w:t>
-      </w:r>
-      <w:r>
-        <w:rPr>
-          <w:noProof/>
-        </w:rPr>
-        <w:lastRenderedPageBreak/>
-        <w:t>Maranas, 2023)</w:t>
+        <w:t>(Dinh and Maranas, 2023)</w:t>
       </w:r>
       <w:r>
         <w:fldChar w:fldCharType="end"/>
       </w:r>
       <w:r>
-        <w:t xml:space="preserve">. </w:t>
-      </w:r>
-      <w:proofErr w:type="spellStart"/>
-      <w:r>
-        <w:t>rtRBA</w:t>
-      </w:r>
-      <w:proofErr w:type="spellEnd"/>
-      <w:r>
-        <w:t xml:space="preserve"> </w:t>
-      </w:r>
-      <w:r>
-        <w:t xml:space="preserve">and </w:t>
-      </w:r>
-      <w:proofErr w:type="spellStart"/>
-      <w:r>
-        <w:t>scRBA</w:t>
-      </w:r>
-      <w:proofErr w:type="spellEnd"/>
-      <w:r>
-        <w:t xml:space="preserve"> </w:t>
+        <w:t xml:space="preserve">. rtRBA </w:t>
+      </w:r>
+      <w:r>
+        <w:t xml:space="preserve">and scRBA </w:t>
       </w:r>
       <w:r>
         <w:t xml:space="preserve">only account for a protein’s usage in creating enzymes, ribosomes, and as a biomass component, though this </w:t>
@@ -13302,15 +14946,7 @@
         <w:t xml:space="preserve">(17) </w:t>
       </w:r>
       <w:r>
-        <w:t xml:space="preserve">results in mismatches between enzyme loads identified in prior steps and the reaction fluxes associated with subsequent steps. As in </w:t>
-      </w:r>
-      <w:proofErr w:type="spellStart"/>
-      <w:r>
-        <w:t>scRBA</w:t>
-      </w:r>
-      <w:proofErr w:type="spellEnd"/>
-      <w:r>
-        <w:t xml:space="preserve">, we use the median to approximate the </w:t>
+        <w:t xml:space="preserve">results in mismatches between enzyme loads identified in prior steps and the reaction fluxes associated with subsequent steps. As in scRBA, we use the median to approximate the </w:t>
       </w:r>
       <m:oMath>
         <m:sSub>
@@ -13906,6 +15542,7 @@
         <w:pStyle w:val="Normalfirstindented"/>
       </w:pPr>
       <w:r>
+        <w:lastRenderedPageBreak/>
         <w:t xml:space="preserve">We first minimize production of unused enzyme subunits, represented by the </w:t>
       </w:r>
       <w:r>
@@ -14564,7 +16201,6 @@
                   </w:rPr>
                   <m:t xml:space="preserve"> </m:t>
                 </m:r>
-                <w:proofErr w:type="spellStart"/>
                 <m:r>
                   <m:rPr>
                     <m:nor/>
@@ -14576,7 +16212,6 @@
                   </w:rPr>
                   <m:t>enz</m:t>
                 </m:r>
-                <w:proofErr w:type="spellEnd"/>
                 <m:r>
                   <w:rPr>
                     <w:rFonts w:ascii="Cambria Math" w:eastAsia="Cambria Math" w:hAnsi="Cambria Math" w:cs="Cambria Math"/>
@@ -14687,7 +16322,7 @@
                 <w:bCs/>
               </w:rPr>
             </w:pPr>
-            <w:bookmarkStart w:id="18" w:name="_Ref193477207"/>
+            <w:bookmarkStart w:id="39" w:name="_Ref193477207"/>
             <w:r>
               <w:t xml:space="preserve">Slacks allowing deviation from the prototype </w:t>
             </w:r>
@@ -14722,7 +16357,7 @@
             <w:r>
               <w:t xml:space="preserve"> value for each used enzyme.</w:t>
             </w:r>
-            <w:bookmarkEnd w:id="18"/>
+            <w:bookmarkEnd w:id="39"/>
           </w:p>
         </w:tc>
       </w:tr>
@@ -14948,7 +16583,6 @@
                   </w:rPr>
                   <m:t xml:space="preserve"> </m:t>
                 </m:r>
-                <w:proofErr w:type="spellStart"/>
                 <m:r>
                   <m:rPr>
                     <m:nor/>
@@ -14960,7 +16594,6 @@
                   </w:rPr>
                   <m:t>enz</m:t>
                 </m:r>
-                <w:proofErr w:type="spellEnd"/>
                 <m:r>
                   <w:rPr>
                     <w:rFonts w:ascii="Cambria Math" w:hAnsi="Cambria Math"/>
@@ -15999,11 +17632,7 @@
         <w:t>the optimal objective values from B4 and B5.</w:t>
       </w:r>
       <w:r>
-        <w:t xml:space="preserve"> The resulting metabolic and enzyme synthesis fluxes were used to calculate </w:t>
-      </w:r>
-      <w:proofErr w:type="spellStart"/>
-      <w:r>
-        <w:t>k</w:t>
+        <w:t xml:space="preserve"> The resulting metabolic and enzyme synthesis fluxes were used to calculate k</w:t>
       </w:r>
       <w:r>
         <w:rPr>
@@ -16011,17 +17640,8 @@
         </w:rPr>
         <w:t>app</w:t>
       </w:r>
-      <w:proofErr w:type="spellEnd"/>
-      <w:r>
-        <w:t xml:space="preserve"> values. The method for doing so is largely identical to the one used in </w:t>
-      </w:r>
-      <w:proofErr w:type="spellStart"/>
-      <w:r>
-        <w:t>scRBA’s</w:t>
-      </w:r>
-      <w:proofErr w:type="spellEnd"/>
-      <w:r>
-        <w:t xml:space="preserve"> original release </w:t>
+      <w:r>
+        <w:t xml:space="preserve"> values. The method for doing so is largely identical to the one used in scRBA’s original release </w:t>
       </w:r>
       <w:r>
         <w:fldChar w:fldCharType="begin">
@@ -16209,11 +17829,7 @@
         <w:fldChar w:fldCharType="end"/>
       </w:r>
       <w:r>
-        <w:t xml:space="preserve">. However, in that release, the median </w:t>
-      </w:r>
-      <w:proofErr w:type="spellStart"/>
-      <w:r>
-        <w:t>k</w:t>
+        <w:t>. However, in that release, the median k</w:t>
       </w:r>
       <w:r>
         <w:rPr>
@@ -16221,9 +17837,12 @@
         </w:rPr>
         <w:t>app</w:t>
       </w:r>
-      <w:proofErr w:type="spellEnd"/>
-      <w:r>
-        <w:t xml:space="preserve"> value was assigned to any reactions with zero flux through either themselves or synthesis of their respective enzymes. This resulted in enzymes with measured subunits (i.e., in set </w:t>
+      <w:r>
+        <w:t xml:space="preserve"> </w:t>
+      </w:r>
+      <w:r>
+        <w:lastRenderedPageBreak/>
+        <w:t xml:space="preserve">value was assigned to any reactions with zero flux through either themselves or synthesis of their respective enzymes. This resulted in enzymes with measured subunits (i.e., in set </w:t>
       </w:r>
       <m:oMath>
         <m:r>
@@ -16269,11 +17888,7 @@
         <w:t>app</w:t>
       </w:r>
       <w:r>
-        <w:t xml:space="preserve"> values than isozymes without them when the former had </w:t>
-      </w:r>
-      <w:proofErr w:type="spellStart"/>
-      <w:r>
-        <w:t>k</w:t>
+        <w:t xml:space="preserve"> values than isozymes without them when the former had k</w:t>
       </w:r>
       <w:r>
         <w:rPr>
@@ -16281,13 +17896,8 @@
         </w:rPr>
         <w:t>app</w:t>
       </w:r>
-      <w:proofErr w:type="spellEnd"/>
-      <w:r>
-        <w:t xml:space="preserve"> values below the median, </w:t>
-      </w:r>
-      <w:r>
-        <w:lastRenderedPageBreak/>
-        <w:t>encouraging the model to rely less on enzymes using measured proteins. To reduce this risk, if an enzyme has isozymes in set</w:t>
+      <w:r>
+        <w:t xml:space="preserve"> values below the median, encouraging the model to rely less on enzymes using measured proteins. To reduce this risk, if an enzyme has isozymes in set</w:t>
       </w:r>
       <m:oMath>
         <m:r>
@@ -16410,11 +18020,7 @@
         <w:t>app</w:t>
       </w:r>
       <w:r>
-        <w:t xml:space="preserve"> is assigned to the lowest </w:t>
-      </w:r>
-      <w:proofErr w:type="spellStart"/>
-      <w:r>
-        <w:t>k</w:t>
+        <w:t xml:space="preserve"> is assigned to the lowest k</w:t>
       </w:r>
       <w:r>
         <w:rPr>
@@ -16422,13 +18028,8 @@
         </w:rPr>
         <w:t>app</w:t>
       </w:r>
-      <w:proofErr w:type="spellEnd"/>
-      <w:r>
-        <w:t xml:space="preserve"> among them or the median </w:t>
-      </w:r>
-      <w:proofErr w:type="spellStart"/>
-      <w:r>
-        <w:t>k</w:t>
+      <w:r>
+        <w:t xml:space="preserve"> among them or the median k</w:t>
       </w:r>
       <w:r>
         <w:rPr>
@@ -16436,7 +18037,6 @@
         </w:rPr>
         <w:t>app</w:t>
       </w:r>
-      <w:proofErr w:type="spellEnd"/>
       <w:r>
         <w:t>, whichever is lower.</w:t>
       </w:r>
@@ -19517,11 +21117,11 @@
   <w:abstractNum w:abstractNumId="31" w15:restartNumberingAfterBreak="0">
     <w:nsid w:val="766E2432"/>
     <w:multiLevelType w:val="hybridMultilevel"/>
-    <w:tmpl w:val="25E41844"/>
-    <w:lvl w:ilvl="0" w:tplc="E48455C2">
-      <w:start w:val="1"/>
-      <w:numFmt w:val="decimal"/>
-      <w:lvlText w:val="(%1)"/>
+    <w:tmpl w:val="DD72E938"/>
+    <w:lvl w:ilvl="0" w:tplc="04090019">
+      <w:start w:val="1"/>
+      <w:numFmt w:val="lowerLetter"/>
+      <w:lvlText w:val="%1."/>
       <w:lvlJc w:val="left"/>
       <w:pPr>
         <w:ind w:left="360" w:hanging="360"/>
@@ -19760,6 +21360,14 @@
     <w:abstractNumId w:val="15"/>
   </w:num>
 </w:numbering>
+</file>
+
+<file path=word/people.xml><?xml version="1.0" encoding="utf-8"?>
+<w15:people xmlns:wpc="http://schemas.microsoft.com/office/word/2010/wordprocessingCanvas" xmlns:cx="http://schemas.microsoft.com/office/drawing/2014/chartex" xmlns:cx1="http://schemas.microsoft.com/office/drawing/2015/9/8/chartex" xmlns:cx2="http://schemas.microsoft.com/office/drawing/2015/10/21/chartex" xmlns:cx3="http://schemas.microsoft.com/office/drawing/2016/5/9/chartex" xmlns:cx4="http://schemas.microsoft.com/office/drawing/2016/5/10/chartex" xmlns:cx5="http://schemas.microsoft.com/office/drawing/2016/5/11/chartex" xmlns:cx6="http://schemas.microsoft.com/office/drawing/2016/5/12/chartex" xmlns:cx7="http://schemas.microsoft.com/office/drawing/2016/5/13/chartex" xmlns:cx8="http://schemas.microsoft.com/office/drawing/2016/5/14/chartex" xmlns:mc="http://schemas.openxmlformats.org/markup-compatibility/2006" xmlns:aink="http://schemas.microsoft.com/office/drawing/2016/ink" xmlns:am3d="http://schemas.microsoft.com/office/drawing/2017/model3d" xmlns:o="urn:schemas-microsoft-com:office:office" xmlns:oel="http://schemas.microsoft.com/office/2019/extlst" xmlns:r="http://schemas.openxmlformats.org/officeDocument/2006/relationships" xmlns:m="http://schemas.openxmlformats.org/officeDocument/2006/math" xmlns:v="urn:schemas-microsoft-com:vml" xmlns:wp14="http://schemas.microsoft.com/office/word/2010/wordprocessingDrawing" xmlns:wp="http://schemas.openxmlformats.org/drawingml/2006/wordprocessingDrawing" xmlns:w10="urn:schemas-microsoft-com:office:word" xmlns:w="http://schemas.openxmlformats.org/wordprocessingml/2006/main" xmlns:w14="http://schemas.microsoft.com/office/word/2010/wordml" xmlns:w15="http://schemas.microsoft.com/office/word/2012/wordml" xmlns:w16cex="http://schemas.microsoft.com/office/word/2018/wordml/cex" xmlns:w16cid="http://schemas.microsoft.com/office/word/2016/wordml/cid" xmlns:w16="http://schemas.microsoft.com/office/word/2018/wordml" xmlns:w16du="http://schemas.microsoft.com/office/word/2023/wordml/word16du" xmlns:w16sdtdh="http://schemas.microsoft.com/office/word/2020/wordml/sdtdatahash" xmlns:w16sdtfl="http://schemas.microsoft.com/office/word/2024/wordml/sdtformatlock" xmlns:w16se="http://schemas.microsoft.com/office/word/2015/wordml/symex" xmlns:wpg="http://schemas.microsoft.com/office/word/2010/wordprocessingGroup" xmlns:wpi="http://schemas.microsoft.com/office/word/2010/wordprocessingInk" xmlns:wne="http://schemas.microsoft.com/office/word/2006/wordml" xmlns:wps="http://schemas.microsoft.com/office/word/2010/wordprocessingShape" mc:Ignorable="w14 w15 w16se w16cid w16 w16cex w16sdtdh w16sdtfl w16du wp14">
+  <w15:person w15:author="Mooney, Eric James">
+    <w15:presenceInfo w15:providerId="AD" w15:userId="S::ejm6426@psu.edu::459e8eda-b576-4c3c-9900-d76ade15b4ba"/>
+  </w15:person>
+</w15:people>
 </file>
 
 <file path=word/styles.xml><?xml version="1.0" encoding="utf-8"?>

</xml_diff>

<commit_message>
supp files updated to match paper
</commit_message>
<xml_diff>
--- a/suppMat/suppText1_rtRBA.docx
+++ b/suppMat/suppText1_rtRBA.docx
@@ -66,1879 +66,317 @@
         <w:rPr>
           <w:color w:val="000000" w:themeColor="text1"/>
         </w:rPr>
-        <w:t>Eric J. Mooney</w:t>
+        <w:t xml:space="preserve">Eric J. </w:t>
+      </w:r>
+      <w:proofErr w:type="spellStart"/>
+      <w:r>
+        <w:rPr>
+          <w:color w:val="000000" w:themeColor="text1"/>
+        </w:rPr>
+        <w:t>Mooney</w:t>
       </w:r>
       <w:r>
         <w:rPr>
           <w:color w:val="000000" w:themeColor="text1"/>
           <w:vertAlign w:val="superscript"/>
         </w:rPr>
-        <w:fldChar w:fldCharType="begin"/>
+        <w:t>a,b</w:t>
+      </w:r>
+      <w:proofErr w:type="spellEnd"/>
+      <w:r>
+        <w:rPr>
+          <w:color w:val="000000" w:themeColor="text1"/>
+        </w:rPr>
+        <w:t xml:space="preserve">, Patrick F. </w:t>
+      </w:r>
+      <w:proofErr w:type="spellStart"/>
+      <w:r>
+        <w:rPr>
+          <w:color w:val="000000" w:themeColor="text1"/>
+        </w:rPr>
+        <w:t>Suthers</w:t>
       </w:r>
       <w:r>
         <w:rPr>
           <w:color w:val="000000" w:themeColor="text1"/>
           <w:vertAlign w:val="superscript"/>
         </w:rPr>
-        <w:instrText xml:space="preserve"> REF _Ref164264179 \r \h  \* MERGEFORMAT </w:instrText>
+        <w:t>b,c</w:t>
+      </w:r>
+      <w:proofErr w:type="spellEnd"/>
+      <w:r>
+        <w:rPr>
+          <w:color w:val="000000" w:themeColor="text1"/>
+        </w:rPr>
+        <w:t xml:space="preserve">, Wheaton L. </w:t>
+      </w:r>
+      <w:proofErr w:type="spellStart"/>
+      <w:r>
+        <w:rPr>
+          <w:color w:val="000000" w:themeColor="text1"/>
+        </w:rPr>
+        <w:t>Schroeder</w:t>
       </w:r>
       <w:r>
         <w:rPr>
           <w:color w:val="000000" w:themeColor="text1"/>
           <w:vertAlign w:val="superscript"/>
         </w:rPr>
+        <w:t>c,d</w:t>
+      </w:r>
+      <w:proofErr w:type="spellEnd"/>
+      <w:r>
+        <w:rPr>
+          <w:color w:val="000000" w:themeColor="text1"/>
+        </w:rPr>
+        <w:t xml:space="preserve">, Hoang V. </w:t>
+      </w:r>
+      <w:proofErr w:type="spellStart"/>
+      <w:r>
+        <w:rPr>
+          <w:color w:val="000000" w:themeColor="text1"/>
+        </w:rPr>
+        <w:t>Dinh</w:t>
       </w:r>
       <w:r>
         <w:rPr>
           <w:color w:val="000000" w:themeColor="text1"/>
           <w:vertAlign w:val="superscript"/>
         </w:rPr>
-        <w:fldChar w:fldCharType="separate"/>
+        <w:t>b,c</w:t>
+      </w:r>
+      <w:proofErr w:type="spellEnd"/>
+      <w:r>
+        <w:rPr>
+          <w:color w:val="000000" w:themeColor="text1"/>
+        </w:rPr>
+        <w:t xml:space="preserve">, Xi </w:t>
+      </w:r>
+      <w:proofErr w:type="spellStart"/>
+      <w:r>
+        <w:rPr>
+          <w:color w:val="000000" w:themeColor="text1"/>
+        </w:rPr>
+        <w:t>Li</w:t>
       </w:r>
       <w:r>
         <w:rPr>
           <w:color w:val="000000" w:themeColor="text1"/>
           <w:vertAlign w:val="superscript"/>
         </w:rPr>
-        <w:t>a</w:t>
+        <w:t>e,f,g</w:t>
+      </w:r>
+      <w:proofErr w:type="spellEnd"/>
+      <w:r>
+        <w:rPr>
+          <w:color w:val="000000" w:themeColor="text1"/>
+        </w:rPr>
+        <w:t xml:space="preserve">, Yihui </w:t>
+      </w:r>
+      <w:proofErr w:type="spellStart"/>
+      <w:r>
+        <w:rPr>
+          <w:color w:val="000000" w:themeColor="text1"/>
+        </w:rPr>
+        <w:t>Shen</w:t>
       </w:r>
       <w:r>
         <w:rPr>
           <w:color w:val="000000" w:themeColor="text1"/>
           <w:vertAlign w:val="superscript"/>
         </w:rPr>
-        <w:fldChar w:fldCharType="end"/>
+        <w:t>f,g,i</w:t>
+      </w:r>
+      <w:proofErr w:type="spellEnd"/>
+      <w:r>
+        <w:rPr>
+          <w:color w:val="000000" w:themeColor="text1"/>
+        </w:rPr>
+        <w:t xml:space="preserve">, Tianxia </w:t>
+      </w:r>
+      <w:proofErr w:type="spellStart"/>
+      <w:r>
+        <w:rPr>
+          <w:color w:val="000000" w:themeColor="text1"/>
+        </w:rPr>
+        <w:t>Xiao</w:t>
       </w:r>
       <w:r>
         <w:rPr>
           <w:color w:val="000000" w:themeColor="text1"/>
           <w:vertAlign w:val="superscript"/>
         </w:rPr>
-        <w:t>,</w:t>
+        <w:t>f,g,h</w:t>
+      </w:r>
+      <w:proofErr w:type="spellEnd"/>
+      <w:r>
+        <w:rPr>
+          <w:color w:val="000000" w:themeColor="text1"/>
+        </w:rPr>
+        <w:t xml:space="preserve">, Catherine M. </w:t>
+      </w:r>
+      <w:proofErr w:type="spellStart"/>
+      <w:r>
+        <w:rPr>
+          <w:color w:val="000000" w:themeColor="text1"/>
+        </w:rPr>
+        <w:t>Call</w:t>
       </w:r>
       <w:r>
         <w:rPr>
           <w:color w:val="000000" w:themeColor="text1"/>
           <w:vertAlign w:val="superscript"/>
         </w:rPr>
-        <w:fldChar w:fldCharType="begin"/>
+        <w:t>f,g,j</w:t>
+      </w:r>
+      <w:proofErr w:type="spellEnd"/>
+      <w:r>
+        <w:rPr>
+          <w:color w:val="000000" w:themeColor="text1"/>
+        </w:rPr>
+        <w:t xml:space="preserve">, Heide </w:t>
+      </w:r>
+      <w:proofErr w:type="spellStart"/>
+      <w:r>
+        <w:rPr>
+          <w:color w:val="000000" w:themeColor="text1"/>
+        </w:rPr>
+        <w:t>Baron</w:t>
       </w:r>
       <w:r>
         <w:rPr>
           <w:color w:val="000000" w:themeColor="text1"/>
           <w:vertAlign w:val="superscript"/>
         </w:rPr>
-        <w:instrText xml:space="preserve"> REF _Ref164264127 \r \h </w:instrText>
+        <w:t>f,g</w:t>
+      </w:r>
+      <w:proofErr w:type="spellEnd"/>
+      <w:r>
+        <w:rPr>
+          <w:color w:val="000000" w:themeColor="text1"/>
+        </w:rPr>
+        <w:t xml:space="preserve">, Arjuna M. </w:t>
+      </w:r>
+      <w:proofErr w:type="spellStart"/>
+      <w:r>
+        <w:rPr>
+          <w:color w:val="000000" w:themeColor="text1"/>
+        </w:rPr>
+        <w:t>Subramanian</w:t>
       </w:r>
       <w:r>
         <w:rPr>
           <w:color w:val="000000" w:themeColor="text1"/>
           <w:vertAlign w:val="superscript"/>
         </w:rPr>
+        <w:t>f,g</w:t>
+      </w:r>
+      <w:proofErr w:type="spellEnd"/>
+      <w:r>
+        <w:rPr>
+          <w:color w:val="000000" w:themeColor="text1"/>
+        </w:rPr>
+        <w:t xml:space="preserve">, Daniel R. </w:t>
+      </w:r>
+      <w:proofErr w:type="spellStart"/>
+      <w:r>
+        <w:rPr>
+          <w:color w:val="000000" w:themeColor="text1"/>
+        </w:rPr>
+        <w:t>Weilandt</w:t>
       </w:r>
       <w:r>
         <w:rPr>
           <w:color w:val="000000" w:themeColor="text1"/>
           <w:vertAlign w:val="superscript"/>
         </w:rPr>
-        <w:fldChar w:fldCharType="separate"/>
+        <w:t>e,f,g,l</w:t>
+      </w:r>
+      <w:proofErr w:type="spellEnd"/>
+      <w:r>
+        <w:rPr>
+          <w:color w:val="000000" w:themeColor="text1"/>
+        </w:rPr>
+        <w:t xml:space="preserve">, Felix C. </w:t>
+      </w:r>
+      <w:proofErr w:type="spellStart"/>
+      <w:r>
+        <w:rPr>
+          <w:color w:val="000000" w:themeColor="text1"/>
+        </w:rPr>
+        <w:t>Keber</w:t>
       </w:r>
       <w:r>
         <w:rPr>
           <w:color w:val="000000" w:themeColor="text1"/>
           <w:vertAlign w:val="superscript"/>
         </w:rPr>
-        <w:t>b</w:t>
+        <w:t>f,g</w:t>
+      </w:r>
+      <w:proofErr w:type="spellEnd"/>
+      <w:r>
+        <w:rPr>
+          <w:color w:val="000000" w:themeColor="text1"/>
+        </w:rPr>
+        <w:t xml:space="preserve">, Martin </w:t>
+      </w:r>
+      <w:proofErr w:type="spellStart"/>
+      <w:r>
+        <w:rPr>
+          <w:color w:val="000000" w:themeColor="text1"/>
+        </w:rPr>
+        <w:t>Wühr</w:t>
       </w:r>
       <w:r>
         <w:rPr>
           <w:color w:val="000000" w:themeColor="text1"/>
           <w:vertAlign w:val="superscript"/>
         </w:rPr>
-        <w:fldChar w:fldCharType="end"/>
-      </w:r>
+        <w:t>g,k</w:t>
+      </w:r>
+      <w:proofErr w:type="spellEnd"/>
       <w:r>
         <w:rPr>
           <w:color w:val="000000" w:themeColor="text1"/>
         </w:rPr>
-        <w:t>, Patrick F. Suthers</w:t>
+        <w:t xml:space="preserve">, Joshua D. </w:t>
+      </w:r>
+      <w:proofErr w:type="spellStart"/>
+      <w:r>
+        <w:rPr>
+          <w:color w:val="000000" w:themeColor="text1"/>
+        </w:rPr>
+        <w:t>Rabinowitz</w:t>
       </w:r>
       <w:r>
         <w:rPr>
           <w:color w:val="000000" w:themeColor="text1"/>
           <w:vertAlign w:val="superscript"/>
         </w:rPr>
-        <w:fldChar w:fldCharType="begin"/>
+        <w:t>e,f,g,l</w:t>
+      </w:r>
+      <w:proofErr w:type="spellEnd"/>
+      <w:r>
+        <w:rPr>
+          <w:color w:val="000000" w:themeColor="text1"/>
+        </w:rPr>
+        <w:t xml:space="preserve">, Costas D. </w:t>
+      </w:r>
+      <w:proofErr w:type="spellStart"/>
+      <w:r>
+        <w:rPr>
+          <w:color w:val="000000" w:themeColor="text1"/>
+        </w:rPr>
+        <w:t>Maranas</w:t>
       </w:r>
       <w:r>
         <w:rPr>
           <w:color w:val="000000" w:themeColor="text1"/>
           <w:vertAlign w:val="superscript"/>
         </w:rPr>
-        <w:instrText xml:space="preserve"> REF _Ref164264127 \r \h </w:instrText>
-      </w:r>
-      <w:r>
-        <w:rPr>
-          <w:color w:val="000000" w:themeColor="text1"/>
-          <w:vertAlign w:val="superscript"/>
-        </w:rPr>
-      </w:r>
-      <w:r>
-        <w:rPr>
-          <w:color w:val="000000" w:themeColor="text1"/>
-          <w:vertAlign w:val="superscript"/>
-        </w:rPr>
-        <w:fldChar w:fldCharType="separate"/>
-      </w:r>
-      <w:r>
-        <w:rPr>
-          <w:color w:val="000000" w:themeColor="text1"/>
-          <w:vertAlign w:val="superscript"/>
-        </w:rPr>
-        <w:t>b</w:t>
-      </w:r>
-      <w:r>
-        <w:rPr>
-          <w:color w:val="000000" w:themeColor="text1"/>
-          <w:vertAlign w:val="superscript"/>
-        </w:rPr>
-        <w:fldChar w:fldCharType="end"/>
-      </w:r>
-      <w:r>
-        <w:rPr>
-          <w:color w:val="000000" w:themeColor="text1"/>
-          <w:vertAlign w:val="superscript"/>
-        </w:rPr>
-        <w:t>,</w:t>
-      </w:r>
-      <w:r>
-        <w:rPr>
-          <w:color w:val="000000" w:themeColor="text1"/>
-        </w:rPr>
-        <w:fldChar w:fldCharType="begin"/>
-      </w:r>
-      <w:r>
-        <w:rPr>
-          <w:color w:val="000000" w:themeColor="text1"/>
-          <w:vertAlign w:val="superscript"/>
-        </w:rPr>
-        <w:instrText xml:space="preserve"> REF _Ref164264518 \r \h </w:instrText>
-      </w:r>
-      <w:r>
-        <w:rPr>
-          <w:color w:val="000000" w:themeColor="text1"/>
-        </w:rPr>
-      </w:r>
-      <w:r>
-        <w:rPr>
-          <w:color w:val="000000" w:themeColor="text1"/>
-        </w:rPr>
-        <w:fldChar w:fldCharType="separate"/>
-      </w:r>
-      <w:r>
-        <w:rPr>
-          <w:color w:val="000000" w:themeColor="text1"/>
-          <w:vertAlign w:val="superscript"/>
-        </w:rPr>
-        <w:t>c</w:t>
-      </w:r>
-      <w:r>
-        <w:rPr>
-          <w:color w:val="000000" w:themeColor="text1"/>
-        </w:rPr>
-        <w:fldChar w:fldCharType="end"/>
-      </w:r>
-      <w:r>
-        <w:rPr>
-          <w:color w:val="000000" w:themeColor="text1"/>
-        </w:rPr>
-        <w:t>, Wheaton L. Schroeder</w:t>
-      </w:r>
-      <w:r>
-        <w:rPr>
-          <w:color w:val="000000" w:themeColor="text1"/>
-        </w:rPr>
-        <w:fldChar w:fldCharType="begin"/>
-      </w:r>
-      <w:r>
-        <w:rPr>
-          <w:color w:val="000000" w:themeColor="text1"/>
-          <w:vertAlign w:val="superscript"/>
-        </w:rPr>
-        <w:instrText xml:space="preserve"> REF _Ref164264518 \r \h </w:instrText>
-      </w:r>
-      <w:r>
-        <w:rPr>
-          <w:color w:val="000000" w:themeColor="text1"/>
-        </w:rPr>
-      </w:r>
-      <w:r>
-        <w:rPr>
-          <w:color w:val="000000" w:themeColor="text1"/>
-        </w:rPr>
-        <w:fldChar w:fldCharType="separate"/>
-      </w:r>
-      <w:r>
-        <w:rPr>
-          <w:color w:val="000000" w:themeColor="text1"/>
-          <w:vertAlign w:val="superscript"/>
-        </w:rPr>
-        <w:t>c</w:t>
-      </w:r>
-      <w:r>
-        <w:rPr>
-          <w:color w:val="000000" w:themeColor="text1"/>
-        </w:rPr>
-        <w:fldChar w:fldCharType="end"/>
-      </w:r>
-      <w:r>
-        <w:rPr>
-          <w:color w:val="000000" w:themeColor="text1"/>
-          <w:vertAlign w:val="superscript"/>
-        </w:rPr>
-        <w:t>,</w:t>
-      </w:r>
-      <w:r>
-        <w:rPr>
-          <w:color w:val="000000" w:themeColor="text1"/>
-          <w:vertAlign w:val="superscript"/>
-        </w:rPr>
-        <w:fldChar w:fldCharType="begin"/>
-      </w:r>
-      <w:r>
-        <w:rPr>
-          <w:color w:val="000000" w:themeColor="text1"/>
-          <w:vertAlign w:val="superscript"/>
-        </w:rPr>
-        <w:instrText xml:space="preserve"> REF _Ref193295841 \r \h </w:instrText>
-      </w:r>
-      <w:r>
-        <w:rPr>
-          <w:color w:val="000000" w:themeColor="text1"/>
-          <w:vertAlign w:val="superscript"/>
-        </w:rPr>
-      </w:r>
-      <w:r>
-        <w:rPr>
-          <w:color w:val="000000" w:themeColor="text1"/>
-          <w:vertAlign w:val="superscript"/>
-        </w:rPr>
-        <w:fldChar w:fldCharType="separate"/>
-      </w:r>
-      <w:r>
-        <w:rPr>
-          <w:color w:val="000000" w:themeColor="text1"/>
-          <w:vertAlign w:val="superscript"/>
-        </w:rPr>
-        <w:t>d</w:t>
-      </w:r>
-      <w:r>
-        <w:rPr>
-          <w:color w:val="000000" w:themeColor="text1"/>
-          <w:vertAlign w:val="superscript"/>
-        </w:rPr>
-        <w:fldChar w:fldCharType="end"/>
-      </w:r>
-      <w:r>
-        <w:rPr>
-          <w:color w:val="000000" w:themeColor="text1"/>
-        </w:rPr>
-        <w:t>, Hoang V. Dinh</w:t>
-      </w:r>
-      <w:r>
-        <w:rPr>
-          <w:color w:val="000000" w:themeColor="text1"/>
-          <w:vertAlign w:val="superscript"/>
-        </w:rPr>
-        <w:fldChar w:fldCharType="begin"/>
-      </w:r>
-      <w:r>
-        <w:rPr>
-          <w:color w:val="000000" w:themeColor="text1"/>
-          <w:vertAlign w:val="superscript"/>
-        </w:rPr>
-        <w:instrText xml:space="preserve"> REF _Ref164264127 \r \h </w:instrText>
-      </w:r>
-      <w:r>
-        <w:rPr>
-          <w:color w:val="000000" w:themeColor="text1"/>
-          <w:vertAlign w:val="superscript"/>
-        </w:rPr>
-      </w:r>
-      <w:r>
-        <w:rPr>
-          <w:color w:val="000000" w:themeColor="text1"/>
-          <w:vertAlign w:val="superscript"/>
-        </w:rPr>
-        <w:fldChar w:fldCharType="separate"/>
-      </w:r>
-      <w:r>
-        <w:rPr>
-          <w:color w:val="000000" w:themeColor="text1"/>
-          <w:vertAlign w:val="superscript"/>
-        </w:rPr>
-        <w:t>b</w:t>
-      </w:r>
-      <w:r>
-        <w:rPr>
-          <w:color w:val="000000" w:themeColor="text1"/>
-          <w:vertAlign w:val="superscript"/>
-        </w:rPr>
-        <w:fldChar w:fldCharType="end"/>
-      </w:r>
-      <w:r>
-        <w:rPr>
-          <w:color w:val="000000" w:themeColor="text1"/>
-          <w:vertAlign w:val="superscript"/>
-        </w:rPr>
-        <w:t>,</w:t>
-      </w:r>
-      <w:r>
-        <w:rPr>
-          <w:color w:val="000000" w:themeColor="text1"/>
-        </w:rPr>
-        <w:fldChar w:fldCharType="begin"/>
-      </w:r>
-      <w:r>
-        <w:rPr>
-          <w:color w:val="000000" w:themeColor="text1"/>
-          <w:vertAlign w:val="superscript"/>
-        </w:rPr>
-        <w:instrText xml:space="preserve"> REF _Ref164264518 \r \h </w:instrText>
-      </w:r>
-      <w:r>
-        <w:rPr>
-          <w:color w:val="000000" w:themeColor="text1"/>
-        </w:rPr>
-      </w:r>
-      <w:r>
-        <w:rPr>
-          <w:color w:val="000000" w:themeColor="text1"/>
-        </w:rPr>
-        <w:fldChar w:fldCharType="separate"/>
-      </w:r>
-      <w:r>
-        <w:rPr>
-          <w:color w:val="000000" w:themeColor="text1"/>
-          <w:vertAlign w:val="superscript"/>
-        </w:rPr>
-        <w:t>c</w:t>
-      </w:r>
-      <w:r>
-        <w:rPr>
-          <w:color w:val="000000" w:themeColor="text1"/>
-        </w:rPr>
-        <w:fldChar w:fldCharType="end"/>
-      </w:r>
-      <w:r>
-        <w:rPr>
-          <w:color w:val="000000" w:themeColor="text1"/>
-        </w:rPr>
-        <w:t>, Xi Li</w:t>
-      </w:r>
-      <w:r>
-        <w:rPr>
-          <w:color w:val="000000" w:themeColor="text1"/>
-          <w:vertAlign w:val="superscript"/>
-        </w:rPr>
-        <w:fldChar w:fldCharType="begin"/>
-      </w:r>
-      <w:r>
-        <w:rPr>
-          <w:color w:val="000000" w:themeColor="text1"/>
-          <w:vertAlign w:val="superscript"/>
-        </w:rPr>
-        <w:instrText xml:space="preserve"> REF _Ref196910598 \r \h </w:instrText>
-      </w:r>
-      <w:r>
-        <w:rPr>
-          <w:color w:val="000000" w:themeColor="text1"/>
-          <w:vertAlign w:val="superscript"/>
-        </w:rPr>
-      </w:r>
-      <w:r>
-        <w:rPr>
-          <w:color w:val="000000" w:themeColor="text1"/>
-          <w:vertAlign w:val="superscript"/>
-        </w:rPr>
-        <w:fldChar w:fldCharType="separate"/>
-      </w:r>
-      <w:r>
-        <w:rPr>
-          <w:color w:val="000000" w:themeColor="text1"/>
-          <w:vertAlign w:val="superscript"/>
-        </w:rPr>
-        <w:t>e</w:t>
-      </w:r>
-      <w:r>
-        <w:rPr>
-          <w:color w:val="000000" w:themeColor="text1"/>
-          <w:vertAlign w:val="superscript"/>
-        </w:rPr>
-        <w:fldChar w:fldCharType="end"/>
-      </w:r>
-      <w:r>
-        <w:rPr>
-          <w:color w:val="000000" w:themeColor="text1"/>
-          <w:vertAlign w:val="superscript"/>
-        </w:rPr>
-        <w:t>,</w:t>
-      </w:r>
-      <w:r>
-        <w:rPr>
-          <w:color w:val="000000" w:themeColor="text1"/>
-          <w:vertAlign w:val="superscript"/>
-        </w:rPr>
-        <w:fldChar w:fldCharType="begin"/>
-      </w:r>
-      <w:r>
-        <w:rPr>
-          <w:color w:val="000000" w:themeColor="text1"/>
-          <w:vertAlign w:val="superscript"/>
-        </w:rPr>
-        <w:instrText xml:space="preserve"> REF _Ref164264497 \r \h  \* MERGEFORMAT </w:instrText>
-      </w:r>
-      <w:r>
-        <w:rPr>
-          <w:color w:val="000000" w:themeColor="text1"/>
-          <w:vertAlign w:val="superscript"/>
-        </w:rPr>
-      </w:r>
-      <w:r>
-        <w:rPr>
-          <w:color w:val="000000" w:themeColor="text1"/>
-          <w:vertAlign w:val="superscript"/>
-        </w:rPr>
-        <w:fldChar w:fldCharType="separate"/>
-      </w:r>
-      <w:r>
-        <w:rPr>
-          <w:color w:val="000000" w:themeColor="text1"/>
-          <w:vertAlign w:val="superscript"/>
-        </w:rPr>
-        <w:t>f</w:t>
-      </w:r>
-      <w:r>
-        <w:rPr>
-          <w:color w:val="000000" w:themeColor="text1"/>
-          <w:vertAlign w:val="superscript"/>
-        </w:rPr>
-        <w:fldChar w:fldCharType="end"/>
-      </w:r>
-      <w:r>
-        <w:rPr>
-          <w:color w:val="000000" w:themeColor="text1"/>
-          <w:vertAlign w:val="superscript"/>
-        </w:rPr>
-        <w:t>,</w:t>
-      </w:r>
-      <w:r>
-        <w:rPr>
-          <w:color w:val="000000" w:themeColor="text1"/>
-          <w:vertAlign w:val="superscript"/>
-        </w:rPr>
-        <w:fldChar w:fldCharType="begin"/>
-      </w:r>
-      <w:r>
-        <w:rPr>
-          <w:color w:val="000000" w:themeColor="text1"/>
-          <w:vertAlign w:val="superscript"/>
-        </w:rPr>
-        <w:instrText xml:space="preserve"> REF _Ref164264527 \r \h </w:instrText>
-      </w:r>
-      <w:r>
-        <w:rPr>
-          <w:color w:val="000000" w:themeColor="text1"/>
-          <w:vertAlign w:val="superscript"/>
-        </w:rPr>
-      </w:r>
-      <w:r>
-        <w:rPr>
-          <w:color w:val="000000" w:themeColor="text1"/>
-          <w:vertAlign w:val="superscript"/>
-        </w:rPr>
-        <w:fldChar w:fldCharType="separate"/>
-      </w:r>
-      <w:r>
-        <w:rPr>
-          <w:color w:val="000000" w:themeColor="text1"/>
-          <w:vertAlign w:val="superscript"/>
-        </w:rPr>
-        <w:t>g</w:t>
-      </w:r>
-      <w:r>
-        <w:rPr>
-          <w:color w:val="000000" w:themeColor="text1"/>
-          <w:vertAlign w:val="superscript"/>
-        </w:rPr>
-        <w:fldChar w:fldCharType="end"/>
-      </w:r>
-      <w:r>
-        <w:rPr>
-          <w:color w:val="000000" w:themeColor="text1"/>
-        </w:rPr>
-        <w:t>, Yihui Shen</w:t>
-      </w:r>
-      <w:r>
-        <w:rPr>
-          <w:color w:val="000000" w:themeColor="text1"/>
-          <w:vertAlign w:val="superscript"/>
-        </w:rPr>
-        <w:fldChar w:fldCharType="begin"/>
-      </w:r>
-      <w:r>
-        <w:rPr>
-          <w:color w:val="000000" w:themeColor="text1"/>
-          <w:vertAlign w:val="superscript"/>
-        </w:rPr>
-        <w:instrText xml:space="preserve"> REF _Ref164264497 \r \h  \* MERGEFORMAT </w:instrText>
-      </w:r>
-      <w:r>
-        <w:rPr>
-          <w:color w:val="000000" w:themeColor="text1"/>
-          <w:vertAlign w:val="superscript"/>
-        </w:rPr>
-      </w:r>
-      <w:r>
-        <w:rPr>
-          <w:color w:val="000000" w:themeColor="text1"/>
-          <w:vertAlign w:val="superscript"/>
-        </w:rPr>
-        <w:fldChar w:fldCharType="separate"/>
-      </w:r>
-      <w:r>
-        <w:rPr>
-          <w:color w:val="000000" w:themeColor="text1"/>
-          <w:vertAlign w:val="superscript"/>
-        </w:rPr>
-        <w:t>f</w:t>
-      </w:r>
-      <w:r>
-        <w:rPr>
-          <w:color w:val="000000" w:themeColor="text1"/>
-          <w:vertAlign w:val="superscript"/>
-        </w:rPr>
-        <w:fldChar w:fldCharType="end"/>
-      </w:r>
-      <w:r>
-        <w:rPr>
-          <w:color w:val="000000" w:themeColor="text1"/>
-          <w:vertAlign w:val="superscript"/>
-        </w:rPr>
-        <w:t>,</w:t>
-      </w:r>
-      <w:r>
-        <w:rPr>
-          <w:color w:val="000000" w:themeColor="text1"/>
-          <w:vertAlign w:val="superscript"/>
-        </w:rPr>
-        <w:fldChar w:fldCharType="begin"/>
-      </w:r>
-      <w:r>
-        <w:rPr>
-          <w:color w:val="000000" w:themeColor="text1"/>
-          <w:vertAlign w:val="superscript"/>
-        </w:rPr>
-        <w:instrText xml:space="preserve"> REF _Ref164264527 \r \h </w:instrText>
-      </w:r>
-      <w:r>
-        <w:rPr>
-          <w:color w:val="000000" w:themeColor="text1"/>
-          <w:vertAlign w:val="superscript"/>
-        </w:rPr>
-      </w:r>
-      <w:r>
-        <w:rPr>
-          <w:color w:val="000000" w:themeColor="text1"/>
-          <w:vertAlign w:val="superscript"/>
-        </w:rPr>
-        <w:fldChar w:fldCharType="separate"/>
-      </w:r>
-      <w:r>
-        <w:rPr>
-          <w:color w:val="000000" w:themeColor="text1"/>
-          <w:vertAlign w:val="superscript"/>
-        </w:rPr>
-        <w:t>g</w:t>
-      </w:r>
-      <w:r>
-        <w:rPr>
-          <w:color w:val="000000" w:themeColor="text1"/>
-          <w:vertAlign w:val="superscript"/>
-        </w:rPr>
-        <w:fldChar w:fldCharType="end"/>
-      </w:r>
-      <w:r>
-        <w:rPr>
-          <w:color w:val="000000" w:themeColor="text1"/>
-          <w:vertAlign w:val="superscript"/>
-        </w:rPr>
-        <w:t>,</w:t>
-      </w:r>
-      <w:r>
-        <w:rPr>
-          <w:color w:val="000000" w:themeColor="text1"/>
-          <w:vertAlign w:val="superscript"/>
-        </w:rPr>
-        <w:fldChar w:fldCharType="begin"/>
-      </w:r>
-      <w:r>
-        <w:rPr>
-          <w:color w:val="000000" w:themeColor="text1"/>
-          <w:vertAlign w:val="superscript"/>
-        </w:rPr>
-        <w:instrText xml:space="preserve"> REF _Ref164264742 \r \h </w:instrText>
-      </w:r>
-      <w:r>
-        <w:rPr>
-          <w:color w:val="000000" w:themeColor="text1"/>
-          <w:vertAlign w:val="superscript"/>
-        </w:rPr>
-      </w:r>
-      <w:r>
-        <w:rPr>
-          <w:color w:val="000000" w:themeColor="text1"/>
-          <w:vertAlign w:val="superscript"/>
-        </w:rPr>
-        <w:fldChar w:fldCharType="separate"/>
-      </w:r>
-      <w:r>
-        <w:rPr>
-          <w:color w:val="000000" w:themeColor="text1"/>
-          <w:vertAlign w:val="superscript"/>
-        </w:rPr>
-        <w:t>i</w:t>
-      </w:r>
-      <w:r>
-        <w:rPr>
-          <w:color w:val="000000" w:themeColor="text1"/>
-          <w:vertAlign w:val="superscript"/>
-        </w:rPr>
-        <w:fldChar w:fldCharType="end"/>
-      </w:r>
-      <w:r>
-        <w:rPr>
-          <w:color w:val="000000" w:themeColor="text1"/>
-        </w:rPr>
-        <w:t>, Tianxia Xiao</w:t>
-      </w:r>
-      <w:r>
-        <w:rPr>
-          <w:color w:val="000000" w:themeColor="text1"/>
-          <w:vertAlign w:val="superscript"/>
-        </w:rPr>
-        <w:fldChar w:fldCharType="begin"/>
-      </w:r>
-      <w:r>
-        <w:rPr>
-          <w:color w:val="000000" w:themeColor="text1"/>
-          <w:vertAlign w:val="superscript"/>
-        </w:rPr>
-        <w:instrText xml:space="preserve"> REF _Ref164264497 \r \h  \* MERGEFORMAT </w:instrText>
-      </w:r>
-      <w:r>
-        <w:rPr>
-          <w:color w:val="000000" w:themeColor="text1"/>
-          <w:vertAlign w:val="superscript"/>
-        </w:rPr>
-      </w:r>
-      <w:r>
-        <w:rPr>
-          <w:color w:val="000000" w:themeColor="text1"/>
-          <w:vertAlign w:val="superscript"/>
-        </w:rPr>
-        <w:fldChar w:fldCharType="separate"/>
-      </w:r>
-      <w:r>
-        <w:rPr>
-          <w:color w:val="000000" w:themeColor="text1"/>
-          <w:vertAlign w:val="superscript"/>
-        </w:rPr>
-        <w:t>f</w:t>
-      </w:r>
-      <w:r>
-        <w:rPr>
-          <w:color w:val="000000" w:themeColor="text1"/>
-          <w:vertAlign w:val="superscript"/>
-        </w:rPr>
-        <w:fldChar w:fldCharType="end"/>
-      </w:r>
-      <w:r>
-        <w:rPr>
-          <w:color w:val="000000" w:themeColor="text1"/>
-          <w:vertAlign w:val="superscript"/>
-        </w:rPr>
-        <w:t>,</w:t>
-      </w:r>
-      <w:r>
-        <w:rPr>
-          <w:color w:val="000000" w:themeColor="text1"/>
-          <w:vertAlign w:val="superscript"/>
-        </w:rPr>
-        <w:fldChar w:fldCharType="begin"/>
-      </w:r>
-      <w:r>
-        <w:rPr>
-          <w:color w:val="000000" w:themeColor="text1"/>
-          <w:vertAlign w:val="superscript"/>
-        </w:rPr>
-        <w:instrText xml:space="preserve"> REF _Ref164264527 \r \h </w:instrText>
-      </w:r>
-      <w:r>
-        <w:rPr>
-          <w:color w:val="000000" w:themeColor="text1"/>
-          <w:vertAlign w:val="superscript"/>
-        </w:rPr>
-      </w:r>
-      <w:r>
-        <w:rPr>
-          <w:color w:val="000000" w:themeColor="text1"/>
-          <w:vertAlign w:val="superscript"/>
-        </w:rPr>
-        <w:fldChar w:fldCharType="separate"/>
-      </w:r>
-      <w:r>
-        <w:rPr>
-          <w:color w:val="000000" w:themeColor="text1"/>
-          <w:vertAlign w:val="superscript"/>
-        </w:rPr>
-        <w:t>g</w:t>
-      </w:r>
-      <w:r>
-        <w:rPr>
-          <w:color w:val="000000" w:themeColor="text1"/>
-          <w:vertAlign w:val="superscript"/>
-        </w:rPr>
-        <w:fldChar w:fldCharType="end"/>
-      </w:r>
-      <w:r>
-        <w:rPr>
-          <w:color w:val="000000" w:themeColor="text1"/>
-          <w:vertAlign w:val="superscript"/>
-        </w:rPr>
-        <w:t>,</w:t>
-      </w:r>
-      <w:r>
-        <w:rPr>
-          <w:color w:val="000000" w:themeColor="text1"/>
-          <w:vertAlign w:val="superscript"/>
-        </w:rPr>
-        <w:fldChar w:fldCharType="begin"/>
-      </w:r>
-      <w:r>
-        <w:rPr>
-          <w:color w:val="000000" w:themeColor="text1"/>
-          <w:vertAlign w:val="superscript"/>
-        </w:rPr>
-        <w:instrText xml:space="preserve"> REF _Ref196743245 \r \h </w:instrText>
-      </w:r>
-      <w:r>
-        <w:rPr>
-          <w:color w:val="000000" w:themeColor="text1"/>
-          <w:vertAlign w:val="superscript"/>
-        </w:rPr>
-      </w:r>
-      <w:r>
-        <w:rPr>
-          <w:color w:val="000000" w:themeColor="text1"/>
-          <w:vertAlign w:val="superscript"/>
-        </w:rPr>
-        <w:fldChar w:fldCharType="separate"/>
-      </w:r>
-      <w:r>
-        <w:rPr>
-          <w:color w:val="000000" w:themeColor="text1"/>
-          <w:vertAlign w:val="superscript"/>
-        </w:rPr>
-        <w:t>h</w:t>
-      </w:r>
-      <w:r>
-        <w:rPr>
-          <w:color w:val="000000" w:themeColor="text1"/>
-          <w:vertAlign w:val="superscript"/>
-        </w:rPr>
-        <w:fldChar w:fldCharType="end"/>
-      </w:r>
-      <w:r>
-        <w:rPr>
-          <w:color w:val="000000" w:themeColor="text1"/>
-        </w:rPr>
-        <w:t xml:space="preserve">, </w:t>
-      </w:r>
-      <w:r>
-        <w:rPr>
-          <w:color w:val="000000" w:themeColor="text1"/>
-        </w:rPr>
-        <w:t>Catherine M. Call</w:t>
-      </w:r>
-      <w:r>
-        <w:rPr>
-          <w:color w:val="000000" w:themeColor="text1"/>
-          <w:vertAlign w:val="superscript"/>
-        </w:rPr>
-        <w:fldChar w:fldCharType="begin"/>
-      </w:r>
-      <w:r>
-        <w:rPr>
-          <w:color w:val="000000" w:themeColor="text1"/>
-          <w:vertAlign w:val="superscript"/>
-        </w:rPr>
-        <w:instrText xml:space="preserve"> REF _Ref164264497 \r \h </w:instrText>
-      </w:r>
-      <w:r>
-        <w:rPr>
-          <w:color w:val="000000" w:themeColor="text1"/>
-          <w:vertAlign w:val="superscript"/>
-        </w:rPr>
-        <w:instrText xml:space="preserve"> \* MERGEFORMAT </w:instrText>
-      </w:r>
-      <w:r>
-        <w:rPr>
-          <w:color w:val="000000" w:themeColor="text1"/>
-          <w:vertAlign w:val="superscript"/>
-        </w:rPr>
-      </w:r>
-      <w:r>
-        <w:rPr>
-          <w:color w:val="000000" w:themeColor="text1"/>
-          <w:vertAlign w:val="superscript"/>
-        </w:rPr>
-        <w:fldChar w:fldCharType="separate"/>
-      </w:r>
-      <w:r>
-        <w:rPr>
-          <w:color w:val="000000" w:themeColor="text1"/>
-          <w:vertAlign w:val="superscript"/>
-        </w:rPr>
-        <w:t>f</w:t>
-      </w:r>
-      <w:r>
-        <w:rPr>
-          <w:color w:val="000000" w:themeColor="text1"/>
-          <w:vertAlign w:val="superscript"/>
-        </w:rPr>
-        <w:fldChar w:fldCharType="end"/>
-      </w:r>
-      <w:r>
-        <w:rPr>
-          <w:color w:val="000000" w:themeColor="text1"/>
-          <w:vertAlign w:val="superscript"/>
-        </w:rPr>
-        <w:t>,</w:t>
-      </w:r>
-      <w:r>
-        <w:rPr>
-          <w:color w:val="000000" w:themeColor="text1"/>
-          <w:vertAlign w:val="superscript"/>
-        </w:rPr>
-        <w:fldChar w:fldCharType="begin"/>
-      </w:r>
-      <w:r>
-        <w:rPr>
-          <w:color w:val="000000" w:themeColor="text1"/>
-          <w:vertAlign w:val="superscript"/>
-        </w:rPr>
-        <w:instrText xml:space="preserve"> REF _Ref164264527 \r \h </w:instrText>
-      </w:r>
-      <w:r>
-        <w:rPr>
-          <w:color w:val="000000" w:themeColor="text1"/>
-          <w:vertAlign w:val="superscript"/>
-        </w:rPr>
-        <w:instrText xml:space="preserve"> \* MERGEFORMAT </w:instrText>
-      </w:r>
-      <w:r>
-        <w:rPr>
-          <w:color w:val="000000" w:themeColor="text1"/>
-          <w:vertAlign w:val="superscript"/>
-        </w:rPr>
-      </w:r>
-      <w:r>
-        <w:rPr>
-          <w:color w:val="000000" w:themeColor="text1"/>
-          <w:vertAlign w:val="superscript"/>
-        </w:rPr>
-        <w:fldChar w:fldCharType="separate"/>
-      </w:r>
-      <w:r>
-        <w:rPr>
-          <w:color w:val="000000" w:themeColor="text1"/>
-          <w:vertAlign w:val="superscript"/>
-        </w:rPr>
-        <w:t>g</w:t>
-      </w:r>
-      <w:r>
-        <w:rPr>
-          <w:color w:val="000000" w:themeColor="text1"/>
-          <w:vertAlign w:val="superscript"/>
-        </w:rPr>
-        <w:fldChar w:fldCharType="end"/>
-      </w:r>
-      <w:r>
-        <w:rPr>
-          <w:color w:val="000000" w:themeColor="text1"/>
-          <w:vertAlign w:val="superscript"/>
-        </w:rPr>
-        <w:t>,</w:t>
-      </w:r>
-      <w:r>
-        <w:rPr>
-          <w:color w:val="000000" w:themeColor="text1"/>
-          <w:vertAlign w:val="superscript"/>
-        </w:rPr>
-        <w:fldChar w:fldCharType="begin"/>
-      </w:r>
-      <w:r>
-        <w:rPr>
-          <w:color w:val="000000" w:themeColor="text1"/>
-          <w:vertAlign w:val="superscript"/>
-        </w:rPr>
-        <w:instrText xml:space="preserve"> REF _Ref203394791 \r \h </w:instrText>
-      </w:r>
-      <w:r>
-        <w:rPr>
-          <w:color w:val="000000" w:themeColor="text1"/>
-          <w:vertAlign w:val="superscript"/>
-        </w:rPr>
-      </w:r>
-      <w:r>
-        <w:rPr>
-          <w:color w:val="000000" w:themeColor="text1"/>
-          <w:vertAlign w:val="superscript"/>
-        </w:rPr>
-        <w:fldChar w:fldCharType="separate"/>
-      </w:r>
-      <w:r>
-        <w:rPr>
-          <w:color w:val="000000" w:themeColor="text1"/>
-          <w:vertAlign w:val="superscript"/>
-        </w:rPr>
-        <w:t>j</w:t>
-      </w:r>
-      <w:r>
-        <w:rPr>
-          <w:color w:val="000000" w:themeColor="text1"/>
-          <w:vertAlign w:val="superscript"/>
-        </w:rPr>
-        <w:fldChar w:fldCharType="end"/>
-      </w:r>
-      <w:r>
-        <w:rPr>
-          <w:color w:val="000000" w:themeColor="text1"/>
-        </w:rPr>
-        <w:t xml:space="preserve">, </w:t>
-      </w:r>
-      <w:r>
-        <w:rPr>
-          <w:color w:val="000000" w:themeColor="text1"/>
-        </w:rPr>
-        <w:t>Heide Baron</w:t>
-      </w:r>
-      <w:r>
-        <w:rPr>
-          <w:color w:val="000000" w:themeColor="text1"/>
-          <w:vertAlign w:val="superscript"/>
-        </w:rPr>
-        <w:fldChar w:fldCharType="begin"/>
-      </w:r>
-      <w:r>
-        <w:rPr>
-          <w:color w:val="000000" w:themeColor="text1"/>
-          <w:vertAlign w:val="superscript"/>
-        </w:rPr>
-        <w:instrText xml:space="preserve"> REF _Ref164264497 \r \h  \* MERGEFORMAT </w:instrText>
-      </w:r>
-      <w:r>
-        <w:rPr>
-          <w:color w:val="000000" w:themeColor="text1"/>
-          <w:vertAlign w:val="superscript"/>
-        </w:rPr>
-      </w:r>
-      <w:r>
-        <w:rPr>
-          <w:color w:val="000000" w:themeColor="text1"/>
-          <w:vertAlign w:val="superscript"/>
-        </w:rPr>
-        <w:fldChar w:fldCharType="separate"/>
-      </w:r>
-      <w:r>
-        <w:rPr>
-          <w:color w:val="000000" w:themeColor="text1"/>
-          <w:vertAlign w:val="superscript"/>
-        </w:rPr>
-        <w:t>f</w:t>
-      </w:r>
-      <w:r>
-        <w:rPr>
-          <w:color w:val="000000" w:themeColor="text1"/>
-          <w:vertAlign w:val="superscript"/>
-        </w:rPr>
-        <w:fldChar w:fldCharType="end"/>
-      </w:r>
-      <w:r>
-        <w:rPr>
-          <w:color w:val="000000" w:themeColor="text1"/>
-          <w:vertAlign w:val="superscript"/>
-        </w:rPr>
-        <w:t>,</w:t>
-      </w:r>
-      <w:r>
-        <w:rPr>
-          <w:color w:val="000000" w:themeColor="text1"/>
-          <w:vertAlign w:val="superscript"/>
-        </w:rPr>
-        <w:fldChar w:fldCharType="begin"/>
-      </w:r>
-      <w:r>
-        <w:rPr>
-          <w:color w:val="000000" w:themeColor="text1"/>
-          <w:vertAlign w:val="superscript"/>
-        </w:rPr>
-        <w:instrText xml:space="preserve"> REF _Ref164264527 \r \h </w:instrText>
-      </w:r>
-      <w:r>
-        <w:rPr>
-          <w:color w:val="000000" w:themeColor="text1"/>
-          <w:vertAlign w:val="superscript"/>
-        </w:rPr>
-        <w:instrText xml:space="preserve"> \* MERGEFORMAT </w:instrText>
-      </w:r>
-      <w:r>
-        <w:rPr>
-          <w:color w:val="000000" w:themeColor="text1"/>
-          <w:vertAlign w:val="superscript"/>
-        </w:rPr>
-      </w:r>
-      <w:r>
-        <w:rPr>
-          <w:color w:val="000000" w:themeColor="text1"/>
-          <w:vertAlign w:val="superscript"/>
-        </w:rPr>
-        <w:fldChar w:fldCharType="separate"/>
-      </w:r>
-      <w:r>
-        <w:rPr>
-          <w:color w:val="000000" w:themeColor="text1"/>
-          <w:vertAlign w:val="superscript"/>
-        </w:rPr>
-        <w:t>g</w:t>
-      </w:r>
-      <w:r>
-        <w:rPr>
-          <w:color w:val="000000" w:themeColor="text1"/>
-          <w:vertAlign w:val="superscript"/>
-        </w:rPr>
-        <w:fldChar w:fldCharType="end"/>
-      </w:r>
-      <w:r>
-        <w:rPr>
-          <w:color w:val="000000" w:themeColor="text1"/>
-        </w:rPr>
-        <w:t xml:space="preserve">, </w:t>
-      </w:r>
-      <w:r>
-        <w:rPr>
-          <w:color w:val="000000" w:themeColor="text1"/>
-        </w:rPr>
-        <w:t>Arjuna M. Subramanian</w:t>
-      </w:r>
-      <w:r>
-        <w:rPr>
-          <w:color w:val="000000" w:themeColor="text1"/>
-          <w:vertAlign w:val="superscript"/>
-        </w:rPr>
-        <w:fldChar w:fldCharType="begin"/>
-      </w:r>
-      <w:r>
-        <w:rPr>
-          <w:color w:val="000000" w:themeColor="text1"/>
-          <w:vertAlign w:val="superscript"/>
-        </w:rPr>
-        <w:instrText xml:space="preserve"> REF _Ref164264497 \r \h  \* MERGEFORMAT </w:instrText>
-      </w:r>
-      <w:r>
-        <w:rPr>
-          <w:color w:val="000000" w:themeColor="text1"/>
-          <w:vertAlign w:val="superscript"/>
-        </w:rPr>
-      </w:r>
-      <w:r>
-        <w:rPr>
-          <w:color w:val="000000" w:themeColor="text1"/>
-          <w:vertAlign w:val="superscript"/>
-        </w:rPr>
-        <w:fldChar w:fldCharType="separate"/>
-      </w:r>
-      <w:r>
-        <w:rPr>
-          <w:color w:val="000000" w:themeColor="text1"/>
-          <w:vertAlign w:val="superscript"/>
-        </w:rPr>
-        <w:t>f</w:t>
-      </w:r>
-      <w:r>
-        <w:rPr>
-          <w:color w:val="000000" w:themeColor="text1"/>
-          <w:vertAlign w:val="superscript"/>
-        </w:rPr>
-        <w:fldChar w:fldCharType="end"/>
-      </w:r>
-      <w:r>
-        <w:rPr>
-          <w:color w:val="000000" w:themeColor="text1"/>
-          <w:vertAlign w:val="superscript"/>
-        </w:rPr>
-        <w:t>,</w:t>
-      </w:r>
-      <w:r>
-        <w:rPr>
-          <w:color w:val="000000" w:themeColor="text1"/>
-          <w:vertAlign w:val="superscript"/>
-        </w:rPr>
-        <w:fldChar w:fldCharType="begin"/>
-      </w:r>
-      <w:r>
-        <w:rPr>
-          <w:color w:val="000000" w:themeColor="text1"/>
-          <w:vertAlign w:val="superscript"/>
-        </w:rPr>
-        <w:instrText xml:space="preserve"> REF _Ref164264527 \r \h </w:instrText>
-      </w:r>
-      <w:r>
-        <w:rPr>
-          <w:color w:val="000000" w:themeColor="text1"/>
-          <w:vertAlign w:val="superscript"/>
-        </w:rPr>
-        <w:instrText xml:space="preserve"> \* MERGEFORMAT </w:instrText>
-      </w:r>
-      <w:r>
-        <w:rPr>
-          <w:color w:val="000000" w:themeColor="text1"/>
-          <w:vertAlign w:val="superscript"/>
-        </w:rPr>
-      </w:r>
-      <w:r>
-        <w:rPr>
-          <w:color w:val="000000" w:themeColor="text1"/>
-          <w:vertAlign w:val="superscript"/>
-        </w:rPr>
-        <w:fldChar w:fldCharType="separate"/>
-      </w:r>
-      <w:r>
-        <w:rPr>
-          <w:color w:val="000000" w:themeColor="text1"/>
-          <w:vertAlign w:val="superscript"/>
-        </w:rPr>
-        <w:t>g</w:t>
-      </w:r>
-      <w:r>
-        <w:rPr>
-          <w:color w:val="000000" w:themeColor="text1"/>
-          <w:vertAlign w:val="superscript"/>
-        </w:rPr>
-        <w:fldChar w:fldCharType="end"/>
-      </w:r>
-      <w:r>
-        <w:rPr>
-          <w:color w:val="000000" w:themeColor="text1"/>
-        </w:rPr>
-        <w:t xml:space="preserve">, </w:t>
-      </w:r>
-      <w:r>
-        <w:rPr>
-          <w:color w:val="000000" w:themeColor="text1"/>
-        </w:rPr>
-        <w:t>Daniel R. Weilandt</w:t>
-      </w:r>
-      <w:r>
-        <w:rPr>
-          <w:color w:val="000000" w:themeColor="text1"/>
-          <w:vertAlign w:val="superscript"/>
-        </w:rPr>
-        <w:fldChar w:fldCharType="begin"/>
-      </w:r>
-      <w:r>
-        <w:rPr>
-          <w:color w:val="000000" w:themeColor="text1"/>
-          <w:vertAlign w:val="superscript"/>
-        </w:rPr>
-        <w:instrText xml:space="preserve"> REF _Ref196910598 \r \h </w:instrText>
-      </w:r>
-      <w:r>
-        <w:rPr>
-          <w:color w:val="000000" w:themeColor="text1"/>
-          <w:vertAlign w:val="superscript"/>
-        </w:rPr>
-      </w:r>
-      <w:r>
-        <w:rPr>
-          <w:color w:val="000000" w:themeColor="text1"/>
-          <w:vertAlign w:val="superscript"/>
-        </w:rPr>
-        <w:fldChar w:fldCharType="separate"/>
-      </w:r>
-      <w:r>
-        <w:rPr>
-          <w:color w:val="000000" w:themeColor="text1"/>
-          <w:vertAlign w:val="superscript"/>
-        </w:rPr>
-        <w:t>e</w:t>
-      </w:r>
-      <w:r>
-        <w:rPr>
-          <w:color w:val="000000" w:themeColor="text1"/>
-          <w:vertAlign w:val="superscript"/>
-        </w:rPr>
-        <w:fldChar w:fldCharType="end"/>
-      </w:r>
-      <w:r>
-        <w:rPr>
-          <w:color w:val="000000" w:themeColor="text1"/>
-          <w:vertAlign w:val="superscript"/>
-        </w:rPr>
-        <w:t>,</w:t>
-      </w:r>
-      <w:r>
-        <w:rPr>
-          <w:color w:val="000000" w:themeColor="text1"/>
-          <w:vertAlign w:val="superscript"/>
-        </w:rPr>
-        <w:fldChar w:fldCharType="begin"/>
-      </w:r>
-      <w:r>
-        <w:rPr>
-          <w:color w:val="000000" w:themeColor="text1"/>
-          <w:vertAlign w:val="superscript"/>
-        </w:rPr>
-        <w:instrText xml:space="preserve"> REF _Ref164264497 \r \h  \* MERGEFORMAT </w:instrText>
-      </w:r>
-      <w:r>
-        <w:rPr>
-          <w:color w:val="000000" w:themeColor="text1"/>
-          <w:vertAlign w:val="superscript"/>
-        </w:rPr>
-      </w:r>
-      <w:r>
-        <w:rPr>
-          <w:color w:val="000000" w:themeColor="text1"/>
-          <w:vertAlign w:val="superscript"/>
-        </w:rPr>
-        <w:fldChar w:fldCharType="separate"/>
-      </w:r>
-      <w:r>
-        <w:rPr>
-          <w:color w:val="000000" w:themeColor="text1"/>
-          <w:vertAlign w:val="superscript"/>
-        </w:rPr>
-        <w:t>f</w:t>
-      </w:r>
-      <w:r>
-        <w:rPr>
-          <w:color w:val="000000" w:themeColor="text1"/>
-          <w:vertAlign w:val="superscript"/>
-        </w:rPr>
-        <w:fldChar w:fldCharType="end"/>
-      </w:r>
-      <w:r>
-        <w:rPr>
-          <w:color w:val="000000" w:themeColor="text1"/>
-          <w:vertAlign w:val="superscript"/>
-        </w:rPr>
-        <w:t>,</w:t>
-      </w:r>
-      <w:r>
-        <w:rPr>
-          <w:color w:val="000000" w:themeColor="text1"/>
-          <w:vertAlign w:val="superscript"/>
-        </w:rPr>
-        <w:fldChar w:fldCharType="begin"/>
-      </w:r>
-      <w:r>
-        <w:rPr>
-          <w:color w:val="000000" w:themeColor="text1"/>
-          <w:vertAlign w:val="superscript"/>
-        </w:rPr>
-        <w:instrText xml:space="preserve"> REF _Ref164264527 \r \h </w:instrText>
-      </w:r>
-      <w:r>
-        <w:rPr>
-          <w:color w:val="000000" w:themeColor="text1"/>
-          <w:vertAlign w:val="superscript"/>
-        </w:rPr>
-      </w:r>
-      <w:r>
-        <w:rPr>
-          <w:color w:val="000000" w:themeColor="text1"/>
-          <w:vertAlign w:val="superscript"/>
-        </w:rPr>
-        <w:fldChar w:fldCharType="separate"/>
-      </w:r>
-      <w:r>
-        <w:rPr>
-          <w:color w:val="000000" w:themeColor="text1"/>
-          <w:vertAlign w:val="superscript"/>
-        </w:rPr>
-        <w:t>g</w:t>
-      </w:r>
-      <w:r>
-        <w:rPr>
-          <w:color w:val="000000" w:themeColor="text1"/>
-          <w:vertAlign w:val="superscript"/>
-        </w:rPr>
-        <w:fldChar w:fldCharType="end"/>
-      </w:r>
-      <w:r>
-        <w:rPr>
-          <w:color w:val="000000" w:themeColor="text1"/>
-          <w:vertAlign w:val="superscript"/>
-        </w:rPr>
-        <w:t>,</w:t>
-      </w:r>
-      <w:r>
-        <w:rPr>
-          <w:color w:val="000000" w:themeColor="text1"/>
-          <w:vertAlign w:val="superscript"/>
-        </w:rPr>
-        <w:fldChar w:fldCharType="begin"/>
-      </w:r>
-      <w:r>
-        <w:rPr>
-          <w:color w:val="000000" w:themeColor="text1"/>
-          <w:vertAlign w:val="superscript"/>
-        </w:rPr>
-        <w:instrText xml:space="preserve"> REF _Ref164264552 \r \h </w:instrText>
-      </w:r>
-      <w:r>
-        <w:rPr>
-          <w:color w:val="000000" w:themeColor="text1"/>
-          <w:vertAlign w:val="superscript"/>
-        </w:rPr>
-      </w:r>
-      <w:r>
-        <w:rPr>
-          <w:color w:val="000000" w:themeColor="text1"/>
-          <w:vertAlign w:val="superscript"/>
-        </w:rPr>
-        <w:fldChar w:fldCharType="separate"/>
-      </w:r>
-      <w:r>
-        <w:rPr>
-          <w:color w:val="000000" w:themeColor="text1"/>
-          <w:vertAlign w:val="superscript"/>
-        </w:rPr>
-        <w:t>l</w:t>
-      </w:r>
-      <w:r>
-        <w:rPr>
-          <w:color w:val="000000" w:themeColor="text1"/>
-          <w:vertAlign w:val="superscript"/>
-        </w:rPr>
-        <w:fldChar w:fldCharType="end"/>
-      </w:r>
-      <w:r>
-        <w:rPr>
-          <w:color w:val="000000" w:themeColor="text1"/>
-        </w:rPr>
-        <w:t xml:space="preserve">, </w:t>
-      </w:r>
-      <w:r>
-        <w:rPr>
-          <w:color w:val="000000" w:themeColor="text1"/>
-        </w:rPr>
-        <w:t>Felix C. Keber</w:t>
-      </w:r>
-      <w:r>
-        <w:rPr>
-          <w:color w:val="000000" w:themeColor="text1"/>
-          <w:vertAlign w:val="superscript"/>
-        </w:rPr>
-        <w:fldChar w:fldCharType="begin"/>
-      </w:r>
-      <w:r>
-        <w:rPr>
-          <w:color w:val="000000" w:themeColor="text1"/>
-          <w:vertAlign w:val="superscript"/>
-        </w:rPr>
-        <w:instrText xml:space="preserve"> REF _Ref164264497 \r \h  \* MERGEFORMAT </w:instrText>
-      </w:r>
-      <w:r>
-        <w:rPr>
-          <w:color w:val="000000" w:themeColor="text1"/>
-          <w:vertAlign w:val="superscript"/>
-        </w:rPr>
-      </w:r>
-      <w:r>
-        <w:rPr>
-          <w:color w:val="000000" w:themeColor="text1"/>
-          <w:vertAlign w:val="superscript"/>
-        </w:rPr>
-        <w:fldChar w:fldCharType="separate"/>
-      </w:r>
-      <w:r>
-        <w:rPr>
-          <w:color w:val="000000" w:themeColor="text1"/>
-          <w:vertAlign w:val="superscript"/>
-        </w:rPr>
-        <w:t>f</w:t>
-      </w:r>
-      <w:r>
-        <w:rPr>
-          <w:color w:val="000000" w:themeColor="text1"/>
-          <w:vertAlign w:val="superscript"/>
-        </w:rPr>
-        <w:fldChar w:fldCharType="end"/>
-      </w:r>
-      <w:r>
-        <w:rPr>
-          <w:color w:val="000000" w:themeColor="text1"/>
-          <w:vertAlign w:val="superscript"/>
-        </w:rPr>
-        <w:t>,</w:t>
-      </w:r>
-      <w:r>
-        <w:rPr>
-          <w:color w:val="000000" w:themeColor="text1"/>
-          <w:vertAlign w:val="superscript"/>
-        </w:rPr>
-        <w:fldChar w:fldCharType="begin"/>
-      </w:r>
-      <w:r>
-        <w:rPr>
-          <w:color w:val="000000" w:themeColor="text1"/>
-          <w:vertAlign w:val="superscript"/>
-        </w:rPr>
-        <w:instrText xml:space="preserve"> REF _Ref164264527 \r \h </w:instrText>
-      </w:r>
-      <w:r>
-        <w:rPr>
-          <w:color w:val="000000" w:themeColor="text1"/>
-          <w:vertAlign w:val="superscript"/>
-        </w:rPr>
-        <w:instrText xml:space="preserve"> \* MERGEFORMAT </w:instrText>
-      </w:r>
-      <w:r>
-        <w:rPr>
-          <w:color w:val="000000" w:themeColor="text1"/>
-          <w:vertAlign w:val="superscript"/>
-        </w:rPr>
-      </w:r>
-      <w:r>
-        <w:rPr>
-          <w:color w:val="000000" w:themeColor="text1"/>
-          <w:vertAlign w:val="superscript"/>
-        </w:rPr>
-        <w:fldChar w:fldCharType="separate"/>
-      </w:r>
-      <w:r>
-        <w:rPr>
-          <w:color w:val="000000" w:themeColor="text1"/>
-          <w:vertAlign w:val="superscript"/>
-        </w:rPr>
-        <w:t>g</w:t>
-      </w:r>
-      <w:r>
-        <w:rPr>
-          <w:color w:val="000000" w:themeColor="text1"/>
-          <w:vertAlign w:val="superscript"/>
-        </w:rPr>
-        <w:fldChar w:fldCharType="end"/>
-      </w:r>
-      <w:r>
-        <w:rPr>
-          <w:color w:val="000000" w:themeColor="text1"/>
-        </w:rPr>
-        <w:t xml:space="preserve">, </w:t>
-      </w:r>
-      <w:r>
-        <w:rPr>
-          <w:color w:val="000000" w:themeColor="text1"/>
-        </w:rPr>
-        <w:t>Martin Wühr</w:t>
-      </w:r>
-      <w:r>
-        <w:rPr>
-          <w:color w:val="000000" w:themeColor="text1"/>
-          <w:vertAlign w:val="superscript"/>
-        </w:rPr>
-        <w:fldChar w:fldCharType="begin"/>
-      </w:r>
-      <w:r>
-        <w:rPr>
-          <w:color w:val="000000" w:themeColor="text1"/>
-          <w:vertAlign w:val="superscript"/>
-        </w:rPr>
-        <w:instrText xml:space="preserve"> REF _Ref164264527 \r \h </w:instrText>
-      </w:r>
-      <w:r>
-        <w:rPr>
-          <w:color w:val="000000" w:themeColor="text1"/>
-          <w:vertAlign w:val="superscript"/>
-        </w:rPr>
-        <w:instrText xml:space="preserve"> \* MERGEFORMAT </w:instrText>
-      </w:r>
-      <w:r>
-        <w:rPr>
-          <w:color w:val="000000" w:themeColor="text1"/>
-          <w:vertAlign w:val="superscript"/>
-        </w:rPr>
-      </w:r>
-      <w:r>
-        <w:rPr>
-          <w:color w:val="000000" w:themeColor="text1"/>
-          <w:vertAlign w:val="superscript"/>
-        </w:rPr>
-        <w:fldChar w:fldCharType="separate"/>
-      </w:r>
-      <w:r>
-        <w:rPr>
-          <w:color w:val="000000" w:themeColor="text1"/>
-          <w:vertAlign w:val="superscript"/>
-        </w:rPr>
-        <w:t>g</w:t>
-      </w:r>
-      <w:r>
-        <w:rPr>
-          <w:color w:val="000000" w:themeColor="text1"/>
-          <w:vertAlign w:val="superscript"/>
-        </w:rPr>
-        <w:fldChar w:fldCharType="end"/>
-      </w:r>
-      <w:r>
-        <w:rPr>
-          <w:color w:val="000000" w:themeColor="text1"/>
-          <w:vertAlign w:val="superscript"/>
-        </w:rPr>
-        <w:t>,</w:t>
-      </w:r>
-      <w:r>
-        <w:rPr>
-          <w:color w:val="000000" w:themeColor="text1"/>
-          <w:vertAlign w:val="superscript"/>
-        </w:rPr>
-        <w:fldChar w:fldCharType="begin"/>
-      </w:r>
-      <w:r>
-        <w:rPr>
-          <w:color w:val="000000" w:themeColor="text1"/>
-          <w:vertAlign w:val="superscript"/>
-        </w:rPr>
-        <w:instrText xml:space="preserve"> REF _Ref202626547 \r \h </w:instrText>
-      </w:r>
-      <w:r>
-        <w:rPr>
-          <w:color w:val="000000" w:themeColor="text1"/>
-          <w:vertAlign w:val="superscript"/>
-        </w:rPr>
-      </w:r>
-      <w:r>
-        <w:rPr>
-          <w:color w:val="000000" w:themeColor="text1"/>
-          <w:vertAlign w:val="superscript"/>
-        </w:rPr>
-        <w:fldChar w:fldCharType="separate"/>
-      </w:r>
-      <w:r>
-        <w:rPr>
-          <w:color w:val="000000" w:themeColor="text1"/>
-          <w:vertAlign w:val="superscript"/>
-        </w:rPr>
-        <w:t>k</w:t>
-      </w:r>
-      <w:r>
-        <w:rPr>
-          <w:color w:val="000000" w:themeColor="text1"/>
-          <w:vertAlign w:val="superscript"/>
-        </w:rPr>
-        <w:fldChar w:fldCharType="end"/>
-      </w:r>
-      <w:r>
-        <w:rPr>
-          <w:color w:val="000000" w:themeColor="text1"/>
-        </w:rPr>
-        <w:t xml:space="preserve">, </w:t>
-      </w:r>
-      <w:r>
-        <w:rPr>
-          <w:color w:val="000000" w:themeColor="text1"/>
-        </w:rPr>
-        <w:t>Joshua D. Rabinowitz</w:t>
-      </w:r>
-      <w:r>
-        <w:rPr>
-          <w:color w:val="000000" w:themeColor="text1"/>
-          <w:vertAlign w:val="superscript"/>
-        </w:rPr>
-        <w:fldChar w:fldCharType="begin"/>
-      </w:r>
-      <w:r>
-        <w:rPr>
-          <w:color w:val="000000" w:themeColor="text1"/>
-          <w:vertAlign w:val="superscript"/>
-        </w:rPr>
-        <w:instrText xml:space="preserve"> REF _Ref196910598 \r \h </w:instrText>
-      </w:r>
-      <w:r>
-        <w:rPr>
-          <w:color w:val="000000" w:themeColor="text1"/>
-          <w:vertAlign w:val="superscript"/>
-        </w:rPr>
-      </w:r>
-      <w:r>
-        <w:rPr>
-          <w:color w:val="000000" w:themeColor="text1"/>
-          <w:vertAlign w:val="superscript"/>
-        </w:rPr>
-        <w:fldChar w:fldCharType="separate"/>
-      </w:r>
-      <w:r>
-        <w:rPr>
-          <w:color w:val="000000" w:themeColor="text1"/>
-          <w:vertAlign w:val="superscript"/>
-        </w:rPr>
-        <w:t>e</w:t>
-      </w:r>
-      <w:r>
-        <w:rPr>
-          <w:color w:val="000000" w:themeColor="text1"/>
-          <w:vertAlign w:val="superscript"/>
-        </w:rPr>
-        <w:fldChar w:fldCharType="end"/>
-      </w:r>
-      <w:r>
-        <w:rPr>
-          <w:color w:val="000000" w:themeColor="text1"/>
-          <w:vertAlign w:val="superscript"/>
-        </w:rPr>
-        <w:t>,</w:t>
-      </w:r>
-      <w:r>
-        <w:rPr>
-          <w:color w:val="000000" w:themeColor="text1"/>
-          <w:vertAlign w:val="superscript"/>
-        </w:rPr>
-        <w:fldChar w:fldCharType="begin"/>
-      </w:r>
-      <w:r>
-        <w:rPr>
-          <w:color w:val="000000" w:themeColor="text1"/>
-          <w:vertAlign w:val="superscript"/>
-        </w:rPr>
-        <w:instrText xml:space="preserve"> REF _Ref164264497 \r \h  \* MERGEFORMAT </w:instrText>
-      </w:r>
-      <w:r>
-        <w:rPr>
-          <w:color w:val="000000" w:themeColor="text1"/>
-          <w:vertAlign w:val="superscript"/>
-        </w:rPr>
-      </w:r>
-      <w:r>
-        <w:rPr>
-          <w:color w:val="000000" w:themeColor="text1"/>
-          <w:vertAlign w:val="superscript"/>
-        </w:rPr>
-        <w:fldChar w:fldCharType="separate"/>
-      </w:r>
-      <w:r>
-        <w:rPr>
-          <w:color w:val="000000" w:themeColor="text1"/>
-          <w:vertAlign w:val="superscript"/>
-        </w:rPr>
-        <w:t>f</w:t>
-      </w:r>
-      <w:r>
-        <w:rPr>
-          <w:color w:val="000000" w:themeColor="text1"/>
-          <w:vertAlign w:val="superscript"/>
-        </w:rPr>
-        <w:fldChar w:fldCharType="end"/>
-      </w:r>
-      <w:r>
-        <w:rPr>
-          <w:color w:val="000000" w:themeColor="text1"/>
-          <w:vertAlign w:val="superscript"/>
-        </w:rPr>
-        <w:t>,</w:t>
-      </w:r>
-      <w:r>
-        <w:rPr>
-          <w:color w:val="000000" w:themeColor="text1"/>
-          <w:vertAlign w:val="superscript"/>
-        </w:rPr>
-        <w:fldChar w:fldCharType="begin"/>
-      </w:r>
-      <w:r>
-        <w:rPr>
-          <w:color w:val="000000" w:themeColor="text1"/>
-          <w:vertAlign w:val="superscript"/>
-        </w:rPr>
-        <w:instrText xml:space="preserve"> REF _Ref164264527 \r \h </w:instrText>
-      </w:r>
-      <w:r>
-        <w:rPr>
-          <w:color w:val="000000" w:themeColor="text1"/>
-          <w:vertAlign w:val="superscript"/>
-        </w:rPr>
-      </w:r>
-      <w:r>
-        <w:rPr>
-          <w:color w:val="000000" w:themeColor="text1"/>
-          <w:vertAlign w:val="superscript"/>
-        </w:rPr>
-        <w:fldChar w:fldCharType="separate"/>
-      </w:r>
-      <w:r>
-        <w:rPr>
-          <w:color w:val="000000" w:themeColor="text1"/>
-          <w:vertAlign w:val="superscript"/>
-        </w:rPr>
-        <w:t>g</w:t>
-      </w:r>
-      <w:r>
-        <w:rPr>
-          <w:color w:val="000000" w:themeColor="text1"/>
-          <w:vertAlign w:val="superscript"/>
-        </w:rPr>
-        <w:fldChar w:fldCharType="end"/>
-      </w:r>
-      <w:r>
-        <w:rPr>
-          <w:color w:val="000000" w:themeColor="text1"/>
-          <w:vertAlign w:val="superscript"/>
-        </w:rPr>
-        <w:t>,</w:t>
-      </w:r>
-      <w:r>
-        <w:rPr>
-          <w:color w:val="000000" w:themeColor="text1"/>
-          <w:vertAlign w:val="superscript"/>
-        </w:rPr>
-        <w:fldChar w:fldCharType="begin"/>
-      </w:r>
-      <w:r>
-        <w:rPr>
-          <w:color w:val="000000" w:themeColor="text1"/>
-          <w:vertAlign w:val="superscript"/>
-        </w:rPr>
-        <w:instrText xml:space="preserve"> REF _Ref164264552 \r \h </w:instrText>
-      </w:r>
-      <w:r>
-        <w:rPr>
-          <w:color w:val="000000" w:themeColor="text1"/>
-          <w:vertAlign w:val="superscript"/>
-        </w:rPr>
-      </w:r>
-      <w:r>
-        <w:rPr>
-          <w:color w:val="000000" w:themeColor="text1"/>
-          <w:vertAlign w:val="superscript"/>
-        </w:rPr>
-        <w:fldChar w:fldCharType="separate"/>
-      </w:r>
-      <w:r>
-        <w:rPr>
-          <w:color w:val="000000" w:themeColor="text1"/>
-          <w:vertAlign w:val="superscript"/>
-        </w:rPr>
-        <w:t>l</w:t>
-      </w:r>
-      <w:r>
-        <w:rPr>
-          <w:color w:val="000000" w:themeColor="text1"/>
-          <w:vertAlign w:val="superscript"/>
-        </w:rPr>
-        <w:fldChar w:fldCharType="end"/>
-      </w:r>
-      <w:r>
-        <w:rPr>
-          <w:color w:val="000000" w:themeColor="text1"/>
-        </w:rPr>
-        <w:t>, Costas D. Maranas</w:t>
-      </w:r>
-      <w:r>
-        <w:rPr>
-          <w:color w:val="000000" w:themeColor="text1"/>
-          <w:vertAlign w:val="superscript"/>
-        </w:rPr>
-        <w:fldChar w:fldCharType="begin"/>
-      </w:r>
-      <w:r>
-        <w:rPr>
-          <w:color w:val="000000" w:themeColor="text1"/>
-          <w:vertAlign w:val="superscript"/>
-        </w:rPr>
-        <w:instrText xml:space="preserve"> REF _Ref164264127 \r \h  \* MERGEFORMAT </w:instrText>
-      </w:r>
-      <w:r>
-        <w:rPr>
-          <w:color w:val="000000" w:themeColor="text1"/>
-          <w:vertAlign w:val="superscript"/>
-        </w:rPr>
-      </w:r>
-      <w:r>
-        <w:rPr>
-          <w:color w:val="000000" w:themeColor="text1"/>
-          <w:vertAlign w:val="superscript"/>
-        </w:rPr>
-        <w:fldChar w:fldCharType="separate"/>
-      </w:r>
-      <w:r>
-        <w:rPr>
-          <w:color w:val="000000" w:themeColor="text1"/>
-          <w:vertAlign w:val="superscript"/>
-        </w:rPr>
-        <w:t>b</w:t>
-      </w:r>
-      <w:r>
-        <w:rPr>
-          <w:color w:val="000000" w:themeColor="text1"/>
-          <w:vertAlign w:val="superscript"/>
-        </w:rPr>
-        <w:fldChar w:fldCharType="end"/>
-      </w:r>
-      <w:r>
-        <w:rPr>
-          <w:color w:val="000000" w:themeColor="text1"/>
-          <w:vertAlign w:val="superscript"/>
-        </w:rPr>
-        <w:t>,</w:t>
-      </w:r>
-      <w:r>
-        <w:rPr>
-          <w:color w:val="000000" w:themeColor="text1"/>
-        </w:rPr>
-        <w:fldChar w:fldCharType="begin"/>
-      </w:r>
-      <w:r>
-        <w:rPr>
-          <w:color w:val="000000" w:themeColor="text1"/>
-          <w:vertAlign w:val="superscript"/>
-        </w:rPr>
-        <w:instrText xml:space="preserve"> REF _Ref164264518 \r \h </w:instrText>
-      </w:r>
-      <w:r>
-        <w:rPr>
-          <w:color w:val="000000" w:themeColor="text1"/>
-        </w:rPr>
-      </w:r>
-      <w:r>
-        <w:rPr>
-          <w:color w:val="000000" w:themeColor="text1"/>
-        </w:rPr>
-        <w:fldChar w:fldCharType="separate"/>
-      </w:r>
-      <w:r>
-        <w:rPr>
-          <w:color w:val="000000" w:themeColor="text1"/>
-          <w:vertAlign w:val="superscript"/>
-        </w:rPr>
-        <w:t>c</w:t>
-      </w:r>
-      <w:r>
-        <w:rPr>
-          <w:color w:val="000000" w:themeColor="text1"/>
-        </w:rPr>
-        <w:fldChar w:fldCharType="end"/>
-      </w:r>
+        <w:t>b,c</w:t>
+      </w:r>
+      <w:proofErr w:type="spellEnd"/>
       <w:r>
         <w:rPr>
           <w:color w:val="000000" w:themeColor="text1"/>
@@ -2154,7 +592,21 @@
         <w:rPr>
           <w:color w:val="000000" w:themeColor="text1"/>
         </w:rPr>
-        <w:t>Brown University Department of Orthopaedic Surgery, Providence, RI</w:t>
+        <w:t xml:space="preserve">Brown University Department of </w:t>
+      </w:r>
+      <w:proofErr w:type="spellStart"/>
+      <w:r>
+        <w:rPr>
+          <w:color w:val="000000" w:themeColor="text1"/>
+        </w:rPr>
+        <w:t>Orthopaedic</w:t>
+      </w:r>
+      <w:proofErr w:type="spellEnd"/>
+      <w:r>
+        <w:rPr>
+          <w:color w:val="000000" w:themeColor="text1"/>
+        </w:rPr>
+        <w:t xml:space="preserve"> Surgery, Providence, RI</w:t>
       </w:r>
       <w:r>
         <w:rPr>
@@ -2242,8 +694,13 @@
         <w:t>Proteins translated by the mitoribosome</w:t>
       </w:r>
       <w:r>
-        <w:t xml:space="preserve"> in scRBA</w:t>
-      </w:r>
+        <w:t xml:space="preserve"> in </w:t>
+      </w:r>
+      <w:proofErr w:type="spellStart"/>
+      <w:r>
+        <w:t>scRBA</w:t>
+      </w:r>
+      <w:proofErr w:type="spellEnd"/>
     </w:p>
     <w:tbl>
       <w:tblPr>
@@ -3622,12 +2079,17 @@
           <w:numId w:val="2"/>
         </w:numPr>
       </w:pPr>
+      <w:proofErr w:type="spellStart"/>
       <w:r>
         <w:lastRenderedPageBreak/>
         <w:t>p</w:t>
       </w:r>
       <w:r>
-        <w:t>FBA formulation</w:t>
+        <w:t>FBA</w:t>
+      </w:r>
+      <w:proofErr w:type="spellEnd"/>
+      <w:r>
+        <w:t xml:space="preserve"> formulation</w:t>
       </w:r>
     </w:p>
     <w:p>
@@ -3933,7 +2395,17 @@
                   <w:rFonts w:ascii="Cambria Math" w:hAnsi="Cambria Math"/>
                   <w:u w:val="none"/>
                 </w:rPr>
-                <m:t>=ν</m:t>
+                <m:t>=</m:t>
+              </m:r>
+              <m:r>
+                <m:rPr>
+                  <m:sty m:val="bi"/>
+                </m:rPr>
+                <w:rPr>
+                  <w:rFonts w:ascii="Cambria Math" w:hAnsi="Cambria Math"/>
+                  <w:u w:val="none"/>
+                </w:rPr>
+                <m:t>ν</m:t>
               </m:r>
             </m:e>
             <m:sub>
@@ -4101,7 +2573,17 @@
               <w:rFonts w:ascii="Cambria Math" w:hAnsi="Cambria Math"/>
               <w:u w:val="none"/>
             </w:rPr>
-            <m:t>=0</m:t>
+            <m:t>=</m:t>
+          </m:r>
+          <m:r>
+            <m:rPr>
+              <m:sty m:val="bi"/>
+            </m:rPr>
+            <w:rPr>
+              <w:rFonts w:ascii="Cambria Math" w:hAnsi="Cambria Math"/>
+              <w:u w:val="none"/>
+            </w:rPr>
+            <m:t>0</m:t>
           </m:r>
         </m:oMath>
       </m:oMathPara>
@@ -4393,7 +2875,17 @@
               <w:rFonts w:ascii="Cambria Math" w:hAnsi="Cambria Math"/>
               <w:u w:val="none"/>
             </w:rPr>
-            <m:t xml:space="preserve">0, </m:t>
+            <m:t>0</m:t>
+          </m:r>
+          <m:r>
+            <m:rPr>
+              <m:sty m:val="bi"/>
+            </m:rPr>
+            <w:rPr>
+              <w:rFonts w:ascii="Cambria Math" w:hAnsi="Cambria Math"/>
+              <w:u w:val="none"/>
+            </w:rPr>
+            <m:t xml:space="preserve">, </m:t>
           </m:r>
           <m:r>
             <m:rPr>
@@ -4471,7 +2963,25 @@
           <w:bCs/>
           <w:u w:val="none"/>
         </w:rPr>
-        <w:t xml:space="preserve">Identical to scRBA’s original version, aside from the last </w:t>
+        <w:t xml:space="preserve">Identical to </w:t>
+      </w:r>
+      <w:proofErr w:type="spellStart"/>
+      <w:r>
+        <w:rPr>
+          <w:b w:val="0"/>
+          <w:bCs/>
+          <w:u w:val="none"/>
+        </w:rPr>
+        <w:t>scRBA’s</w:t>
+      </w:r>
+      <w:proofErr w:type="spellEnd"/>
+      <w:r>
+        <w:rPr>
+          <w:b w:val="0"/>
+          <w:bCs/>
+          <w:u w:val="none"/>
+        </w:rPr>
+        <w:t xml:space="preserve"> original version, aside from the last </w:t>
       </w:r>
       <w:r>
         <w:rPr>
@@ -4575,7 +3085,19 @@
                           <w:rPr>
                             <w:rFonts w:ascii="Cambria Math" w:hAnsi="Cambria Math"/>
                           </w:rPr>
-                          <m:t>pro∈Pro</m:t>
+                          <m:t>pro</m:t>
+                        </m:r>
+                        <m:r>
+                          <w:rPr>
+                            <w:rFonts w:ascii="Cambria Math" w:hAnsi="Cambria Math"/>
+                          </w:rPr>
+                          <m:t>∈</m:t>
+                        </m:r>
+                        <m:r>
+                          <w:rPr>
+                            <w:rFonts w:ascii="Cambria Math" w:hAnsi="Cambria Math"/>
+                          </w:rPr>
+                          <m:t>Pro</m:t>
                         </m:r>
                       </m:sub>
                       <m:sup/>
@@ -5162,7 +3684,13 @@
                       <w:rPr>
                         <w:rFonts w:ascii="Cambria Math" w:hAnsi="Cambria Math"/>
                       </w:rPr>
-                      <m:t>=ν</m:t>
+                      <m:t>=</m:t>
+                    </m:r>
+                    <m:r>
+                      <w:rPr>
+                        <w:rFonts w:ascii="Cambria Math" w:hAnsi="Cambria Math"/>
+                      </w:rPr>
+                      <m:t>ν</m:t>
                     </m:r>
                   </m:e>
                   <m:sub>
@@ -5241,7 +3769,19 @@
                       <w:rPr>
                         <w:rFonts w:ascii="Cambria Math" w:hAnsi="Cambria Math"/>
                       </w:rPr>
-                      <m:t>ribo,comp</m:t>
+                      <m:t>ribo</m:t>
+                    </m:r>
+                    <m:r>
+                      <w:rPr>
+                        <w:rFonts w:ascii="Cambria Math" w:hAnsi="Cambria Math"/>
+                      </w:rPr>
+                      <m:t>,</m:t>
+                    </m:r>
+                    <m:r>
+                      <w:rPr>
+                        <w:rFonts w:ascii="Cambria Math" w:hAnsi="Cambria Math"/>
+                      </w:rPr>
+                      <m:t>comp</m:t>
                     </m:r>
                   </m:sub>
                 </m:sSub>
@@ -5344,7 +3884,19 @@
                           <w:rPr>
                             <w:rFonts w:ascii="Cambria Math" w:hAnsi="Cambria Math"/>
                           </w:rPr>
-                          <m:t>pro,comp</m:t>
+                          <m:t>pro</m:t>
+                        </m:r>
+                        <m:r>
+                          <w:rPr>
+                            <w:rFonts w:ascii="Cambria Math" w:hAnsi="Cambria Math"/>
+                          </w:rPr>
+                          <m:t>,</m:t>
+                        </m:r>
+                        <m:r>
+                          <w:rPr>
+                            <w:rFonts w:ascii="Cambria Math" w:hAnsi="Cambria Math"/>
+                          </w:rPr>
+                          <m:t>comp</m:t>
                         </m:r>
                       </m:sub>
                       <m:sup>
@@ -5381,7 +3933,19 @@
                       <w:rPr>
                         <w:rFonts w:ascii="Cambria Math" w:hAnsi="Cambria Math"/>
                       </w:rPr>
-                      <m:t>pro,comp</m:t>
+                      <m:t>pro</m:t>
+                    </m:r>
+                    <m:r>
+                      <w:rPr>
+                        <w:rFonts w:ascii="Cambria Math" w:hAnsi="Cambria Math"/>
+                      </w:rPr>
+                      <m:t>,</m:t>
+                    </m:r>
+                    <m:r>
+                      <w:rPr>
+                        <w:rFonts w:ascii="Cambria Math" w:hAnsi="Cambria Math"/>
+                      </w:rPr>
+                      <m:t>comp</m:t>
                     </m:r>
                   </m:sub>
                 </m:sSub>
@@ -5433,7 +3997,19 @@
                   <w:rPr>
                     <w:rFonts w:ascii="Cambria Math" w:hAnsi="Cambria Math"/>
                   </w:rPr>
-                  <m:t>nuc,mito</m:t>
+                  <m:t>nuc</m:t>
+                </m:r>
+                <m:r>
+                  <w:rPr>
+                    <w:rFonts w:ascii="Cambria Math" w:hAnsi="Cambria Math"/>
+                  </w:rPr>
+                  <m:t>,</m:t>
+                </m:r>
+                <m:r>
+                  <w:rPr>
+                    <w:rFonts w:ascii="Cambria Math" w:hAnsi="Cambria Math"/>
+                  </w:rPr>
+                  <m:t>mito</m:t>
                 </m:r>
               </m:oMath>
             </m:oMathPara>
@@ -5486,7 +4062,19 @@
                       <w:rPr>
                         <w:rFonts w:ascii="Cambria Math" w:hAnsi="Cambria Math"/>
                       </w:rPr>
-                      <m:t>pro∈Pro</m:t>
+                      <m:t>pro</m:t>
+                    </m:r>
+                    <m:r>
+                      <w:rPr>
+                        <w:rFonts w:ascii="Cambria Math" w:hAnsi="Cambria Math"/>
+                      </w:rPr>
+                      <m:t>∈</m:t>
+                    </m:r>
+                    <m:r>
+                      <w:rPr>
+                        <w:rFonts w:ascii="Cambria Math" w:hAnsi="Cambria Math"/>
+                      </w:rPr>
+                      <m:t>Pro</m:t>
                     </m:r>
                   </m:sub>
                   <m:sup/>
@@ -5549,7 +4137,13 @@
                   <w:rPr>
                     <w:rFonts w:ascii="Cambria Math" w:hAnsi="Cambria Math"/>
                   </w:rPr>
-                  <m:t>≤μ</m:t>
+                  <m:t>≤</m:t>
+                </m:r>
+                <m:r>
+                  <w:rPr>
+                    <w:rFonts w:ascii="Cambria Math" w:hAnsi="Cambria Math"/>
+                  </w:rPr>
+                  <m:t>μ</m:t>
                 </m:r>
                 <m:sSubSup>
                   <m:sSubSupPr>
@@ -5634,7 +4228,19 @@
                       <w:rPr>
                         <w:rFonts w:ascii="Cambria Math" w:hAnsi="Cambria Math"/>
                       </w:rPr>
-                      <m:t>pro∈Pr</m:t>
+                      <m:t>pro</m:t>
+                    </m:r>
+                    <m:r>
+                      <w:rPr>
+                        <w:rFonts w:ascii="Cambria Math" w:hAnsi="Cambria Math"/>
+                      </w:rPr>
+                      <m:t>∈</m:t>
+                    </m:r>
+                    <m:r>
+                      <w:rPr>
+                        <w:rFonts w:ascii="Cambria Math" w:hAnsi="Cambria Math"/>
+                      </w:rPr>
+                      <m:t>Pr</m:t>
                     </m:r>
                     <m:sSup>
                       <m:sSupPr>
@@ -5723,7 +4329,13 @@
                   <w:rPr>
                     <w:rFonts w:ascii="Cambria Math" w:hAnsi="Cambria Math"/>
                   </w:rPr>
-                  <m:t>≤μ</m:t>
+                  <m:t>≤</m:t>
+                </m:r>
+                <m:r>
+                  <w:rPr>
+                    <w:rFonts w:ascii="Cambria Math" w:hAnsi="Cambria Math"/>
+                  </w:rPr>
+                  <m:t>μ</m:t>
                 </m:r>
                 <m:sSubSup>
                   <m:sSubSupPr>
@@ -5996,7 +4608,13 @@
                   <w:rPr>
                     <w:rFonts w:ascii="Cambria Math" w:hAnsi="Cambria Math"/>
                   </w:rPr>
-                  <m:t>μ=</m:t>
+                  <m:t>μ</m:t>
+                </m:r>
+                <m:r>
+                  <w:rPr>
+                    <w:rFonts w:ascii="Cambria Math" w:hAnsi="Cambria Math"/>
+                  </w:rPr>
+                  <m:t>=</m:t>
                 </m:r>
                 <m:sSub>
                   <m:sSubPr>
@@ -6020,7 +4638,31 @@
                       <w:rPr>
                         <w:rFonts w:ascii="Cambria Math" w:hAnsi="Cambria Math"/>
                       </w:rPr>
-                      <m:t>ENZLOAD,j,enz</m:t>
+                      <m:t>ENZLOAD</m:t>
+                    </m:r>
+                    <m:r>
+                      <w:rPr>
+                        <w:rFonts w:ascii="Cambria Math" w:hAnsi="Cambria Math"/>
+                      </w:rPr>
+                      <m:t>,</m:t>
+                    </m:r>
+                    <m:r>
+                      <w:rPr>
+                        <w:rFonts w:ascii="Cambria Math" w:hAnsi="Cambria Math"/>
+                      </w:rPr>
+                      <m:t>j</m:t>
+                    </m:r>
+                    <m:r>
+                      <w:rPr>
+                        <w:rFonts w:ascii="Cambria Math" w:hAnsi="Cambria Math"/>
+                      </w:rPr>
+                      <m:t>,</m:t>
+                    </m:r>
+                    <m:r>
+                      <w:rPr>
+                        <w:rFonts w:ascii="Cambria Math" w:hAnsi="Cambria Math"/>
+                      </w:rPr>
+                      <m:t>enz</m:t>
                     </m:r>
                   </m:sub>
                 </m:sSub>
@@ -6083,6 +4725,7 @@
                   </w:rPr>
                   <m:t xml:space="preserve"> </m:t>
                 </m:r>
+                <w:proofErr w:type="spellStart"/>
                 <m:r>
                   <m:rPr>
                     <m:nor/>
@@ -6094,6 +4737,7 @@
                   </w:rPr>
                   <m:t>enz</m:t>
                 </m:r>
+                <w:proofErr w:type="spellEnd"/>
                 <m:r>
                   <w:rPr>
                     <w:rFonts w:ascii="Cambria Math" w:eastAsia="Cambria Math" w:hAnsi="Cambria Math" w:cs="Cambria Math"/>
@@ -6215,7 +4859,19 @@
                           <w:rPr>
                             <w:rFonts w:ascii="Cambria Math" w:hAnsi="Cambria Math"/>
                           </w:rPr>
-                          <m:t>prowaste,kapp</m:t>
+                          <m:t>prowaste</m:t>
+                        </m:r>
+                        <m:r>
+                          <w:rPr>
+                            <w:rFonts w:ascii="Cambria Math" w:hAnsi="Cambria Math"/>
+                          </w:rPr>
+                          <m:t>,</m:t>
+                        </m:r>
+                        <m:r>
+                          <w:rPr>
+                            <w:rFonts w:ascii="Cambria Math" w:hAnsi="Cambria Math"/>
+                          </w:rPr>
+                          <m:t>kapp</m:t>
                         </m:r>
                       </m:sup>
                     </m:sSubSup>
@@ -6523,7 +5179,19 @@
                           <w:rPr>
                             <w:rFonts w:ascii="Cambria Math" w:hAnsi="Cambria Math"/>
                           </w:rPr>
-                          <m:t>prowaste,kapp</m:t>
+                          <m:t>prowaste</m:t>
+                        </m:r>
+                        <m:r>
+                          <w:rPr>
+                            <w:rFonts w:ascii="Cambria Math" w:hAnsi="Cambria Math"/>
+                          </w:rPr>
+                          <m:t>,</m:t>
+                        </m:r>
+                        <m:r>
+                          <w:rPr>
+                            <w:rFonts w:ascii="Cambria Math" w:hAnsi="Cambria Math"/>
+                          </w:rPr>
+                          <m:t>kapp</m:t>
                         </m:r>
                       </m:sup>
                     </m:sSubSup>
@@ -6884,56 +5552,52 @@
       <w:r>
         <w:t xml:space="preserve">. Aside from extensive additions to annotations and other meta-data, key changes to the model are illustrated in </w:t>
       </w:r>
-      <w:ins w:id="6" w:author="Mooney, Eric James" w:date="2025-09-24T14:42:00Z" w16du:dateUtc="2025-09-24T18:42:00Z">
-        <w:r>
-          <w:fldChar w:fldCharType="begin"/>
-        </w:r>
-        <w:r>
-          <w:instrText xml:space="preserve"> REF _Ref209617291 \h </w:instrText>
-        </w:r>
-      </w:ins>
-      <w:ins w:id="7" w:author="Mooney, Eric James" w:date="2025-09-24T14:42:00Z" w16du:dateUtc="2025-09-24T18:42:00Z">
-        <w:r>
-          <w:fldChar w:fldCharType="separate"/>
-        </w:r>
-        <w:r>
-          <w:t>Fig. S</w:t>
-        </w:r>
-        <w:r>
-          <w:rPr>
-            <w:noProof/>
-          </w:rPr>
-          <w:t>1</w:t>
-        </w:r>
-        <w:r>
-          <w:fldChar w:fldCharType="end"/>
-        </w:r>
-      </w:ins>
-      <w:del w:id="8" w:author="Mooney, Eric James" w:date="2025-09-24T14:41:00Z" w16du:dateUtc="2025-09-24T18:41:00Z">
-        <w:r>
-          <w:fldChar w:fldCharType="begin"/>
-        </w:r>
-        <w:r>
-          <w:delInstrText xml:space="preserve"> REF _Ref163735251 \h  \* MERGEFORMAT </w:delInstrText>
-        </w:r>
-        <w:r>
-          <w:fldChar w:fldCharType="separate"/>
-        </w:r>
-      </w:del>
-      <w:del w:id="9" w:author="Mooney, Eric James" w:date="2025-09-24T14:33:00Z" w16du:dateUtc="2025-09-24T18:33:00Z">
-        <w:r>
-          <w:delText>Fig. 2</w:delText>
-        </w:r>
-      </w:del>
-      <w:del w:id="10" w:author="Mooney, Eric James" w:date="2025-09-24T14:41:00Z" w16du:dateUtc="2025-09-24T18:41:00Z">
-        <w:r>
-          <w:fldChar w:fldCharType="end"/>
-        </w:r>
-        <w:r>
-          <w:delText xml:space="preserve"> </w:delText>
-        </w:r>
-      </w:del>
-      <w:r>
+      <w:r>
+        <w:rPr>
+          <w:color w:val="000000"/>
+        </w:rPr>
+        <w:fldChar w:fldCharType="begin"/>
+      </w:r>
+      <w:r>
+        <w:rPr>
+          <w:color w:val="000000"/>
+        </w:rPr>
+        <w:instrText xml:space="preserve"> REF _Ref209617291 \h </w:instrText>
+      </w:r>
+      <w:r>
+        <w:rPr>
+          <w:color w:val="000000"/>
+        </w:rPr>
+      </w:r>
+      <w:r>
+        <w:rPr>
+          <w:color w:val="000000"/>
+        </w:rPr>
+        <w:fldChar w:fldCharType="separate"/>
+      </w:r>
+      <w:r>
+        <w:rPr>
+          <w:color w:val="000000"/>
+        </w:rPr>
+        <w:t>Fig. S</w:t>
+      </w:r>
+      <w:r>
+        <w:rPr>
+          <w:noProof/>
+          <w:color w:val="000000"/>
+        </w:rPr>
+        <w:t>1</w:t>
+      </w:r>
+      <w:r>
+        <w:rPr>
+          <w:color w:val="000000"/>
+        </w:rPr>
+        <w:fldChar w:fldCharType="end"/>
+      </w:r>
+      <w:r>
+        <w:rPr>
+          <w:color w:val="000000"/>
+        </w:rPr>
         <w:t xml:space="preserve"> </w:t>
       </w:r>
       <w:r>
@@ -7036,7 +5700,23 @@
         <w:pStyle w:val="Normalfirstindented"/>
       </w:pPr>
       <w:r>
-        <w:t>The updated model better accounts for carbon flux apportioning. Five reactions (phosphoketolase, 3-deoxy-D-arabino-heptulosonate 7-phosphate synthetase, xylulokinase, xylose isomerase, NH</w:t>
+        <w:t>The updated model better accounts for carbon flux apportioning. Five reactions (</w:t>
+      </w:r>
+      <w:proofErr w:type="spellStart"/>
+      <w:r>
+        <w:t>phosphoketolase</w:t>
+      </w:r>
+      <w:proofErr w:type="spellEnd"/>
+      <w:r>
+        <w:t xml:space="preserve">, 3-deoxy-D-arabino-heptulosonate 7-phosphate synthetase, </w:t>
+      </w:r>
+      <w:proofErr w:type="spellStart"/>
+      <w:r>
+        <w:t>xylulokinase</w:t>
+      </w:r>
+      <w:proofErr w:type="spellEnd"/>
+      <w:r>
+        <w:t>, xylose isomerase, NH</w:t>
       </w:r>
       <w:r>
         <w:rPr>
@@ -7235,7 +5915,23 @@
         <w:pStyle w:val="Normalfirstindented"/>
       </w:pPr>
       <w:r>
-        <w:t xml:space="preserve">Furthermore, an updated version of yeastGEM_hvd was developed, to align it more with the reaction directionalities identified while developing scRBA. </w:t>
+        <w:t xml:space="preserve">Furthermore, an updated version of </w:t>
+      </w:r>
+      <w:proofErr w:type="spellStart"/>
+      <w:r>
+        <w:t>yeastGEM_hvd</w:t>
+      </w:r>
+      <w:proofErr w:type="spellEnd"/>
+      <w:r>
+        <w:t xml:space="preserve"> was developed, to align it more with the reaction directionalities identified while developing </w:t>
+      </w:r>
+      <w:proofErr w:type="spellStart"/>
+      <w:r>
+        <w:t>scRBA</w:t>
+      </w:r>
+      <w:proofErr w:type="spellEnd"/>
+      <w:r>
+        <w:t xml:space="preserve">. </w:t>
       </w:r>
       <w:r>
         <w:t>The updated GSM model is available at</w:t>
@@ -7252,7 +5948,15 @@
         </w:r>
       </w:hyperlink>
       <w:r>
-        <w:t xml:space="preserve">. The majority of these changes involve changing reaction reversibility. </w:t>
+        <w:t xml:space="preserve">. </w:t>
+      </w:r>
+      <w:proofErr w:type="gramStart"/>
+      <w:r>
+        <w:t>The majority of</w:t>
+      </w:r>
+      <w:proofErr w:type="gramEnd"/>
+      <w:r>
+        <w:t xml:space="preserve"> these changes involve changing reaction reversibility. </w:t>
       </w:r>
     </w:p>
     <w:p>
@@ -7321,76 +6025,58 @@
       <w:pPr>
         <w:pStyle w:val="Caption"/>
       </w:pPr>
-      <w:bookmarkStart w:id="11" w:name="_Ref209617291"/>
-      <w:bookmarkStart w:id="12" w:name="_Ref163735251"/>
-      <w:bookmarkStart w:id="13" w:name="OLE_LINK1"/>
-      <w:ins w:id="14" w:author="Mooney, Eric James" w:date="2025-09-24T14:40:00Z" w16du:dateUtc="2025-09-24T18:40:00Z">
-        <w:r>
-          <w:t>Fig. S</w:t>
-        </w:r>
-        <w:r>
-          <w:fldChar w:fldCharType="begin"/>
-        </w:r>
-        <w:r>
-          <w:instrText xml:space="preserve"> SEQ Fig._S \* ARABIC </w:instrText>
-        </w:r>
-      </w:ins>
-      <w:r>
+      <w:bookmarkStart w:id="6" w:name="_Ref209617291"/>
+      <w:bookmarkStart w:id="7" w:name="_Ref163735251"/>
+      <w:bookmarkStart w:id="8" w:name="OLE_LINK1"/>
+      <w:r>
+        <w:rPr>
+          <w:color w:val="000000"/>
+        </w:rPr>
+        <w:t>Fig. S</w:t>
+      </w:r>
+      <w:r>
+        <w:rPr>
+          <w:color w:val="000000"/>
+        </w:rPr>
+        <w:fldChar w:fldCharType="begin"/>
+      </w:r>
+      <w:r>
+        <w:rPr>
+          <w:color w:val="000000"/>
+        </w:rPr>
+        <w:instrText xml:space="preserve"> SEQ Fig._S \* ARABIC </w:instrText>
+      </w:r>
+      <w:r>
+        <w:rPr>
+          <w:color w:val="000000"/>
+        </w:rPr>
         <w:fldChar w:fldCharType="separate"/>
       </w:r>
-      <w:ins w:id="15" w:author="Mooney, Eric James" w:date="2025-09-24T14:42:00Z" w16du:dateUtc="2025-09-24T18:42:00Z">
-        <w:r>
-          <w:rPr>
-            <w:noProof/>
-          </w:rPr>
-          <w:t>1</w:t>
-        </w:r>
-      </w:ins>
-      <w:ins w:id="16" w:author="Mooney, Eric James" w:date="2025-09-24T14:40:00Z" w16du:dateUtc="2025-09-24T18:40:00Z">
-        <w:r>
-          <w:fldChar w:fldCharType="end"/>
-        </w:r>
-      </w:ins>
-      <w:bookmarkEnd w:id="11"/>
-      <w:ins w:id="17" w:author="Mooney, Eric James" w:date="2025-09-24T14:42:00Z" w16du:dateUtc="2025-09-24T18:42:00Z">
-        <w:r>
-          <w:t>.</w:t>
-        </w:r>
-      </w:ins>
-      <w:del w:id="18" w:author="Mooney, Eric James" w:date="2025-09-24T14:40:00Z" w16du:dateUtc="2025-09-24T18:40:00Z">
-        <w:r>
-          <w:delText xml:space="preserve">Fig. </w:delText>
-        </w:r>
-        <w:r>
-          <w:fldChar w:fldCharType="begin"/>
-        </w:r>
-        <w:r>
-          <w:delInstrText xml:space="preserve"> SEQ Fig. \* ARABIC </w:delInstrText>
-        </w:r>
-        <w:r>
-          <w:fldChar w:fldCharType="separate"/>
-        </w:r>
-        <w:r>
-          <w:rPr>
-            <w:noProof/>
-          </w:rPr>
-          <w:delText>1</w:delText>
-        </w:r>
-        <w:r>
-          <w:rPr>
-            <w:noProof/>
-          </w:rPr>
-          <w:fldChar w:fldCharType="end"/>
-        </w:r>
-        <w:bookmarkEnd w:id="12"/>
-        <w:r>
-          <w:delText>.</w:delText>
-        </w:r>
-      </w:del>
+      <w:r>
+        <w:rPr>
+          <w:noProof/>
+          <w:color w:val="000000"/>
+        </w:rPr>
+        <w:t>1</w:t>
+      </w:r>
+      <w:r>
+        <w:rPr>
+          <w:color w:val="000000"/>
+        </w:rPr>
+        <w:fldChar w:fldCharType="end"/>
+      </w:r>
+      <w:bookmarkEnd w:id="6"/>
+      <w:r>
+        <w:rPr>
+          <w:color w:val="000000"/>
+        </w:rPr>
+        <w:t>.</w:t>
+      </w:r>
+      <w:bookmarkEnd w:id="7"/>
       <w:r>
         <w:t xml:space="preserve"> Visual summary of </w:t>
       </w:r>
-      <w:bookmarkEnd w:id="13"/>
+      <w:bookmarkEnd w:id="8"/>
       <w:r>
         <w:t xml:space="preserve">GSM model updates in an Escher map highlighting the major changes to metabolic pathways between </w:t>
       </w:r>
@@ -7415,9 +6101,30 @@
       <w:r>
         <w:t xml:space="preserve">1120. Dots represent metabolites and lines represent reactions. Reactions added are shown in green and removed in orange. Reactions with GPR, bounds, and/or stoichiometry updates are shown in purple. Specifically, G3PD1r_c and </w:t>
       </w:r>
+      <w:proofErr w:type="spellStart"/>
       <w:r>
         <w:lastRenderedPageBreak/>
-        <w:t xml:space="preserve">CITMALta_m were made reversible, G3PD1i_m is blocked to prevent a thermodynamically infeasible cycle with G3PD1r_c, and MTHFD_m has a new GPR description. ATPS_m is made irreversible with new protein names in its GPR as well as updated stoichiometry that matches its SC counterpart. Thicker lines denote reactions that were altered between the original </w:t>
+        <w:t>CITMALta_m</w:t>
+      </w:r>
+      <w:proofErr w:type="spellEnd"/>
+      <w:r>
+        <w:t xml:space="preserve"> were made reversible, G3PD1i_m is blocked to prevent a thermodynamically infeasible cycle with G3PD1r_c, and </w:t>
+      </w:r>
+      <w:proofErr w:type="spellStart"/>
+      <w:r>
+        <w:t>MTHFD_m</w:t>
+      </w:r>
+      <w:proofErr w:type="spellEnd"/>
+      <w:r>
+        <w:t xml:space="preserve"> has a new GPR description. </w:t>
+      </w:r>
+      <w:proofErr w:type="spellStart"/>
+      <w:r>
+        <w:t>ATPS_m</w:t>
+      </w:r>
+      <w:proofErr w:type="spellEnd"/>
+      <w:r>
+        <w:t xml:space="preserve"> is made irreversible with new protein names in its GPR as well as updated stoichiometry that matches its SC counterpart. Thicker lines denote reactions that were altered between the original </w:t>
       </w:r>
       <w:r>
         <w:rPr>
@@ -7448,16 +6155,12 @@
       <w:r>
         <w:t xml:space="preserve">Because the model content was updated, both GAM and NGAM were recalculated and increased to </w:t>
       </w:r>
-      <w:del w:id="19" w:author="Mooney, Eric James" w:date="2025-10-01T13:38:00Z" w16du:dateUtc="2025-10-01T17:38:00Z">
-        <w:r>
-          <w:delText>187.141</w:delText>
-        </w:r>
-      </w:del>
-      <w:ins w:id="20" w:author="Mooney, Eric James" w:date="2025-10-01T13:38:00Z" w16du:dateUtc="2025-10-01T17:38:00Z">
-        <w:r>
-          <w:t>251.233</w:t>
-        </w:r>
-      </w:ins>
+      <w:r>
+        <w:rPr>
+          <w:color w:val="000000"/>
+        </w:rPr>
+        <w:t>251.233</w:t>
+      </w:r>
       <w:r>
         <w:t xml:space="preserve"> mmol ATP gDW</w:t>
       </w:r>
@@ -7470,19 +6173,12 @@
       <w:r>
         <w:t>and 1.</w:t>
       </w:r>
-      <w:del w:id="21" w:author="Mooney, Eric James" w:date="2025-10-01T13:38:00Z" w16du:dateUtc="2025-10-01T17:38:00Z">
-        <w:r>
-          <w:delText xml:space="preserve">313 </w:delText>
-        </w:r>
-      </w:del>
-      <w:ins w:id="22" w:author="Mooney, Eric James" w:date="2025-10-01T13:38:00Z" w16du:dateUtc="2025-10-01T17:38:00Z">
-        <w:r>
-          <w:t>259</w:t>
-        </w:r>
-        <w:r>
-          <w:t xml:space="preserve"> </w:t>
-        </w:r>
-      </w:ins>
+      <w:r>
+        <w:rPr>
+          <w:color w:val="000000"/>
+        </w:rPr>
+        <w:t xml:space="preserve">259 </w:t>
+      </w:r>
       <w:r>
         <w:t>mmol ATP gDW</w:t>
       </w:r>
@@ -7534,36 +6230,48 @@
       <w:r>
         <w:t xml:space="preserve"> (</w:t>
       </w:r>
-      <w:ins w:id="23" w:author="Mooney, Eric James" w:date="2025-09-24T14:43:00Z" w16du:dateUtc="2025-09-24T18:43:00Z">
-        <w:r>
-          <w:fldChar w:fldCharType="begin"/>
-        </w:r>
-        <w:r>
-          <w:instrText xml:space="preserve"> REF _Ref209617404 \h </w:instrText>
-        </w:r>
-      </w:ins>
-      <w:ins w:id="24" w:author="Mooney, Eric James" w:date="2025-09-24T14:43:00Z" w16du:dateUtc="2025-09-24T18:43:00Z">
-        <w:r>
-          <w:fldChar w:fldCharType="separate"/>
-        </w:r>
-        <w:r>
-          <w:t>Fig. S</w:t>
-        </w:r>
-        <w:r>
-          <w:rPr>
-            <w:noProof/>
-          </w:rPr>
-          <w:t>2</w:t>
-        </w:r>
-        <w:r>
-          <w:fldChar w:fldCharType="end"/>
-        </w:r>
-      </w:ins>
-      <w:del w:id="25" w:author="Mooney, Eric James" w:date="2025-09-24T14:43:00Z" w16du:dateUtc="2025-09-24T18:43:00Z">
-        <w:r>
-          <w:delText>Fig. 2</w:delText>
-        </w:r>
-      </w:del>
+      <w:r>
+        <w:rPr>
+          <w:color w:val="000000"/>
+        </w:rPr>
+        <w:fldChar w:fldCharType="begin"/>
+      </w:r>
+      <w:r>
+        <w:rPr>
+          <w:color w:val="000000"/>
+        </w:rPr>
+        <w:instrText xml:space="preserve"> REF _Ref209617404 \h </w:instrText>
+      </w:r>
+      <w:r>
+        <w:rPr>
+          <w:color w:val="000000"/>
+        </w:rPr>
+      </w:r>
+      <w:r>
+        <w:rPr>
+          <w:color w:val="000000"/>
+        </w:rPr>
+        <w:fldChar w:fldCharType="separate"/>
+      </w:r>
+      <w:r>
+        <w:rPr>
+          <w:color w:val="000000"/>
+        </w:rPr>
+        <w:t>Fig. S</w:t>
+      </w:r>
+      <w:r>
+        <w:rPr>
+          <w:noProof/>
+          <w:color w:val="000000"/>
+        </w:rPr>
+        <w:t>2</w:t>
+      </w:r>
+      <w:r>
+        <w:rPr>
+          <w:color w:val="000000"/>
+        </w:rPr>
+        <w:fldChar w:fldCharType="end"/>
+      </w:r>
       <w:r>
         <w:t>)</w:t>
       </w:r>
@@ -7692,57 +6400,51 @@
       <w:pPr>
         <w:pStyle w:val="Caption"/>
       </w:pPr>
-      <w:bookmarkStart w:id="26" w:name="_Ref209617404"/>
-      <w:ins w:id="27" w:author="Mooney, Eric James" w:date="2025-09-24T14:42:00Z" w16du:dateUtc="2025-09-24T18:42:00Z">
-        <w:r>
-          <w:t>Fig. S</w:t>
-        </w:r>
-        <w:r>
-          <w:fldChar w:fldCharType="begin"/>
-        </w:r>
-        <w:r>
-          <w:instrText xml:space="preserve"> SEQ Fig._S \* ARABIC </w:instrText>
-        </w:r>
-        <w:r>
-          <w:fldChar w:fldCharType="separate"/>
-        </w:r>
-        <w:r>
-          <w:rPr>
-            <w:noProof/>
-          </w:rPr>
-          <w:t>2</w:t>
-        </w:r>
-        <w:r>
-          <w:fldChar w:fldCharType="end"/>
-        </w:r>
-        <w:bookmarkEnd w:id="26"/>
-        <w:r>
-          <w:t>.</w:t>
-        </w:r>
-      </w:ins>
-      <w:del w:id="28" w:author="Mooney, Eric James" w:date="2025-09-24T14:42:00Z" w16du:dateUtc="2025-09-24T18:42:00Z">
-        <w:r>
-          <w:delText xml:space="preserve">Fig. </w:delText>
-        </w:r>
-        <w:r>
-          <w:fldChar w:fldCharType="begin"/>
-        </w:r>
-        <w:r>
-          <w:delInstrText xml:space="preserve"> SEQ Fig. \* ARABIC </w:delInstrText>
-        </w:r>
-        <w:r>
-          <w:fldChar w:fldCharType="separate"/>
-        </w:r>
-        <w:r>
-          <w:delText>2</w:delText>
-        </w:r>
-        <w:r>
-          <w:fldChar w:fldCharType="end"/>
-        </w:r>
-        <w:r>
-          <w:delText>.</w:delText>
-        </w:r>
-      </w:del>
+      <w:bookmarkStart w:id="9" w:name="_Ref209617404"/>
+      <w:r>
+        <w:rPr>
+          <w:color w:val="000000"/>
+        </w:rPr>
+        <w:t>Fig. S</w:t>
+      </w:r>
+      <w:r>
+        <w:rPr>
+          <w:color w:val="000000"/>
+        </w:rPr>
+        <w:fldChar w:fldCharType="begin"/>
+      </w:r>
+      <w:r>
+        <w:rPr>
+          <w:color w:val="000000"/>
+        </w:rPr>
+        <w:instrText xml:space="preserve"> SEQ Fig._S \* ARABIC </w:instrText>
+      </w:r>
+      <w:r>
+        <w:rPr>
+          <w:color w:val="000000"/>
+        </w:rPr>
+        <w:fldChar w:fldCharType="separate"/>
+      </w:r>
+      <w:r>
+        <w:rPr>
+          <w:noProof/>
+          <w:color w:val="000000"/>
+        </w:rPr>
+        <w:t>2</w:t>
+      </w:r>
+      <w:r>
+        <w:rPr>
+          <w:color w:val="000000"/>
+        </w:rPr>
+        <w:fldChar w:fldCharType="end"/>
+      </w:r>
+      <w:bookmarkEnd w:id="9"/>
+      <w:r>
+        <w:rPr>
+          <w:color w:val="000000"/>
+        </w:rPr>
+        <w:t>.</w:t>
+      </w:r>
       <w:r>
         <w:t xml:space="preserve"> Visual summary of ATP maintenance datasets from </w:t>
       </w:r>
@@ -7788,7 +6490,17 @@
           <w:szCs w:val="32"/>
           <w:u w:val="single"/>
         </w:rPr>
-        <w:t>Estimation of in vivo k</w:t>
+        <w:t xml:space="preserve">Estimation of in vivo </w:t>
+      </w:r>
+      <w:proofErr w:type="spellStart"/>
+      <w:r>
+        <w:rPr>
+          <w:rFonts w:eastAsiaTheme="majorEastAsia" w:cstheme="majorBidi"/>
+          <w:b/>
+          <w:szCs w:val="32"/>
+          <w:u w:val="single"/>
+        </w:rPr>
+        <w:t>k</w:t>
       </w:r>
       <w:r>
         <w:rPr>
@@ -7800,6 +6512,7 @@
         </w:rPr>
         <w:t>app</w:t>
       </w:r>
+      <w:proofErr w:type="spellEnd"/>
       <w:r>
         <w:rPr>
           <w:rFonts w:eastAsiaTheme="majorEastAsia" w:cstheme="majorBidi"/>
@@ -7815,35 +6528,56 @@
         <w:pStyle w:val="Normalfirstindented"/>
       </w:pPr>
       <w:r>
+        <w:t xml:space="preserve">When adapting the </w:t>
+      </w:r>
+      <w:proofErr w:type="spellStart"/>
+      <w:r>
+        <w:t>k</w:t>
+      </w:r>
+      <w:r>
+        <w:rPr>
+          <w:vertAlign w:val="subscript"/>
+        </w:rPr>
+        <w:t>app</w:t>
+      </w:r>
+      <w:proofErr w:type="spellEnd"/>
+      <w:r>
+        <w:t xml:space="preserve"> procedure from </w:t>
+      </w:r>
+      <w:proofErr w:type="spellStart"/>
+      <w:r>
+        <w:t>scRBA</w:t>
+      </w:r>
+      <w:proofErr w:type="spellEnd"/>
+      <w:r>
+        <w:t xml:space="preserve"> to the proteomics data for RT, growth at the measured rate of 0.38 h</w:t>
+      </w:r>
+      <w:r>
+        <w:rPr>
+          <w:vertAlign w:val="superscript"/>
+        </w:rPr>
+        <w:t>-1</w:t>
+      </w:r>
+      <w:r>
+        <w:t xml:space="preserve"> was initially infeasible when using the resulting </w:t>
+      </w:r>
+      <w:proofErr w:type="spellStart"/>
+      <w:r>
+        <w:t>k</w:t>
+      </w:r>
+      <w:r>
+        <w:rPr>
+          <w:vertAlign w:val="subscript"/>
+        </w:rPr>
+        <w:t>app</w:t>
+      </w:r>
+      <w:proofErr w:type="spellEnd"/>
+      <w:r>
+        <w:t xml:space="preserve"> values. One potential </w:t>
+      </w:r>
+      <w:r>
         <w:lastRenderedPageBreak/>
-        <w:t>When adapting the k</w:t>
-      </w:r>
-      <w:r>
-        <w:rPr>
-          <w:vertAlign w:val="subscript"/>
-        </w:rPr>
-        <w:t>app</w:t>
-      </w:r>
-      <w:r>
-        <w:t xml:space="preserve"> procedure from scRBA to the proteomics data for RT, growth at the measured rate of 0.38 h</w:t>
-      </w:r>
-      <w:r>
-        <w:rPr>
-          <w:vertAlign w:val="superscript"/>
-        </w:rPr>
-        <w:t>-1</w:t>
-      </w:r>
-      <w:r>
-        <w:t xml:space="preserve"> was initially infeasible when using the resulting k</w:t>
-      </w:r>
-      <w:r>
-        <w:rPr>
-          <w:vertAlign w:val="subscript"/>
-        </w:rPr>
-        <w:t>app</w:t>
-      </w:r>
-      <w:r>
-        <w:t xml:space="preserve"> values. One potential reason is that B3 does not force </w:t>
+        <w:t xml:space="preserve">reason is that B3 does not force </w:t>
       </w:r>
       <m:oMath>
         <m:nary>
@@ -8257,7 +6991,13 @@
                               <w:rPr>
                                 <w:rFonts w:ascii="Cambria Math" w:hAnsi="Cambria Math"/>
                               </w:rPr>
-                              <m:t>B2</m:t>
+                              <m:t>B</m:t>
+                            </m:r>
+                            <m:r>
+                              <w:rPr>
+                                <w:rFonts w:ascii="Cambria Math" w:hAnsi="Cambria Math"/>
+                              </w:rPr>
+                              <m:t>2</m:t>
                             </m:r>
                           </m:sub>
                           <m:sup>
@@ -8291,7 +7031,13 @@
                               <w:rPr>
                                 <w:rFonts w:ascii="Cambria Math" w:hAnsi="Cambria Math"/>
                               </w:rPr>
-                              <m:t>j∉</m:t>
+                              <m:t>j</m:t>
+                            </m:r>
+                            <m:r>
+                              <w:rPr>
+                                <w:rFonts w:ascii="Cambria Math" w:hAnsi="Cambria Math"/>
+                              </w:rPr>
+                              <m:t>∉</m:t>
                             </m:r>
                             <m:sSup>
                               <m:sSupPr>
@@ -8358,7 +7104,25 @@
                       <w:rPr>
                         <w:rFonts w:ascii="Cambria Math" w:hAnsi="Cambria Math"/>
                       </w:rPr>
-                      <m:t>s.t.</m:t>
+                      <m:t>s</m:t>
+                    </m:r>
+                    <m:r>
+                      <w:rPr>
+                        <w:rFonts w:ascii="Cambria Math" w:hAnsi="Cambria Math"/>
+                      </w:rPr>
+                      <m:t>.</m:t>
+                    </m:r>
+                    <m:r>
+                      <w:rPr>
+                        <w:rFonts w:ascii="Cambria Math" w:hAnsi="Cambria Math"/>
+                      </w:rPr>
+                      <m:t>t</m:t>
+                    </m:r>
+                    <m:r>
+                      <w:rPr>
+                        <w:rFonts w:ascii="Cambria Math" w:hAnsi="Cambria Math"/>
+                      </w:rPr>
+                      <m:t>.</m:t>
                     </m:r>
                   </m:e>
                 </m:eqArr>
@@ -8374,7 +7138,7 @@
             <w:pPr>
               <w:pStyle w:val="Caption"/>
             </w:pPr>
-            <w:bookmarkStart w:id="29" w:name="_Ref167282872"/>
+            <w:bookmarkStart w:id="10" w:name="_Ref167282872"/>
             <w:r>
               <w:rPr>
                 <w:b/>
@@ -8387,7 +7151,7 @@
               </w:rPr>
               <w:t>Step B</w:t>
             </w:r>
-            <w:bookmarkEnd w:id="29"/>
+            <w:bookmarkEnd w:id="10"/>
             <w:r>
               <w:rPr>
                 <w:b/>
@@ -8880,7 +7644,13 @@
                       <w:rPr>
                         <w:rFonts w:ascii="Cambria Math" w:hAnsi="Cambria Math"/>
                       </w:rPr>
-                      <m:t>=ν</m:t>
+                      <m:t>=</m:t>
+                    </m:r>
+                    <m:r>
+                      <w:rPr>
+                        <w:rFonts w:ascii="Cambria Math" w:hAnsi="Cambria Math"/>
+                      </w:rPr>
+                      <m:t>ν</m:t>
                     </m:r>
                   </m:e>
                   <m:sub>
@@ -8987,11 +7757,11 @@
               <w:spacing w:line="240" w:lineRule="auto"/>
               <w:jc w:val="left"/>
             </w:pPr>
-            <w:bookmarkStart w:id="30" w:name="_Ref167363142"/>
+            <w:bookmarkStart w:id="11" w:name="_Ref167363142"/>
             <w:r>
               <w:t>Enforcing measured growth rate</w:t>
             </w:r>
-            <w:bookmarkEnd w:id="30"/>
+            <w:bookmarkEnd w:id="11"/>
           </w:p>
         </w:tc>
       </w:tr>
@@ -9027,7 +7797,19 @@
                       <w:rPr>
                         <w:rFonts w:ascii="Cambria Math" w:hAnsi="Cambria Math"/>
                       </w:rPr>
-                      <m:t>comp∈Comp</m:t>
+                      <m:t>comp</m:t>
+                    </m:r>
+                    <m:r>
+                      <w:rPr>
+                        <w:rFonts w:ascii="Cambria Math" w:hAnsi="Cambria Math"/>
+                      </w:rPr>
+                      <m:t>∈</m:t>
+                    </m:r>
+                    <m:r>
+                      <w:rPr>
+                        <w:rFonts w:ascii="Cambria Math" w:hAnsi="Cambria Math"/>
+                      </w:rPr>
+                      <m:t>Comp</m:t>
                     </m:r>
                   </m:sub>
                   <m:sup/>
@@ -9054,7 +7836,19 @@
                           <w:rPr>
                             <w:rFonts w:ascii="Cambria Math" w:hAnsi="Cambria Math"/>
                           </w:rPr>
-                          <m:t>pro,comp</m:t>
+                          <m:t>pro</m:t>
+                        </m:r>
+                        <m:r>
+                          <w:rPr>
+                            <w:rFonts w:ascii="Cambria Math" w:hAnsi="Cambria Math"/>
+                          </w:rPr>
+                          <m:t>,</m:t>
+                        </m:r>
+                        <m:r>
+                          <w:rPr>
+                            <w:rFonts w:ascii="Cambria Math" w:hAnsi="Cambria Math"/>
+                          </w:rPr>
+                          <m:t>comp</m:t>
                         </m:r>
                       </m:sub>
                     </m:sSub>
@@ -9239,11 +8033,11 @@
               <w:spacing w:line="240" w:lineRule="auto"/>
               <w:jc w:val="left"/>
             </w:pPr>
-            <w:bookmarkStart w:id="31" w:name="_Ref167363058"/>
+            <w:bookmarkStart w:id="12" w:name="_Ref167363058"/>
             <w:r>
               <w:t>Enforcing measured protein translation rates</w:t>
             </w:r>
-            <w:bookmarkEnd w:id="31"/>
+            <w:bookmarkEnd w:id="12"/>
             <w:r>
               <w:t xml:space="preserve"> across all cellular compartments (i.e., </w:t>
             </w:r>
@@ -9315,7 +8109,19 @@
                       <w:rPr>
                         <w:rFonts w:ascii="Cambria Math" w:hAnsi="Cambria Math"/>
                       </w:rPr>
-                      <m:t>ribo,comp</m:t>
+                      <m:t>ribo</m:t>
+                    </m:r>
+                    <m:r>
+                      <w:rPr>
+                        <w:rFonts w:ascii="Cambria Math" w:hAnsi="Cambria Math"/>
+                      </w:rPr>
+                      <m:t>,</m:t>
+                    </m:r>
+                    <m:r>
+                      <w:rPr>
+                        <w:rFonts w:ascii="Cambria Math" w:hAnsi="Cambria Math"/>
+                      </w:rPr>
+                      <m:t>comp</m:t>
                     </m:r>
                   </m:sub>
                 </m:sSub>
@@ -9418,7 +8224,19 @@
                           <w:rPr>
                             <w:rFonts w:ascii="Cambria Math" w:hAnsi="Cambria Math"/>
                           </w:rPr>
-                          <m:t>pro,comp</m:t>
+                          <m:t>pro</m:t>
+                        </m:r>
+                        <m:r>
+                          <w:rPr>
+                            <w:rFonts w:ascii="Cambria Math" w:hAnsi="Cambria Math"/>
+                          </w:rPr>
+                          <m:t>,</m:t>
+                        </m:r>
+                        <m:r>
+                          <w:rPr>
+                            <w:rFonts w:ascii="Cambria Math" w:hAnsi="Cambria Math"/>
+                          </w:rPr>
+                          <m:t>comp</m:t>
                         </m:r>
                       </m:sub>
                       <m:sup>
@@ -9455,7 +8273,19 @@
                       <w:rPr>
                         <w:rFonts w:ascii="Cambria Math" w:hAnsi="Cambria Math"/>
                       </w:rPr>
-                      <m:t>pro,comp</m:t>
+                      <m:t>pro</m:t>
+                    </m:r>
+                    <m:r>
+                      <w:rPr>
+                        <w:rFonts w:ascii="Cambria Math" w:hAnsi="Cambria Math"/>
+                      </w:rPr>
+                      <m:t>,</m:t>
+                    </m:r>
+                    <m:r>
+                      <w:rPr>
+                        <w:rFonts w:ascii="Cambria Math" w:hAnsi="Cambria Math"/>
+                      </w:rPr>
+                      <m:t>comp</m:t>
                     </m:r>
                   </m:sub>
                 </m:sSub>
@@ -9507,7 +8337,19 @@
                   <w:rPr>
                     <w:rFonts w:ascii="Cambria Math" w:hAnsi="Cambria Math"/>
                   </w:rPr>
-                  <m:t>nuc,mito</m:t>
+                  <m:t>nuc</m:t>
+                </m:r>
+                <m:r>
+                  <w:rPr>
+                    <w:rFonts w:ascii="Cambria Math" w:hAnsi="Cambria Math"/>
+                  </w:rPr>
+                  <m:t>,</m:t>
+                </m:r>
+                <m:r>
+                  <w:rPr>
+                    <w:rFonts w:ascii="Cambria Math" w:hAnsi="Cambria Math"/>
+                  </w:rPr>
+                  <m:t>mito</m:t>
                 </m:r>
               </m:oMath>
             </m:oMathPara>
@@ -9561,7 +8403,19 @@
                       <w:rPr>
                         <w:rFonts w:ascii="Cambria Math" w:hAnsi="Cambria Math"/>
                       </w:rPr>
-                      <m:t>pro∈Pro</m:t>
+                      <m:t>pro</m:t>
+                    </m:r>
+                    <m:r>
+                      <w:rPr>
+                        <w:rFonts w:ascii="Cambria Math" w:hAnsi="Cambria Math"/>
+                      </w:rPr>
+                      <m:t>∈</m:t>
+                    </m:r>
+                    <m:r>
+                      <w:rPr>
+                        <w:rFonts w:ascii="Cambria Math" w:hAnsi="Cambria Math"/>
+                      </w:rPr>
+                      <m:t>Pro</m:t>
                     </m:r>
                   </m:sub>
                   <m:sup/>
@@ -9624,7 +8478,13 @@
                   <w:rPr>
                     <w:rFonts w:ascii="Cambria Math" w:hAnsi="Cambria Math"/>
                   </w:rPr>
-                  <m:t>≤μ</m:t>
+                  <m:t>≤</m:t>
+                </m:r>
+                <m:r>
+                  <w:rPr>
+                    <w:rFonts w:ascii="Cambria Math" w:hAnsi="Cambria Math"/>
+                  </w:rPr>
+                  <m:t>μ</m:t>
                 </m:r>
                 <m:sSubSup>
                   <m:sSubSupPr>
@@ -9712,7 +8572,19 @@
                       <w:rPr>
                         <w:rFonts w:ascii="Cambria Math" w:hAnsi="Cambria Math"/>
                       </w:rPr>
-                      <m:t>pro∈Pr</m:t>
+                      <m:t>pro</m:t>
+                    </m:r>
+                    <m:r>
+                      <w:rPr>
+                        <w:rFonts w:ascii="Cambria Math" w:hAnsi="Cambria Math"/>
+                      </w:rPr>
+                      <m:t>∈</m:t>
+                    </m:r>
+                    <m:r>
+                      <w:rPr>
+                        <w:rFonts w:ascii="Cambria Math" w:hAnsi="Cambria Math"/>
+                      </w:rPr>
+                      <m:t>Pr</m:t>
                     </m:r>
                     <m:sSup>
                       <m:sSupPr>
@@ -9801,7 +8673,13 @@
                   <w:rPr>
                     <w:rFonts w:ascii="Cambria Math" w:hAnsi="Cambria Math"/>
                   </w:rPr>
-                  <m:t>≤μ</m:t>
+                  <m:t>≤</m:t>
+                </m:r>
+                <m:r>
+                  <w:rPr>
+                    <w:rFonts w:ascii="Cambria Math" w:hAnsi="Cambria Math"/>
+                  </w:rPr>
+                  <m:t>μ</m:t>
                 </m:r>
                 <m:sSubSup>
                   <m:sSubSupPr>
@@ -9926,7 +8804,19 @@
                       <w:rPr>
                         <w:rFonts w:ascii="Cambria Math" w:hAnsi="Cambria Math"/>
                       </w:rPr>
-                      <m:t>pro∈Pr</m:t>
+                      <m:t>pro</m:t>
+                    </m:r>
+                    <m:r>
+                      <w:rPr>
+                        <w:rFonts w:ascii="Cambria Math" w:hAnsi="Cambria Math"/>
+                      </w:rPr>
+                      <m:t>∈</m:t>
+                    </m:r>
+                    <m:r>
+                      <w:rPr>
+                        <w:rFonts w:ascii="Cambria Math" w:hAnsi="Cambria Math"/>
+                      </w:rPr>
+                      <m:t>Pr</m:t>
                     </m:r>
                     <m:sSup>
                       <m:sSupPr>
@@ -10015,7 +8905,13 @@
                   <w:rPr>
                     <w:rFonts w:ascii="Cambria Math" w:hAnsi="Cambria Math"/>
                   </w:rPr>
-                  <m:t>=μ</m:t>
+                  <m:t>=</m:t>
+                </m:r>
+                <m:r>
+                  <w:rPr>
+                    <w:rFonts w:ascii="Cambria Math" w:hAnsi="Cambria Math"/>
+                  </w:rPr>
+                  <m:t>μ</m:t>
                 </m:r>
                 <m:sSubSup>
                   <m:sSubSupPr>
@@ -10070,7 +8966,7 @@
               <w:spacing w:line="240" w:lineRule="auto"/>
               <w:jc w:val="left"/>
             </w:pPr>
-            <w:bookmarkStart w:id="32" w:name="_Ref167363179"/>
+            <w:bookmarkStart w:id="13" w:name="_Ref167363179"/>
             <w:r>
               <w:t xml:space="preserve">Nonmetabolic protein (i.e., set </w:t>
             </w:r>
@@ -10111,7 +9007,7 @@
             <w:r>
               <w:t>) costs</w:t>
             </w:r>
-            <w:bookmarkEnd w:id="32"/>
+            <w:bookmarkEnd w:id="13"/>
           </w:p>
         </w:tc>
       </w:tr>
@@ -10130,7 +9026,6 @@
                   <w:rPr>
                     <w:rFonts w:ascii="Cambria Math" w:hAnsi="Cambria Math"/>
                   </w:rPr>
-                  <w:lastRenderedPageBreak/>
                   <m:t>∑</m:t>
                 </m:r>
                 <m:sSub>
@@ -10340,7 +9235,13 @@
                               <w:rPr>
                                 <w:rFonts w:ascii="Cambria Math" w:hAnsi="Cambria Math"/>
                               </w:rPr>
-                              <m:t>j∈</m:t>
+                              <m:t>j</m:t>
+                            </m:r>
+                            <m:r>
+                              <w:rPr>
+                                <w:rFonts w:ascii="Cambria Math" w:hAnsi="Cambria Math"/>
+                              </w:rPr>
+                              <m:t>∈</m:t>
                             </m:r>
                             <m:r>
                               <m:rPr>
@@ -10514,7 +9415,25 @@
                       <w:rPr>
                         <w:rFonts w:ascii="Cambria Math" w:hAnsi="Cambria Math"/>
                       </w:rPr>
-                      <m:t>s.t.</m:t>
+                      <m:t>s</m:t>
+                    </m:r>
+                    <m:r>
+                      <w:rPr>
+                        <w:rFonts w:ascii="Cambria Math" w:hAnsi="Cambria Math"/>
+                      </w:rPr>
+                      <m:t>.</m:t>
+                    </m:r>
+                    <m:r>
+                      <w:rPr>
+                        <w:rFonts w:ascii="Cambria Math" w:hAnsi="Cambria Math"/>
+                      </w:rPr>
+                      <m:t>t</m:t>
+                    </m:r>
+                    <m:r>
+                      <w:rPr>
+                        <w:rFonts w:ascii="Cambria Math" w:hAnsi="Cambria Math"/>
+                      </w:rPr>
+                      <m:t>.</m:t>
                     </m:r>
                   </m:e>
                 </m:eqArr>
@@ -10531,7 +9450,7 @@
               <w:pStyle w:val="Caption"/>
               <w:jc w:val="left"/>
             </w:pPr>
-            <w:bookmarkStart w:id="33" w:name="_Ref167283030"/>
+            <w:bookmarkStart w:id="14" w:name="_Ref167283030"/>
             <w:r>
               <w:rPr>
                 <w:b/>
@@ -10544,7 +9463,7 @@
               </w:rPr>
               <w:t>Step B</w:t>
             </w:r>
-            <w:bookmarkEnd w:id="33"/>
+            <w:bookmarkEnd w:id="14"/>
             <w:r>
               <w:rPr>
                 <w:b/>
@@ -10647,7 +9566,13 @@
                       <w:rPr>
                         <w:rFonts w:ascii="Cambria Math" w:hAnsi="Cambria Math"/>
                       </w:rPr>
-                      <m:t>j∉</m:t>
+                      <m:t>j</m:t>
+                    </m:r>
+                    <m:r>
+                      <w:rPr>
+                        <w:rFonts w:ascii="Cambria Math" w:hAnsi="Cambria Math"/>
+                      </w:rPr>
+                      <m:t>∉</m:t>
                     </m:r>
                     <m:sSup>
                       <m:sSupPr>
@@ -10734,7 +9659,13 @@
                       <w:rPr>
                         <w:rFonts w:ascii="Cambria Math" w:hAnsi="Cambria Math"/>
                       </w:rPr>
-                      <m:t>B2</m:t>
+                      <m:t>B</m:t>
+                    </m:r>
+                    <m:r>
+                      <w:rPr>
+                        <w:rFonts w:ascii="Cambria Math" w:hAnsi="Cambria Math"/>
+                      </w:rPr>
+                      <m:t>2</m:t>
                     </m:r>
                   </m:sub>
                   <m:sup>
@@ -10764,7 +9695,7 @@
               </w:numPr>
               <w:jc w:val="left"/>
             </w:pPr>
-            <w:bookmarkStart w:id="34" w:name="_Ref167363019"/>
+            <w:bookmarkStart w:id="15" w:name="_Ref167363019"/>
             <w:r>
               <w:t xml:space="preserve">Minimizing </w:t>
             </w:r>
@@ -10807,7 +9738,7 @@
             <w:r>
               <w:t xml:space="preserve"> use</w:t>
             </w:r>
-            <w:bookmarkEnd w:id="34"/>
+            <w:bookmarkEnd w:id="15"/>
           </w:p>
         </w:tc>
       </w:tr>
@@ -11031,7 +9962,7 @@
               </w:numPr>
               <w:jc w:val="left"/>
             </w:pPr>
-            <w:bookmarkStart w:id="35" w:name="_Ref193464736"/>
+            <w:bookmarkStart w:id="16" w:name="_Ref193464736"/>
             <w:r>
               <w:t xml:space="preserve">Blocking all non-essential reactions outside </w:t>
             </w:r>
@@ -11063,7 +9994,7 @@
                 </m:sup>
               </m:sSup>
             </m:oMath>
-            <w:bookmarkEnd w:id="35"/>
+            <w:bookmarkEnd w:id="16"/>
           </w:p>
         </w:tc>
       </w:tr>
@@ -11146,7 +10077,15 @@
         <w:pStyle w:val="Normalfirstindented"/>
       </w:pPr>
       <w:r>
-        <w:t xml:space="preserve">As in scRBA, steady-state mass balance </w:t>
+        <w:t xml:space="preserve">As in </w:t>
+      </w:r>
+      <w:proofErr w:type="spellStart"/>
+      <w:r>
+        <w:t>scRBA</w:t>
+      </w:r>
+      <w:proofErr w:type="spellEnd"/>
+      <w:r>
+        <w:t xml:space="preserve">, steady-state mass balance </w:t>
       </w:r>
       <w:r>
         <w:fldChar w:fldCharType="begin"/>
@@ -11962,7 +10901,15 @@
         <w:pStyle w:val="Normalfirstindented"/>
       </w:pPr>
       <w:r>
-        <w:t xml:space="preserve">Steps B2 and B3 are identical to their scRBA versions aside from </w:t>
+        <w:t xml:space="preserve">Steps B2 and B3 are identical to their </w:t>
+      </w:r>
+      <w:proofErr w:type="spellStart"/>
+      <w:r>
+        <w:t>scRBA</w:t>
+      </w:r>
+      <w:proofErr w:type="spellEnd"/>
+      <w:r>
+        <w:t xml:space="preserve"> versions aside from </w:t>
       </w:r>
       <w:r>
         <w:fldChar w:fldCharType="begin"/>
@@ -11998,11 +10945,23 @@
         <w:fldChar w:fldCharType="end"/>
       </w:r>
       <w:r>
-        <w:t xml:space="preserve">, which previously used to only assign proteins to one compartment chosen manually, despite some being able to form enzymes in multiple compartments (i.e., multi-compartment proteins). Also, scRBA </w:t>
+        <w:t xml:space="preserve">, which previously used to only assign proteins to one compartment chosen manually, despite some being able to form enzymes in multiple compartments (i.e., multi-compartment proteins). Also, </w:t>
+      </w:r>
+      <w:proofErr w:type="spellStart"/>
+      <w:r>
+        <w:t>scRBA</w:t>
+      </w:r>
+      <w:proofErr w:type="spellEnd"/>
+      <w:r>
+        <w:t xml:space="preserve"> did not originally force translation fluxes for ribosome subunits to match their experimental values. Adding this requirement made step B2 infeasible during testing because of insufficient ribosome </w:t>
       </w:r>
       <w:r>
         <w:lastRenderedPageBreak/>
-        <w:t>did not originally force translation fluxes for ribosome subunits to match their experimental values. Adding this requirement made step B2 infeasible during testing because of insufficient ribosome production, possibly due to other ribosome subunit paralogs being present but not measured and/or not listed in the model as subunits. To address this issue without using unrealistic k</w:t>
+        <w:t xml:space="preserve">production, possibly due to other ribosome subunit paralogs being present but not measured and/or not listed in the model as subunits. To address this issue without using unrealistic </w:t>
+      </w:r>
+      <w:proofErr w:type="spellStart"/>
+      <w:r>
+        <w:t>k</w:t>
       </w:r>
       <w:r>
         <w:rPr>
@@ -12010,6 +10969,7 @@
         </w:rPr>
         <w:t>ribo</w:t>
       </w:r>
+      <w:proofErr w:type="spellEnd"/>
       <w:r>
         <w:t xml:space="preserve"> values while minimizing deviations from measured translation fluxes, the non-negative slack variables </w:t>
       </w:r>
@@ -12971,7 +11931,14 @@
                       <w:rFonts w:ascii="Cambria Math" w:hAnsi="Cambria Math"/>
                       <w:color w:val="000000"/>
                     </w:rPr>
-                    <m:t xml:space="preserve">-1, </m:t>
+                    <m:t>-</m:t>
+                  </m:r>
+                  <m:r>
+                    <w:rPr>
+                      <w:rFonts w:ascii="Cambria Math" w:hAnsi="Cambria Math"/>
+                      <w:color w:val="000000"/>
+                    </w:rPr>
+                    <m:t xml:space="preserve">1, </m:t>
                   </m:r>
                   <m:r>
                     <m:rPr>
@@ -13042,6 +12009,7 @@
         <w:pStyle w:val="Normalfirstindented"/>
       </w:pPr>
       <w:r>
+        <w:lastRenderedPageBreak/>
         <w:t xml:space="preserve">When </w:t>
       </w:r>
       <w:r>
@@ -13353,7 +12321,21 @@
                         <w:rFonts w:ascii="Cambria Math" w:hAnsi="Cambria Math"/>
                         <w:color w:val="000000"/>
                       </w:rPr>
-                      <m:t>B,rec</m:t>
+                      <m:t>B</m:t>
+                    </m:r>
+                    <m:r>
+                      <w:rPr>
+                        <w:rFonts w:ascii="Cambria Math" w:hAnsi="Cambria Math"/>
+                        <w:color w:val="000000"/>
+                      </w:rPr>
+                      <m:t>,</m:t>
+                    </m:r>
+                    <m:r>
+                      <w:rPr>
+                        <w:rFonts w:ascii="Cambria Math" w:hAnsi="Cambria Math"/>
+                        <w:color w:val="000000"/>
+                      </w:rPr>
+                      <m:t>rec</m:t>
                     </m:r>
                   </m:sup>
                 </m:sSubSup>
@@ -13446,7 +12428,7 @@
               </w:numPr>
               <w:jc w:val="left"/>
             </w:pPr>
-            <w:bookmarkStart w:id="36" w:name="_Ref193477226"/>
+            <w:bookmarkStart w:id="17" w:name="_Ref193477226"/>
             <w:r>
               <w:t xml:space="preserve">Enforcing recommended flux upper bounds for all reactions that have them (i.e., reactions in set </w:t>
             </w:r>
@@ -13516,7 +12498,7 @@
             <w:r>
               <w:t>)</w:t>
             </w:r>
-            <w:bookmarkEnd w:id="36"/>
+            <w:bookmarkEnd w:id="17"/>
           </w:p>
         </w:tc>
       </w:tr>
@@ -13732,7 +12714,21 @@
                         <w:rFonts w:ascii="Cambria Math" w:hAnsi="Cambria Math"/>
                         <w:color w:val="000000"/>
                       </w:rPr>
-                      <m:t>LB,rec</m:t>
+                      <m:t>LB</m:t>
+                    </m:r>
+                    <m:r>
+                      <w:rPr>
+                        <w:rFonts w:ascii="Cambria Math" w:hAnsi="Cambria Math"/>
+                        <w:color w:val="000000"/>
+                      </w:rPr>
+                      <m:t>,</m:t>
+                    </m:r>
+                    <m:r>
+                      <w:rPr>
+                        <w:rFonts w:ascii="Cambria Math" w:hAnsi="Cambria Math"/>
+                        <w:color w:val="000000"/>
+                      </w:rPr>
+                      <m:t>rec</m:t>
                     </m:r>
                   </m:sup>
                 </m:sSubSup>
@@ -13839,7 +12835,7 @@
               </w:numPr>
               <w:jc w:val="left"/>
             </w:pPr>
-            <w:bookmarkStart w:id="37" w:name="_Ref193464790"/>
+            <w:bookmarkStart w:id="18" w:name="_Ref193464790"/>
             <w:r>
               <w:t xml:space="preserve">Enforcing recommended flux lower bounds for all reactions that have them (i.e., reactions in set </w:t>
             </w:r>
@@ -13901,7 +12897,7 @@
             <w:r>
               <w:t>)</w:t>
             </w:r>
-            <w:bookmarkEnd w:id="37"/>
+            <w:bookmarkEnd w:id="18"/>
           </w:p>
         </w:tc>
       </w:tr>
@@ -14083,7 +13079,19 @@
         <w:pStyle w:val="Normalfirstindented"/>
       </w:pPr>
       <w:r>
-        <w:t>Another limitation of scRBA’s k</w:t>
+        <w:t xml:space="preserve">Another limitation of </w:t>
+      </w:r>
+      <w:proofErr w:type="spellStart"/>
+      <w:r>
+        <w:t>scRBA’s</w:t>
+      </w:r>
+      <w:proofErr w:type="spellEnd"/>
+      <w:r>
+        <w:t xml:space="preserve"> </w:t>
+      </w:r>
+      <w:proofErr w:type="spellStart"/>
+      <w:r>
+        <w:t>k</w:t>
       </w:r>
       <w:r>
         <w:rPr>
@@ -14091,6 +13099,7 @@
         </w:rPr>
         <w:t>app</w:t>
       </w:r>
+      <w:proofErr w:type="spellEnd"/>
       <w:r>
         <w:t xml:space="preserve"> calculations is that they estimate each enzyme’s synthesis flux (</w:t>
       </w:r>
@@ -14328,7 +13337,19 @@
                                 <w:rPr>
                                   <w:rFonts w:ascii="Cambria Math" w:hAnsi="Cambria Math"/>
                                 </w:rPr>
-                                <m:t>pro,enz</m:t>
+                                <m:t>pro</m:t>
+                              </m:r>
+                              <m:r>
+                                <w:rPr>
+                                  <w:rFonts w:ascii="Cambria Math" w:hAnsi="Cambria Math"/>
+                                </w:rPr>
+                                <m:t>,</m:t>
+                              </m:r>
+                              <m:r>
+                                <w:rPr>
+                                  <w:rFonts w:ascii="Cambria Math" w:hAnsi="Cambria Math"/>
+                                </w:rPr>
+                                <m:t>enz</m:t>
                               </m:r>
                             </m:sub>
                           </m:sSub>
@@ -14340,7 +13361,25 @@
                         <w:rPr>
                           <w:rFonts w:ascii="Cambria Math" w:hAnsi="Cambria Math"/>
                         </w:rPr>
-                        <m:t>∀ protein subunits</m:t>
+                        <m:t xml:space="preserve">∀ </m:t>
+                      </m:r>
+                      <m:r>
+                        <w:rPr>
+                          <w:rFonts w:ascii="Cambria Math" w:hAnsi="Cambria Math"/>
+                        </w:rPr>
+                        <m:t>protein</m:t>
+                      </m:r>
+                      <m:r>
+                        <w:rPr>
+                          <w:rFonts w:ascii="Cambria Math" w:hAnsi="Cambria Math"/>
+                        </w:rPr>
+                        <m:t xml:space="preserve"> </m:t>
+                      </m:r>
+                      <m:r>
+                        <w:rPr>
+                          <w:rFonts w:ascii="Cambria Math" w:hAnsi="Cambria Math"/>
+                        </w:rPr>
+                        <m:t>subunits</m:t>
                       </m:r>
                     </m:e>
                   </m:d>
@@ -14366,11 +13405,11 @@
               </w:numPr>
               <w:jc w:val="left"/>
             </w:pPr>
-            <w:bookmarkStart w:id="38" w:name="_Ref168927334"/>
+            <w:bookmarkStart w:id="19" w:name="_Ref168927334"/>
             <w:r>
               <w:t>Estimating enzyme synthesis fluxes</w:t>
             </w:r>
-            <w:bookmarkEnd w:id="38"/>
+            <w:bookmarkEnd w:id="19"/>
           </w:p>
         </w:tc>
       </w:tr>
@@ -14539,11 +13578,15 @@
         <w:pStyle w:val="Normalfirstindented"/>
       </w:pPr>
       <w:r>
-        <w:t xml:space="preserve">To determine how proteins are apportioned amongst enzymes, we assume that cells aim to minimize production of unused proteins, since doing so would waste less resources crucial to the </w:t>
-      </w:r>
-      <w:r>
-        <w:lastRenderedPageBreak/>
-        <w:t xml:space="preserve">organism’s fitness. A similar assumption is also invoked when determining flux distributions in scRBA, which minimizes the total protein capacity usage at each growth rate tested </w:t>
+        <w:t xml:space="preserve">To determine how proteins are apportioned amongst enzymes, we assume that cells aim to minimize production of unused proteins, since doing so would waste less resources crucial to the organism’s fitness. A similar assumption is also invoked when determining flux distributions in </w:t>
+      </w:r>
+      <w:proofErr w:type="spellStart"/>
+      <w:r>
+        <w:t>scRBA</w:t>
+      </w:r>
+      <w:proofErr w:type="spellEnd"/>
+      <w:r>
+        <w:t xml:space="preserve">, which minimizes the total protein capacity usage at each growth rate tested </w:t>
       </w:r>
       <w:r>
         <w:fldChar w:fldCharType="begin">
@@ -14649,16 +13692,39 @@
         <w:rPr>
           <w:noProof/>
         </w:rPr>
-        <w:t>(Dinh and Maranas, 2023)</w:t>
+        <w:t xml:space="preserve">(Dinh and </w:t>
+      </w:r>
+      <w:r>
+        <w:rPr>
+          <w:noProof/>
+        </w:rPr>
+        <w:lastRenderedPageBreak/>
+        <w:t>Maranas, 2023)</w:t>
       </w:r>
       <w:r>
         <w:fldChar w:fldCharType="end"/>
       </w:r>
       <w:r>
-        <w:t xml:space="preserve">. rtRBA </w:t>
-      </w:r>
-      <w:r>
-        <w:t xml:space="preserve">and scRBA </w:t>
+        <w:t xml:space="preserve">. </w:t>
+      </w:r>
+      <w:proofErr w:type="spellStart"/>
+      <w:r>
+        <w:t>rtRBA</w:t>
+      </w:r>
+      <w:proofErr w:type="spellEnd"/>
+      <w:r>
+        <w:t xml:space="preserve"> </w:t>
+      </w:r>
+      <w:r>
+        <w:t xml:space="preserve">and </w:t>
+      </w:r>
+      <w:proofErr w:type="spellStart"/>
+      <w:r>
+        <w:t>scRBA</w:t>
+      </w:r>
+      <w:proofErr w:type="spellEnd"/>
+      <w:r>
+        <w:t xml:space="preserve"> </w:t>
       </w:r>
       <w:r>
         <w:t xml:space="preserve">only account for a protein’s usage in creating enzymes, ribosomes, and as a biomass component, though this </w:t>
@@ -14946,7 +14012,15 @@
         <w:t xml:space="preserve">(17) </w:t>
       </w:r>
       <w:r>
-        <w:t xml:space="preserve">results in mismatches between enzyme loads identified in prior steps and the reaction fluxes associated with subsequent steps. As in scRBA, we use the median to approximate the </w:t>
+        <w:t xml:space="preserve">results in mismatches between enzyme loads identified in prior steps and the reaction fluxes associated with subsequent steps. As in </w:t>
+      </w:r>
+      <w:proofErr w:type="spellStart"/>
+      <w:r>
+        <w:t>scRBA</w:t>
+      </w:r>
+      <w:proofErr w:type="spellEnd"/>
+      <w:r>
+        <w:t xml:space="preserve">, we use the median to approximate the </w:t>
       </w:r>
       <m:oMath>
         <m:sSub>
@@ -15542,7 +14616,6 @@
         <w:pStyle w:val="Normalfirstindented"/>
       </w:pPr>
       <w:r>
-        <w:lastRenderedPageBreak/>
         <w:t xml:space="preserve">We first minimize production of unused enzyme subunits, represented by the </w:t>
       </w:r>
       <w:r>
@@ -15752,7 +14825,13 @@
                           <w:rPr>
                             <w:rFonts w:ascii="Cambria Math" w:hAnsi="Cambria Math"/>
                           </w:rPr>
-                          <m:t>B4</m:t>
+                          <m:t>B</m:t>
+                        </m:r>
+                        <m:r>
+                          <w:rPr>
+                            <w:rFonts w:ascii="Cambria Math" w:hAnsi="Cambria Math"/>
+                          </w:rPr>
+                          <m:t>4</m:t>
                         </m:r>
                       </m:sub>
                       <m:sup>
@@ -15785,7 +14864,19 @@
                           <w:rPr>
                             <w:rFonts w:ascii="Cambria Math" w:hAnsi="Cambria Math"/>
                           </w:rPr>
-                          <m:t>pro∈Pro</m:t>
+                          <m:t>pro</m:t>
+                        </m:r>
+                        <m:r>
+                          <w:rPr>
+                            <w:rFonts w:ascii="Cambria Math" w:hAnsi="Cambria Math"/>
+                          </w:rPr>
+                          <m:t>∈</m:t>
+                        </m:r>
+                        <m:r>
+                          <w:rPr>
+                            <w:rFonts w:ascii="Cambria Math" w:hAnsi="Cambria Math"/>
+                          </w:rPr>
+                          <m:t>Pro</m:t>
                         </m:r>
                         <m:ctrlPr>
                           <w:rPr>
@@ -15888,7 +14979,25 @@
                   <w:rPr>
                     <w:rFonts w:ascii="Cambria Math" w:hAnsi="Cambria Math"/>
                   </w:rPr>
-                  <m:t>s.t.</m:t>
+                  <m:t>s</m:t>
+                </m:r>
+                <m:r>
+                  <w:rPr>
+                    <w:rFonts w:ascii="Cambria Math" w:hAnsi="Cambria Math"/>
+                  </w:rPr>
+                  <m:t>.</m:t>
+                </m:r>
+                <m:r>
+                  <w:rPr>
+                    <w:rFonts w:ascii="Cambria Math" w:hAnsi="Cambria Math"/>
+                  </w:rPr>
+                  <m:t>t</m:t>
+                </m:r>
+                <m:r>
+                  <w:rPr>
+                    <w:rFonts w:ascii="Cambria Math" w:hAnsi="Cambria Math"/>
+                  </w:rPr>
+                  <m:t>.</m:t>
                 </m:r>
               </m:oMath>
             </m:oMathPara>
@@ -16201,6 +15310,7 @@
                   </w:rPr>
                   <m:t xml:space="preserve"> </m:t>
                 </m:r>
+                <w:proofErr w:type="spellStart"/>
                 <m:r>
                   <m:rPr>
                     <m:nor/>
@@ -16212,6 +15322,7 @@
                   </w:rPr>
                   <m:t>enz</m:t>
                 </m:r>
+                <w:proofErr w:type="spellEnd"/>
                 <m:r>
                   <w:rPr>
                     <w:rFonts w:ascii="Cambria Math" w:eastAsia="Cambria Math" w:hAnsi="Cambria Math" w:cs="Cambria Math"/>
@@ -16322,7 +15433,7 @@
                 <w:bCs/>
               </w:rPr>
             </w:pPr>
-            <w:bookmarkStart w:id="39" w:name="_Ref193477207"/>
+            <w:bookmarkStart w:id="20" w:name="_Ref193477207"/>
             <w:r>
               <w:t xml:space="preserve">Slacks allowing deviation from the prototype </w:t>
             </w:r>
@@ -16357,7 +15468,7 @@
             <w:r>
               <w:t xml:space="preserve"> value for each used enzyme.</w:t>
             </w:r>
-            <w:bookmarkEnd w:id="39"/>
+            <w:bookmarkEnd w:id="20"/>
           </w:p>
         </w:tc>
       </w:tr>
@@ -16400,7 +15511,31 @@
                       <w:rPr>
                         <w:rFonts w:ascii="Cambria Math" w:hAnsi="Cambria Math"/>
                       </w:rPr>
-                      <m:t>ENZLOAD,j,enz</m:t>
+                      <m:t>ENZLOAD</m:t>
+                    </m:r>
+                    <m:r>
+                      <w:rPr>
+                        <w:rFonts w:ascii="Cambria Math" w:hAnsi="Cambria Math"/>
+                      </w:rPr>
+                      <m:t>,</m:t>
+                    </m:r>
+                    <m:r>
+                      <w:rPr>
+                        <w:rFonts w:ascii="Cambria Math" w:hAnsi="Cambria Math"/>
+                      </w:rPr>
+                      <m:t>j</m:t>
+                    </m:r>
+                    <m:r>
+                      <w:rPr>
+                        <w:rFonts w:ascii="Cambria Math" w:hAnsi="Cambria Math"/>
+                      </w:rPr>
+                      <m:t>,</m:t>
+                    </m:r>
+                    <m:r>
+                      <w:rPr>
+                        <w:rFonts w:ascii="Cambria Math" w:hAnsi="Cambria Math"/>
+                      </w:rPr>
+                      <m:t>enz</m:t>
                     </m:r>
                   </m:sub>
                 </m:sSub>
@@ -16408,7 +15543,25 @@
                   <w:rPr>
                     <w:rFonts w:ascii="Cambria Math" w:hAnsi="Cambria Math"/>
                   </w:rPr>
-                  <m:t>=0,∀ enz∉En</m:t>
+                  <m:t xml:space="preserve">=0,∀ </m:t>
+                </m:r>
+                <m:r>
+                  <w:rPr>
+                    <w:rFonts w:ascii="Cambria Math" w:hAnsi="Cambria Math"/>
+                  </w:rPr>
+                  <m:t>enz</m:t>
+                </m:r>
+                <m:r>
+                  <w:rPr>
+                    <w:rFonts w:ascii="Cambria Math" w:hAnsi="Cambria Math"/>
+                  </w:rPr>
+                  <m:t>∉</m:t>
+                </m:r>
+                <m:r>
+                  <w:rPr>
+                    <w:rFonts w:ascii="Cambria Math" w:hAnsi="Cambria Math"/>
+                  </w:rPr>
+                  <m:t>En</m:t>
                 </m:r>
                 <m:sSup>
                   <m:sSupPr>
@@ -16458,7 +15611,13 @@
                   <w:rPr>
                     <w:rFonts w:ascii="Cambria Math" w:hAnsi="Cambria Math"/>
                   </w:rPr>
-                  <m:t>j∣</m:t>
+                  <m:t>j</m:t>
+                </m:r>
+                <m:r>
+                  <w:rPr>
+                    <w:rFonts w:ascii="Cambria Math" w:hAnsi="Cambria Math"/>
+                  </w:rPr>
+                  <m:t>∣</m:t>
                 </m:r>
                 <m:sSub>
                   <m:sSubPr>
@@ -16564,7 +15723,31 @@
                       <w:rPr>
                         <w:rFonts w:ascii="Cambria Math" w:hAnsi="Cambria Math"/>
                       </w:rPr>
-                      <m:t>ENZLOAD,j,enz</m:t>
+                      <m:t>ENZLOAD</m:t>
+                    </m:r>
+                    <m:r>
+                      <w:rPr>
+                        <w:rFonts w:ascii="Cambria Math" w:hAnsi="Cambria Math"/>
+                      </w:rPr>
+                      <m:t>,</m:t>
+                    </m:r>
+                    <m:r>
+                      <w:rPr>
+                        <w:rFonts w:ascii="Cambria Math" w:hAnsi="Cambria Math"/>
+                      </w:rPr>
+                      <m:t>j</m:t>
+                    </m:r>
+                    <m:r>
+                      <w:rPr>
+                        <w:rFonts w:ascii="Cambria Math" w:hAnsi="Cambria Math"/>
+                      </w:rPr>
+                      <m:t>,</m:t>
+                    </m:r>
+                    <m:r>
+                      <w:rPr>
+                        <w:rFonts w:ascii="Cambria Math" w:hAnsi="Cambria Math"/>
+                      </w:rPr>
+                      <m:t>enz</m:t>
                     </m:r>
                   </m:sub>
                 </m:sSub>
@@ -16583,6 +15766,7 @@
                   </w:rPr>
                   <m:t xml:space="preserve"> </m:t>
                 </m:r>
+                <w:proofErr w:type="spellStart"/>
                 <m:r>
                   <m:rPr>
                     <m:nor/>
@@ -16594,11 +15778,18 @@
                   </w:rPr>
                   <m:t>enz</m:t>
                 </m:r>
+                <w:proofErr w:type="spellEnd"/>
                 <m:r>
                   <w:rPr>
                     <w:rFonts w:ascii="Cambria Math" w:hAnsi="Cambria Math"/>
                   </w:rPr>
-                  <m:t>∈En</m:t>
+                  <m:t>∈</m:t>
+                </m:r>
+                <m:r>
+                  <w:rPr>
+                    <w:rFonts w:ascii="Cambria Math" w:hAnsi="Cambria Math"/>
+                  </w:rPr>
+                  <m:t>En</m:t>
                 </m:r>
                 <m:sSup>
                   <m:sSupPr>
@@ -16999,7 +16190,13 @@
                           <w:rPr>
                             <w:rFonts w:ascii="Cambria Math" w:hAnsi="Cambria Math"/>
                           </w:rPr>
-                          <m:t>B5</m:t>
+                          <m:t>B</m:t>
+                        </m:r>
+                        <m:r>
+                          <w:rPr>
+                            <w:rFonts w:ascii="Cambria Math" w:hAnsi="Cambria Math"/>
+                          </w:rPr>
+                          <m:t>5</m:t>
                         </m:r>
                       </m:sub>
                       <m:sup>
@@ -17032,7 +16229,19 @@
                           <w:rPr>
                             <w:rFonts w:ascii="Cambria Math" w:hAnsi="Cambria Math"/>
                           </w:rPr>
-                          <m:t>j∈J</m:t>
+                          <m:t>j</m:t>
+                        </m:r>
+                        <m:r>
+                          <w:rPr>
+                            <w:rFonts w:ascii="Cambria Math" w:hAnsi="Cambria Math"/>
+                          </w:rPr>
+                          <m:t>∈</m:t>
+                        </m:r>
+                        <m:r>
+                          <w:rPr>
+                            <w:rFonts w:ascii="Cambria Math" w:hAnsi="Cambria Math"/>
+                          </w:rPr>
+                          <m:t>J</m:t>
                         </m:r>
                         <m:ctrlPr>
                           <w:rPr>
@@ -17201,7 +16410,25 @@
                   <w:rPr>
                     <w:rFonts w:ascii="Cambria Math" w:hAnsi="Cambria Math"/>
                   </w:rPr>
-                  <m:t>s.t.</m:t>
+                  <m:t>s</m:t>
+                </m:r>
+                <m:r>
+                  <w:rPr>
+                    <w:rFonts w:ascii="Cambria Math" w:hAnsi="Cambria Math"/>
+                  </w:rPr>
+                  <m:t>.</m:t>
+                </m:r>
+                <m:r>
+                  <w:rPr>
+                    <w:rFonts w:ascii="Cambria Math" w:hAnsi="Cambria Math"/>
+                  </w:rPr>
+                  <m:t>t</m:t>
+                </m:r>
+                <m:r>
+                  <w:rPr>
+                    <w:rFonts w:ascii="Cambria Math" w:hAnsi="Cambria Math"/>
+                  </w:rPr>
+                  <m:t>.</m:t>
                 </m:r>
               </m:oMath>
             </m:oMathPara>
@@ -17395,7 +16622,19 @@
                       <w:rPr>
                         <w:rFonts w:ascii="Cambria Math" w:hAnsi="Cambria Math"/>
                       </w:rPr>
-                      <m:t>pro∈Pro</m:t>
+                      <m:t>pro</m:t>
+                    </m:r>
+                    <m:r>
+                      <w:rPr>
+                        <w:rFonts w:ascii="Cambria Math" w:hAnsi="Cambria Math"/>
+                      </w:rPr>
+                      <m:t>∈</m:t>
+                    </m:r>
+                    <m:r>
+                      <w:rPr>
+                        <w:rFonts w:ascii="Cambria Math" w:hAnsi="Cambria Math"/>
+                      </w:rPr>
+                      <m:t>Pro</m:t>
                     </m:r>
                     <m:ctrlPr>
                       <w:rPr>
@@ -17509,7 +16748,13 @@
                       <w:rPr>
                         <w:rFonts w:ascii="Cambria Math" w:hAnsi="Cambria Math"/>
                       </w:rPr>
-                      <m:t>B4</m:t>
+                      <m:t>B</m:t>
+                    </m:r>
+                    <m:r>
+                      <w:rPr>
+                        <w:rFonts w:ascii="Cambria Math" w:hAnsi="Cambria Math"/>
+                      </w:rPr>
+                      <m:t>4</m:t>
                     </m:r>
                   </m:sub>
                   <m:sup>
@@ -17632,7 +16877,11 @@
         <w:t>the optimal objective values from B4 and B5.</w:t>
       </w:r>
       <w:r>
-        <w:t xml:space="preserve"> The resulting metabolic and enzyme synthesis fluxes were used to calculate k</w:t>
+        <w:t xml:space="preserve"> The resulting metabolic and enzyme synthesis fluxes were used to calculate </w:t>
+      </w:r>
+      <w:proofErr w:type="spellStart"/>
+      <w:r>
+        <w:t>k</w:t>
       </w:r>
       <w:r>
         <w:rPr>
@@ -17640,8 +16889,17 @@
         </w:rPr>
         <w:t>app</w:t>
       </w:r>
-      <w:r>
-        <w:t xml:space="preserve"> values. The method for doing so is largely identical to the one used in scRBA’s original release </w:t>
+      <w:proofErr w:type="spellEnd"/>
+      <w:r>
+        <w:t xml:space="preserve"> values. The method for doing so is largely identical to the one used in </w:t>
+      </w:r>
+      <w:proofErr w:type="spellStart"/>
+      <w:r>
+        <w:t>scRBA’s</w:t>
+      </w:r>
+      <w:proofErr w:type="spellEnd"/>
+      <w:r>
+        <w:t xml:space="preserve"> original release </w:t>
       </w:r>
       <w:r>
         <w:fldChar w:fldCharType="begin">
@@ -17829,7 +17087,11 @@
         <w:fldChar w:fldCharType="end"/>
       </w:r>
       <w:r>
-        <w:t>. However, in that release, the median k</w:t>
+        <w:t xml:space="preserve">. However, in that release, the median </w:t>
+      </w:r>
+      <w:proofErr w:type="spellStart"/>
+      <w:r>
+        <w:t>k</w:t>
       </w:r>
       <w:r>
         <w:rPr>
@@ -17837,12 +17099,9 @@
         </w:rPr>
         <w:t>app</w:t>
       </w:r>
-      <w:r>
-        <w:t xml:space="preserve"> </w:t>
-      </w:r>
-      <w:r>
-        <w:lastRenderedPageBreak/>
-        <w:t xml:space="preserve">value was assigned to any reactions with zero flux through either themselves or synthesis of their respective enzymes. This resulted in enzymes with measured subunits (i.e., in set </w:t>
+      <w:proofErr w:type="spellEnd"/>
+      <w:r>
+        <w:t xml:space="preserve"> value was assigned to any reactions with zero flux through either themselves or synthesis of their respective enzymes. This resulted in enzymes with measured subunits (i.e., in set </w:t>
       </w:r>
       <m:oMath>
         <m:r>
@@ -17888,7 +17147,11 @@
         <w:t>app</w:t>
       </w:r>
       <w:r>
-        <w:t xml:space="preserve"> values than isozymes without them when the former had k</w:t>
+        <w:t xml:space="preserve"> values than isozymes without them when the former had </w:t>
+      </w:r>
+      <w:proofErr w:type="spellStart"/>
+      <w:r>
+        <w:t>k</w:t>
       </w:r>
       <w:r>
         <w:rPr>
@@ -17896,8 +17159,13 @@
         </w:rPr>
         <w:t>app</w:t>
       </w:r>
-      <w:r>
-        <w:t xml:space="preserve"> values below the median, encouraging the model to rely less on enzymes using measured proteins. To reduce this risk, if an enzyme has isozymes in set</w:t>
+      <w:proofErr w:type="spellEnd"/>
+      <w:r>
+        <w:t xml:space="preserve"> values below the median, </w:t>
+      </w:r>
+      <w:r>
+        <w:lastRenderedPageBreak/>
+        <w:t>encouraging the model to rely less on enzymes using measured proteins. To reduce this risk, if an enzyme has isozymes in set</w:t>
       </w:r>
       <m:oMath>
         <m:r>
@@ -18020,7 +17288,11 @@
         <w:t>app</w:t>
       </w:r>
       <w:r>
-        <w:t xml:space="preserve"> is assigned to the lowest k</w:t>
+        <w:t xml:space="preserve"> is assigned to the lowest </w:t>
+      </w:r>
+      <w:proofErr w:type="spellStart"/>
+      <w:r>
+        <w:t>k</w:t>
       </w:r>
       <w:r>
         <w:rPr>
@@ -18028,8 +17300,13 @@
         </w:rPr>
         <w:t>app</w:t>
       </w:r>
-      <w:r>
-        <w:t xml:space="preserve"> among them or the median k</w:t>
+      <w:proofErr w:type="spellEnd"/>
+      <w:r>
+        <w:t xml:space="preserve"> among them or the median </w:t>
+      </w:r>
+      <w:proofErr w:type="spellStart"/>
+      <w:r>
+        <w:t>k</w:t>
       </w:r>
       <w:r>
         <w:rPr>
@@ -18037,6 +17314,7 @@
         </w:rPr>
         <w:t>app</w:t>
       </w:r>
+      <w:proofErr w:type="spellEnd"/>
       <w:r>
         <w:t>, whichever is lower.</w:t>
       </w:r>
@@ -21360,14 +20638,6 @@
     <w:abstractNumId w:val="15"/>
   </w:num>
 </w:numbering>
-</file>
-
-<file path=word/people.xml><?xml version="1.0" encoding="utf-8"?>
-<w15:people xmlns:wpc="http://schemas.microsoft.com/office/word/2010/wordprocessingCanvas" xmlns:cx="http://schemas.microsoft.com/office/drawing/2014/chartex" xmlns:cx1="http://schemas.microsoft.com/office/drawing/2015/9/8/chartex" xmlns:cx2="http://schemas.microsoft.com/office/drawing/2015/10/21/chartex" xmlns:cx3="http://schemas.microsoft.com/office/drawing/2016/5/9/chartex" xmlns:cx4="http://schemas.microsoft.com/office/drawing/2016/5/10/chartex" xmlns:cx5="http://schemas.microsoft.com/office/drawing/2016/5/11/chartex" xmlns:cx6="http://schemas.microsoft.com/office/drawing/2016/5/12/chartex" xmlns:cx7="http://schemas.microsoft.com/office/drawing/2016/5/13/chartex" xmlns:cx8="http://schemas.microsoft.com/office/drawing/2016/5/14/chartex" xmlns:mc="http://schemas.openxmlformats.org/markup-compatibility/2006" xmlns:aink="http://schemas.microsoft.com/office/drawing/2016/ink" xmlns:am3d="http://schemas.microsoft.com/office/drawing/2017/model3d" xmlns:o="urn:schemas-microsoft-com:office:office" xmlns:oel="http://schemas.microsoft.com/office/2019/extlst" xmlns:r="http://schemas.openxmlformats.org/officeDocument/2006/relationships" xmlns:m="http://schemas.openxmlformats.org/officeDocument/2006/math" xmlns:v="urn:schemas-microsoft-com:vml" xmlns:wp14="http://schemas.microsoft.com/office/word/2010/wordprocessingDrawing" xmlns:wp="http://schemas.openxmlformats.org/drawingml/2006/wordprocessingDrawing" xmlns:w10="urn:schemas-microsoft-com:office:word" xmlns:w="http://schemas.openxmlformats.org/wordprocessingml/2006/main" xmlns:w14="http://schemas.microsoft.com/office/word/2010/wordml" xmlns:w15="http://schemas.microsoft.com/office/word/2012/wordml" xmlns:w16cex="http://schemas.microsoft.com/office/word/2018/wordml/cex" xmlns:w16cid="http://schemas.microsoft.com/office/word/2016/wordml/cid" xmlns:w16="http://schemas.microsoft.com/office/word/2018/wordml" xmlns:w16du="http://schemas.microsoft.com/office/word/2023/wordml/word16du" xmlns:w16sdtdh="http://schemas.microsoft.com/office/word/2020/wordml/sdtdatahash" xmlns:w16sdtfl="http://schemas.microsoft.com/office/word/2024/wordml/sdtformatlock" xmlns:w16se="http://schemas.microsoft.com/office/word/2015/wordml/symex" xmlns:wpg="http://schemas.microsoft.com/office/word/2010/wordprocessingGroup" xmlns:wpi="http://schemas.microsoft.com/office/word/2010/wordprocessingInk" xmlns:wne="http://schemas.microsoft.com/office/word/2006/wordml" xmlns:wps="http://schemas.microsoft.com/office/word/2010/wordprocessingShape" mc:Ignorable="w14 w15 w16se w16cid w16 w16cex w16sdtdh w16sdtfl w16du wp14">
-  <w15:person w15:author="Mooney, Eric James">
-    <w15:presenceInfo w15:providerId="AD" w15:userId="S::ejm6426@psu.edu::459e8eda-b576-4c3c-9900-d76ade15b4ba"/>
-  </w15:person>
-</w15:people>
 </file>
 
 <file path=word/styles.xml><?xml version="1.0" encoding="utf-8"?>
@@ -23550,4 +22820,10 @@
     </a:ext>
   </a:extLst>
 </a:theme>
+</file>
+
+<file path=docMetadata/LabelInfo.xml><?xml version="1.0" encoding="utf-8"?>
+<clbl:labelList xmlns:clbl="http://schemas.microsoft.com/office/2020/mipLabelMetadata">
+  <clbl:label id="{7cf48d45-3ddb-4389-a9c1-c115526eb52e}" enabled="0" method="" siteId="{7cf48d45-3ddb-4389-a9c1-c115526eb52e}" removed="1"/>
+</clbl:labelList>
 </file>
</xml_diff>